<commit_message>
Redactar resumen ejecutivo y centrar AS-IS, problemas y alcance en la línea
Co-Authored-By: Claude Opus 5.5 <noreply@anthropic.com>
Claude-Session: https://claude.ai/code/session_01JR48ZtjHAJWp3RfTGUyHxs
</commit_message>
<xml_diff>
--- a/Presentacion_Nueva_Aplicacion_Gestion_Middle_Office.docx
+++ b/Presentacion_Nueva_Aplicacion_Gestion_Middle_Office.docx
@@ -1545,66 +1545,73 @@
     </w:p>
     <w:p>
       <w:pPr>
-        <w:spacing w:after="100" w:before="0"/>
+        <w:spacing w:after="80" w:before="0"/>
       </w:pPr>
       <w:r>
         <w:rPr>
           <w:rFonts w:ascii="Calibri" w:cs="Calibri" w:eastAsia="Calibri" w:hAnsi="Calibri"/>
           <w:b/>
           <w:bCs/>
-          <w:sz w:val="22"/>
-          <w:szCs w:val="22"/>
+          <w:color w:val="1F3A5F"/>
+          <w:sz w:val="24"/>
+          <w:szCs w:val="24"/>
         </w:rPr>
-        <w:t xml:space="preserve">Situación. </w:t>
+        <w:t xml:space="preserve">Situación actual</w:t>
       </w:r>
+    </w:p>
+    <w:p>
+      <w:pPr>
+        <w:spacing w:after="100" w:before="0"/>
+      </w:pPr>
       <w:r>
         <w:rPr>
           <w:rFonts w:ascii="Calibri" w:cs="Calibri" w:eastAsia="Calibri" w:hAnsi="Calibri"/>
           <w:sz w:val="22"/>
           <w:szCs w:val="22"/>
         </w:rPr>
-        <w:t xml:space="preserve">Hoy las líneas de crédito y las operaciones de descubierto se tramitan por </w:t>
+        <w:t xml:space="preserve">La aprobación y la carga de las líneas de crédito dependen hoy de tareas manuales. La minuta que se presenta en comité se arma a mano y, una vez aprobada, Middle Office vuelve a cargar la línea en COBIS Trámites. Esa carga recorre después cuatro instancias más de verificación y aprobación (Riesgo de Crédito, gerente comercial, gerente de Riesgos y CEO), que confirman una decisión que el comité ya tomó.</w:t>
       </w:r>
-      <w:r>
-        <w:rPr>
-          <w:rFonts w:ascii="Calibri" w:cs="Calibri" w:eastAsia="Calibri" w:hAnsi="Calibri"/>
-          <w:b/>
-          <w:bCs/>
-          <w:sz w:val="22"/>
-          <w:szCs w:val="22"/>
-        </w:rPr>
-        <w:t xml:space="preserve">COBIS Trámites</w:t>
-      </w:r>
+    </w:p>
+    <w:p>
+      <w:pPr>
+        <w:spacing w:after="100" w:before="0"/>
+      </w:pPr>
       <w:r>
         <w:rPr>
           <w:rFonts w:ascii="Calibri" w:cs="Calibri" w:eastAsia="Calibri" w:hAnsi="Calibri"/>
           <w:sz w:val="22"/>
           <w:szCs w:val="22"/>
         </w:rPr>
-        <w:t xml:space="preserve">. La minuta de comité se arma a mano y vuelve a tipearse en COBIS; la línea pasa por cinco pasos de carga y aprobación; y el control de fraccionamiento por grupo económico lo hace un analista de Riesgos, porque COBIS no lo controla.</w:t>
+        <w:t xml:space="preserve">El resultado es una doble carga de la misma información, demoras entre la decisión del comité y la línea disponible, garantías y excepciones gestionadas fuera del sistema y ninguna vista consolidada de las líneas vigentes.</w:t>
       </w:r>
     </w:p>
     <w:p>
       <w:pPr>
-        <w:spacing w:after="160" w:before="0"/>
+        <w:spacing w:after="80" w:before="180"/>
       </w:pPr>
       <w:r>
         <w:rPr>
           <w:rFonts w:ascii="Calibri" w:cs="Calibri" w:eastAsia="Calibri" w:hAnsi="Calibri"/>
           <w:b/>
           <w:bCs/>
-          <w:sz w:val="22"/>
-          <w:szCs w:val="22"/>
+          <w:color w:val="1F3A5F"/>
+          <w:sz w:val="24"/>
+          <w:szCs w:val="24"/>
         </w:rPr>
-        <w:t xml:space="preserve">Propuesta. </w:t>
+        <w:t xml:space="preserve">Qué proponemos</w:t>
       </w:r>
+    </w:p>
+    <w:p>
+      <w:pPr>
+        <w:spacing w:after="100" w:before="0"/>
+      </w:pPr>
       <w:r>
         <w:rPr>
           <w:rFonts w:ascii="Calibri" w:cs="Calibri" w:eastAsia="Calibri" w:hAnsi="Calibri"/>
           <w:sz w:val="22"/>
           <w:szCs w:val="22"/>
         </w:rPr>
-        <w:t xml:space="preserve">Construir una </w:t>
+        <w:t xml:space="preserve">Desarrollar una </w:t>
       </w:r>
       <w:r>
         <w:rPr>
@@ -1640,7 +1647,7 @@
           <w:sz w:val="22"/>
           <w:szCs w:val="22"/>
         </w:rPr>
-        <w:t xml:space="preserve"> (desarrollo de </w:t>
+        <w:t xml:space="preserve">, a cargo de </w:t>
       </w:r>
       <w:r>
         <w:rPr>
@@ -1658,8 +1665,18 @@
           <w:sz w:val="22"/>
           <w:szCs w:val="22"/>
         </w:rPr>
-        <w:t xml:space="preserve">) empezando por una </w:t>
+        <w:t xml:space="preserve">, organizada alrededor de la línea de crédito:</w:t>
       </w:r>
+    </w:p>
+    <w:p>
+      <w:pPr>
+        <w:pStyle w:val="ListParagraph"/>
+        <w:numPr>
+          <w:ilvl w:val="0"/>
+          <w:numId w:val="2"/>
+        </w:numPr>
+        <w:spacing w:after="60"/>
+      </w:pPr>
       <w:r>
         <w:rPr>
           <w:rFonts w:ascii="Calibri" w:cs="Calibri" w:eastAsia="Calibri" w:hAnsi="Calibri"/>
@@ -1668,7 +1685,7 @@
           <w:sz w:val="22"/>
           <w:szCs w:val="22"/>
         </w:rPr>
-        <w:t xml:space="preserve">pantalla de minutas</w:t>
+        <w:t xml:space="preserve">Minuta en el sistema. </w:t>
       </w:r>
       <w:r>
         <w:rPr>
@@ -1676,8 +1693,18 @@
           <w:sz w:val="22"/>
           <w:szCs w:val="22"/>
         </w:rPr>
-        <w:t xml:space="preserve">: la minuta se registra en el sistema, se aprueba allí y </w:t>
+        <w:t xml:space="preserve">La minuta se registra, se versiona durante el comité y se aprueba en la aplicación.</w:t>
       </w:r>
+    </w:p>
+    <w:p>
+      <w:pPr>
+        <w:pStyle w:val="ListParagraph"/>
+        <w:numPr>
+          <w:ilvl w:val="0"/>
+          <w:numId w:val="2"/>
+        </w:numPr>
+        <w:spacing w:after="60"/>
+      </w:pPr>
       <w:r>
         <w:rPr>
           <w:rFonts w:ascii="Calibri" w:cs="Calibri" w:eastAsia="Calibri" w:hAnsi="Calibri"/>
@@ -1686,7 +1713,7 @@
           <w:sz w:val="22"/>
           <w:szCs w:val="22"/>
         </w:rPr>
-        <w:t xml:space="preserve">esa aprobación dispara automáticamente todas las acciones pertinentes</w:t>
+        <w:t xml:space="preserve">Una sola aprobación que pone todo en marcha. </w:t>
       </w:r>
       <w:r>
         <w:rPr>
@@ -1694,8 +1721,18 @@
           <w:sz w:val="22"/>
           <w:szCs w:val="22"/>
         </w:rPr>
-        <w:t xml:space="preserve"> (alta o modificación de la línea, pedido de OK de garantías a Activas, alta simplificada de clientes, notificaciones, firma y archivo). Una </w:t>
+        <w:t xml:space="preserve">La aprobación de la minuta dispara automáticamente todas las acciones pertinentes: alta o modificación de la línea, pedido de OK de garantías a Activas, alta simplificada del cliente, notificaciones, firma y archivo.</w:t>
       </w:r>
+    </w:p>
+    <w:p>
+      <w:pPr>
+        <w:pStyle w:val="ListParagraph"/>
+        <w:numPr>
+          <w:ilvl w:val="0"/>
+          <w:numId w:val="2"/>
+        </w:numPr>
+        <w:spacing w:after="60"/>
+      </w:pPr>
       <w:r>
         <w:rPr>
           <w:rFonts w:ascii="Calibri" w:cs="Calibri" w:eastAsia="Calibri" w:hAnsi="Calibri"/>
@@ -1704,7 +1741,7 @@
           <w:sz w:val="22"/>
           <w:szCs w:val="22"/>
         </w:rPr>
-        <w:t xml:space="preserve">pantalla de líneas</w:t>
+        <w:t xml:space="preserve">Pantalla de líneas. </w:t>
       </w:r>
       <w:r>
         <w:rPr>
@@ -1712,7 +1749,58 @@
           <w:sz w:val="22"/>
           <w:szCs w:val="22"/>
         </w:rPr>
-        <w:t xml:space="preserve"> reúne todas las líneas aprobadas con su consumo y desde ella se cargan todas las operaciones (descubiertos, renovaciones y cheques), con controles automáticos.</w:t>
+        <w:t xml:space="preserve">Concentra todas las líneas con lo aprobado, lo consumido y lo disponible, su estado y sus vencimientos.</w:t>
+      </w:r>
+    </w:p>
+    <w:p>
+      <w:pPr>
+        <w:pStyle w:val="ListParagraph"/>
+        <w:numPr>
+          <w:ilvl w:val="0"/>
+          <w:numId w:val="2"/>
+        </w:numPr>
+        <w:spacing w:after="60"/>
+      </w:pPr>
+      <w:r>
+        <w:rPr>
+          <w:rFonts w:ascii="Calibri" w:cs="Calibri" w:eastAsia="Calibri" w:hAnsi="Calibri"/>
+          <w:b/>
+          <w:bCs/>
+          <w:sz w:val="22"/>
+          <w:szCs w:val="22"/>
+        </w:rPr>
+        <w:t xml:space="preserve">Base para operar. </w:t>
+      </w:r>
+      <w:r>
+        <w:rPr>
+          <w:rFonts w:ascii="Calibri" w:cs="Calibri" w:eastAsia="Calibri" w:hAnsi="Calibri"/>
+          <w:sz w:val="22"/>
+          <w:szCs w:val="22"/>
+        </w:rPr>
+        <w:t xml:space="preserve">Con la línea activa, desde esa misma pantalla se cargan las operaciones (descubiertos, renovaciones y cheques), que el sistema valida automáticamente contra la línea.</w:t>
+      </w:r>
+    </w:p>
+    <w:p>
+      <w:pPr>
+        <w:spacing w:after="160" w:before="120"/>
+      </w:pPr>
+      <w:r>
+        <w:rPr>
+          <w:rFonts w:ascii="Calibri" w:cs="Calibri" w:eastAsia="Calibri" w:hAnsi="Calibri"/>
+          <w:b/>
+          <w:bCs/>
+          <w:sz w:val="22"/>
+          <w:szCs w:val="22"/>
+        </w:rPr>
+        <w:t xml:space="preserve">Resultado esperado: </w:t>
+      </w:r>
+      <w:r>
+        <w:rPr>
+          <w:rFonts w:ascii="Calibri" w:cs="Calibri" w:eastAsia="Calibri" w:hAnsi="Calibri"/>
+          <w:sz w:val="22"/>
+          <w:szCs w:val="22"/>
+        </w:rPr>
+        <w:t xml:space="preserve">lo que aprueba el comité es exactamente lo que queda cargado, sin retipeo ni re-aprobaciones, con trazabilidad completa de cada decisión.</w:t>
       </w:r>
     </w:p>
     <w:tbl>
@@ -1979,7 +2067,7 @@
                 <w:sz w:val="20"/>
                 <w:szCs w:val="20"/>
               </w:rPr>
-              <w:t xml:space="preserve">Líneas cargadas manualmente / mes</w:t>
+              <w:t xml:space="preserve">Líneas cargadas manualmente por mes</w:t>
             </w:r>
           </w:p>
         </w:tc>
@@ -2007,7 +2095,7 @@
                 <w:sz w:val="20"/>
                 <w:szCs w:val="20"/>
               </w:rPr>
-              <w:t xml:space="preserve">Controles automáticos</w:t>
+              <w:t xml:space="preserve">Alta de líneas más rápida</w:t>
             </w:r>
           </w:p>
         </w:tc>
@@ -2033,7 +2121,7 @@
                 <w:sz w:val="20"/>
                 <w:szCs w:val="20"/>
               </w:rPr>
-              <w:t xml:space="preserve">Validación de línea por grupo económico, 15% de la RPC y tasa mínima de Mesa en cada operación</w:t>
+              <w:t xml:space="preserve">La línea queda activa al aprobarse la minuta, salvo que espere el OK de garantía</w:t>
             </w:r>
           </w:p>
         </w:tc>
@@ -2059,7 +2147,7 @@
                 <w:sz w:val="20"/>
                 <w:szCs w:val="20"/>
               </w:rPr>
-              <w:t xml:space="preserve">Excepciones detectadas por el sistema vs. manuales</w:t>
+              <w:t xml:space="preserve">Horas entre la aprobación del comité y la línea activa</w:t>
             </w:r>
           </w:p>
         </w:tc>
@@ -2088,7 +2176,7 @@
                 <w:sz w:val="20"/>
                 <w:szCs w:val="20"/>
               </w:rPr>
-              <w:t xml:space="preserve">Agilidad operativa</w:t>
+              <w:t xml:space="preserve">Visión consolidada</w:t>
             </w:r>
           </w:p>
         </w:tc>
@@ -2115,7 +2203,7 @@
                 <w:sz w:val="20"/>
                 <w:szCs w:val="20"/>
               </w:rPr>
-              <w:t xml:space="preserve">Carga guiada de descubiertos y renovaciones sin nueva intervención de Riesgos</w:t>
+              <w:t xml:space="preserve">Todas las líneas con aprobado, consumido, disponible y estado en una sola pantalla</w:t>
             </w:r>
           </w:p>
         </w:tc>
@@ -2142,7 +2230,7 @@
                 <w:sz w:val="20"/>
                 <w:szCs w:val="20"/>
               </w:rPr>
-              <w:t xml:space="preserve">Tiempo desde pedido hasta alta del acuerdo</w:t>
+              <w:t xml:space="preserve">Consultas resueltas sin pedir información por mail</w:t>
             </w:r>
           </w:p>
         </w:tc>
@@ -2196,7 +2284,7 @@
                 <w:sz w:val="20"/>
                 <w:szCs w:val="20"/>
               </w:rPr>
-              <w:t xml:space="preserve">Historial de minutas y aprobaciones, acuerdos ruteados por día y visor de vencimientos</w:t>
+              <w:t xml:space="preserve">Historial de minutas, versiones, aprobaciones y forzados</w:t>
             </w:r>
           </w:p>
         </w:tc>
@@ -2222,7 +2310,7 @@
                 <w:sz w:val="20"/>
                 <w:szCs w:val="20"/>
               </w:rPr>
-              <w:t xml:space="preserve">Consultas resueltas sin pedir información por mail</w:t>
+              <w:t xml:space="preserve">Consultas de auditoría resueltas desde el sistema</w:t>
             </w:r>
           </w:p>
         </w:tc>
@@ -2885,7 +2973,7 @@
           <w:sz w:val="22"/>
           <w:szCs w:val="22"/>
         </w:rPr>
-        <w:t xml:space="preserve">Carga de líneas y de operaciones de descubierto</w:t>
+        <w:t xml:space="preserve">Cómo se aprueba y se carga hoy una línea de crédito</w:t>
       </w:r>
     </w:p>
     <w:p>
@@ -2901,7 +2989,7 @@
           <w:sz w:val="24"/>
           <w:szCs w:val="24"/>
         </w:rPr>
-        <w:t xml:space="preserve">Carga de la línea en COBIS después del comité</w:t>
+        <w:t xml:space="preserve">Aprobación en comité</w:t>
       </w:r>
     </w:p>
     <w:tbl>
@@ -2958,7 +3046,7 @@
                 <w:sz w:val="20"/>
                 <w:szCs w:val="20"/>
               </w:rPr>
-              <w:t xml:space="preserve">1 · Middle Office</w:t>
+              <w:t xml:space="preserve">1 · Minuta</w:t>
             </w:r>
           </w:p>
           <w:p>
@@ -2972,7 +3060,7 @@
                 <w:sz w:val="18"/>
                 <w:szCs w:val="18"/>
               </w:rPr>
-              <w:t xml:space="preserve">Recibe la minuta y carga la línea a mano en COBIS Trámites</w:t>
+              <w:t xml:space="preserve">Se arma a mano (hoy la prepara Abril Vázquez)</w:t>
             </w:r>
           </w:p>
         </w:tc>
@@ -3032,7 +3120,7 @@
                 <w:sz w:val="20"/>
                 <w:szCs w:val="20"/>
               </w:rPr>
-              <w:t xml:space="preserve">2 · Riesgo de Crédito</w:t>
+              <w:t xml:space="preserve">2 · Comité / Subcomité</w:t>
             </w:r>
           </w:p>
           <w:p>
@@ -3045,7 +3133,7 @@
                 <w:sz w:val="18"/>
                 <w:szCs w:val="18"/>
               </w:rPr>
-              <w:t xml:space="preserve">Verifica que la carga coincida con la línea aprobada</w:t>
+              <w:t xml:space="preserve">Se presenta la propuesta; puede aprobarse, modificarse o rechazarse</w:t>
             </w:r>
           </w:p>
         </w:tc>
@@ -3105,7 +3193,7 @@
                 <w:sz w:val="20"/>
                 <w:szCs w:val="20"/>
               </w:rPr>
-              <w:t xml:space="preserve">3 · Gerente comercial</w:t>
+              <w:t xml:space="preserve">3 · Ajuste de la minuta</w:t>
             </w:r>
           </w:p>
           <w:p>
@@ -3118,7 +3206,7 @@
                 <w:sz w:val="18"/>
                 <w:szCs w:val="18"/>
               </w:rPr>
-              <w:t xml:space="preserve">Aprueba (Raúl Lynch o Rudecindo Roca, según el caso)</w:t>
+              <w:t xml:space="preserve">Si el comité modifica la propuesta, la minuta se corrige a mano</w:t>
             </w:r>
           </w:p>
         </w:tc>
@@ -3178,7 +3266,7 @@
                 <w:sz w:val="20"/>
                 <w:szCs w:val="20"/>
               </w:rPr>
-              <w:t xml:space="preserve">4 · Gerente de Riesgos</w:t>
+              <w:t xml:space="preserve">4 · Formalización</w:t>
             </w:r>
           </w:p>
           <w:p>
@@ -3191,7 +3279,7 @@
                 <w:sz w:val="18"/>
                 <w:szCs w:val="18"/>
               </w:rPr>
-              <w:t xml:space="preserve">Aprueba</w:t>
+              <w:t xml:space="preserve">Comité: sesión grabada · Subcomité: firma del CEO por DocuSign</w:t>
             </w:r>
           </w:p>
         </w:tc>
@@ -3251,7 +3339,7 @@
                 <w:sz w:val="20"/>
                 <w:szCs w:val="20"/>
               </w:rPr>
-              <w:t xml:space="preserve">5 · CEO</w:t>
+              <w:t xml:space="preserve">5 · Envío</w:t>
             </w:r>
           </w:p>
           <w:p>
@@ -3264,7 +3352,389 @@
                 <w:sz w:val="18"/>
                 <w:szCs w:val="18"/>
               </w:rPr>
-              <w:t xml:space="preserve">Aprobación final</w:t>
+              <w:t xml:space="preserve">La minuta aprobada se envía a Middle Office</w:t>
+            </w:r>
+          </w:p>
+        </w:tc>
+      </w:tr>
+    </w:tbl>
+    <w:p>
+      <w:pPr>
+        <w:spacing w:after="80" w:before="180"/>
+      </w:pPr>
+      <w:r>
+        <w:rPr>
+          <w:rFonts w:ascii="Calibri" w:cs="Calibri" w:eastAsia="Calibri" w:hAnsi="Calibri"/>
+          <w:b/>
+          <w:bCs/>
+          <w:color w:val="1F3A5F"/>
+          <w:sz w:val="24"/>
+          <w:szCs w:val="24"/>
+        </w:rPr>
+        <w:t xml:space="preserve">Carga de la línea en COBIS Trámites</w:t>
+      </w:r>
+    </w:p>
+    <w:tbl>
+      <w:tblPr>
+        <w:tblW w:type="dxa" w:w="14400"/>
+        <w:tblBorders>
+          <w:top w:val="single" w:color="auto" w:sz="4"/>
+          <w:left w:val="single" w:color="auto" w:sz="4"/>
+          <w:bottom w:val="single" w:color="auto" w:sz="4"/>
+          <w:right w:val="single" w:color="auto" w:sz="4"/>
+          <w:insideH w:val="single" w:color="auto" w:sz="4"/>
+          <w:insideV w:val="single" w:color="auto" w:sz="4"/>
+        </w:tblBorders>
+      </w:tblPr>
+      <w:tblGrid>
+        <w:gridCol w:w="2592"/>
+        <w:gridCol w:w="360"/>
+        <w:gridCol w:w="2592"/>
+        <w:gridCol w:w="360"/>
+        <w:gridCol w:w="2592"/>
+        <w:gridCol w:w="360"/>
+        <w:gridCol w:w="2592"/>
+        <w:gridCol w:w="360"/>
+        <w:gridCol w:w="2592"/>
+      </w:tblGrid>
+      <w:tr>
+        <w:tc>
+          <w:tcPr>
+            <w:tcW w:type="dxa" w:w="2592"/>
+            <w:tcBorders>
+              <w:top w:val="single" w:color="2E7D8C" w:sz="6"/>
+              <w:left w:val="single" w:color="2E7D8C" w:sz="6"/>
+              <w:bottom w:val="single" w:color="2E7D8C" w:sz="6"/>
+              <w:right w:val="single" w:color="2E7D8C" w:sz="6"/>
+            </w:tcBorders>
+            <w:shd w:fill="1F3A5F" w:color="auto" w:val="clear"/>
+            <w:tcMar>
+              <w:top w:type="dxa" w:w="100"/>
+              <w:left w:type="dxa" w:w="110"/>
+              <w:bottom w:type="dxa" w:w="100"/>
+              <w:right w:type="dxa" w:w="110"/>
+            </w:tcMar>
+          </w:tcPr>
+          <w:p>
+            <w:pPr>
+              <w:spacing w:after="60"/>
+            </w:pPr>
+            <w:r>
+              <w:rPr>
+                <w:rFonts w:ascii="Calibri" w:cs="Calibri" w:eastAsia="Calibri" w:hAnsi="Calibri"/>
+                <w:b/>
+                <w:bCs/>
+                <w:color w:val="FFFFFF"/>
+                <w:sz w:val="20"/>
+                <w:szCs w:val="20"/>
+              </w:rPr>
+              <w:t xml:space="preserve">1 · Middle Office</w:t>
+            </w:r>
+          </w:p>
+          <w:p>
+            <w:pPr>
+              <w:spacing w:after="0"/>
+            </w:pPr>
+            <w:r>
+              <w:rPr>
+                <w:rFonts w:ascii="Calibri" w:cs="Calibri" w:eastAsia="Calibri" w:hAnsi="Calibri"/>
+                <w:color w:val="FFFFFF"/>
+                <w:sz w:val="18"/>
+                <w:szCs w:val="18"/>
+              </w:rPr>
+              <w:t xml:space="preserve">Carga la línea a mano a partir de la minuta</w:t>
+            </w:r>
+          </w:p>
+        </w:tc>
+        <w:tc>
+          <w:tcPr>
+            <w:tcW w:type="dxa" w:w="360"/>
+            <w:tcBorders>
+              <w:top w:val="none" w:color="FFFFFF" w:sz="0"/>
+              <w:left w:val="none" w:color="FFFFFF" w:sz="0"/>
+              <w:bottom w:val="none" w:color="FFFFFF" w:sz="0"/>
+              <w:right w:val="none" w:color="FFFFFF" w:sz="0"/>
+            </w:tcBorders>
+            <w:vAlign w:val="center"/>
+          </w:tcPr>
+          <w:p>
+            <w:pPr>
+              <w:jc w:val="center"/>
+            </w:pPr>
+            <w:r>
+              <w:rPr>
+                <w:rFonts w:ascii="Calibri" w:cs="Calibri" w:eastAsia="Calibri" w:hAnsi="Calibri"/>
+                <w:color w:val="2E7D8C"/>
+                <w:sz w:val="22"/>
+                <w:szCs w:val="22"/>
+              </w:rPr>
+              <w:t xml:space="preserve">►</w:t>
+            </w:r>
+          </w:p>
+        </w:tc>
+        <w:tc>
+          <w:tcPr>
+            <w:tcW w:type="dxa" w:w="2592"/>
+            <w:tcBorders>
+              <w:top w:val="single" w:color="2E7D8C" w:sz="6"/>
+              <w:left w:val="single" w:color="2E7D8C" w:sz="6"/>
+              <w:bottom w:val="single" w:color="2E7D8C" w:sz="6"/>
+              <w:right w:val="single" w:color="2E7D8C" w:sz="6"/>
+            </w:tcBorders>
+            <w:shd w:fill="EAF2F5" w:color="auto" w:val="clear"/>
+            <w:tcMar>
+              <w:top w:type="dxa" w:w="100"/>
+              <w:left w:type="dxa" w:w="110"/>
+              <w:bottom w:type="dxa" w:w="100"/>
+              <w:right w:type="dxa" w:w="110"/>
+            </w:tcMar>
+          </w:tcPr>
+          <w:p>
+            <w:pPr>
+              <w:spacing w:after="60"/>
+            </w:pPr>
+            <w:r>
+              <w:rPr>
+                <w:rFonts w:ascii="Calibri" w:cs="Calibri" w:eastAsia="Calibri" w:hAnsi="Calibri"/>
+                <w:b/>
+                <w:bCs/>
+                <w:color w:val="1F3A5F"/>
+                <w:sz w:val="20"/>
+                <w:szCs w:val="20"/>
+              </w:rPr>
+              <w:t xml:space="preserve">2 · Riesgo de Crédito</w:t>
+            </w:r>
+          </w:p>
+          <w:p>
+            <w:pPr>
+              <w:spacing w:after="0"/>
+            </w:pPr>
+            <w:r>
+              <w:rPr>
+                <w:rFonts w:ascii="Calibri" w:cs="Calibri" w:eastAsia="Calibri" w:hAnsi="Calibri"/>
+                <w:sz w:val="18"/>
+                <w:szCs w:val="18"/>
+              </w:rPr>
+              <w:t xml:space="preserve">Verifica que la carga coincida con la línea aprobada</w:t>
+            </w:r>
+          </w:p>
+        </w:tc>
+        <w:tc>
+          <w:tcPr>
+            <w:tcW w:type="dxa" w:w="360"/>
+            <w:tcBorders>
+              <w:top w:val="none" w:color="FFFFFF" w:sz="0"/>
+              <w:left w:val="none" w:color="FFFFFF" w:sz="0"/>
+              <w:bottom w:val="none" w:color="FFFFFF" w:sz="0"/>
+              <w:right w:val="none" w:color="FFFFFF" w:sz="0"/>
+            </w:tcBorders>
+            <w:vAlign w:val="center"/>
+          </w:tcPr>
+          <w:p>
+            <w:pPr>
+              <w:jc w:val="center"/>
+            </w:pPr>
+            <w:r>
+              <w:rPr>
+                <w:rFonts w:ascii="Calibri" w:cs="Calibri" w:eastAsia="Calibri" w:hAnsi="Calibri"/>
+                <w:color w:val="2E7D8C"/>
+                <w:sz w:val="22"/>
+                <w:szCs w:val="22"/>
+              </w:rPr>
+              <w:t xml:space="preserve">►</w:t>
+            </w:r>
+          </w:p>
+        </w:tc>
+        <w:tc>
+          <w:tcPr>
+            <w:tcW w:type="dxa" w:w="2592"/>
+            <w:tcBorders>
+              <w:top w:val="single" w:color="2E7D8C" w:sz="6"/>
+              <w:left w:val="single" w:color="2E7D8C" w:sz="6"/>
+              <w:bottom w:val="single" w:color="2E7D8C" w:sz="6"/>
+              <w:right w:val="single" w:color="2E7D8C" w:sz="6"/>
+            </w:tcBorders>
+            <w:shd w:fill="EAF2F5" w:color="auto" w:val="clear"/>
+            <w:tcMar>
+              <w:top w:type="dxa" w:w="100"/>
+              <w:left w:type="dxa" w:w="110"/>
+              <w:bottom w:type="dxa" w:w="100"/>
+              <w:right w:type="dxa" w:w="110"/>
+            </w:tcMar>
+          </w:tcPr>
+          <w:p>
+            <w:pPr>
+              <w:spacing w:after="60"/>
+            </w:pPr>
+            <w:r>
+              <w:rPr>
+                <w:rFonts w:ascii="Calibri" w:cs="Calibri" w:eastAsia="Calibri" w:hAnsi="Calibri"/>
+                <w:b/>
+                <w:bCs/>
+                <w:color w:val="1F3A5F"/>
+                <w:sz w:val="20"/>
+                <w:szCs w:val="20"/>
+              </w:rPr>
+              <w:t xml:space="preserve">3 · Gerente comercial</w:t>
+            </w:r>
+          </w:p>
+          <w:p>
+            <w:pPr>
+              <w:spacing w:after="0"/>
+            </w:pPr>
+            <w:r>
+              <w:rPr>
+                <w:rFonts w:ascii="Calibri" w:cs="Calibri" w:eastAsia="Calibri" w:hAnsi="Calibri"/>
+                <w:sz w:val="18"/>
+                <w:szCs w:val="18"/>
+              </w:rPr>
+              <w:t xml:space="preserve">Aprueba (Raúl Lynch o Rudecindo Roca, según el caso)</w:t>
+            </w:r>
+          </w:p>
+        </w:tc>
+        <w:tc>
+          <w:tcPr>
+            <w:tcW w:type="dxa" w:w="360"/>
+            <w:tcBorders>
+              <w:top w:val="none" w:color="FFFFFF" w:sz="0"/>
+              <w:left w:val="none" w:color="FFFFFF" w:sz="0"/>
+              <w:bottom w:val="none" w:color="FFFFFF" w:sz="0"/>
+              <w:right w:val="none" w:color="FFFFFF" w:sz="0"/>
+            </w:tcBorders>
+            <w:vAlign w:val="center"/>
+          </w:tcPr>
+          <w:p>
+            <w:pPr>
+              <w:jc w:val="center"/>
+            </w:pPr>
+            <w:r>
+              <w:rPr>
+                <w:rFonts w:ascii="Calibri" w:cs="Calibri" w:eastAsia="Calibri" w:hAnsi="Calibri"/>
+                <w:color w:val="2E7D8C"/>
+                <w:sz w:val="22"/>
+                <w:szCs w:val="22"/>
+              </w:rPr>
+              <w:t xml:space="preserve">►</w:t>
+            </w:r>
+          </w:p>
+        </w:tc>
+        <w:tc>
+          <w:tcPr>
+            <w:tcW w:type="dxa" w:w="2592"/>
+            <w:tcBorders>
+              <w:top w:val="single" w:color="2E7D8C" w:sz="6"/>
+              <w:left w:val="single" w:color="2E7D8C" w:sz="6"/>
+              <w:bottom w:val="single" w:color="2E7D8C" w:sz="6"/>
+              <w:right w:val="single" w:color="2E7D8C" w:sz="6"/>
+            </w:tcBorders>
+            <w:shd w:fill="EAF2F5" w:color="auto" w:val="clear"/>
+            <w:tcMar>
+              <w:top w:type="dxa" w:w="100"/>
+              <w:left w:type="dxa" w:w="110"/>
+              <w:bottom w:type="dxa" w:w="100"/>
+              <w:right w:type="dxa" w:w="110"/>
+            </w:tcMar>
+          </w:tcPr>
+          <w:p>
+            <w:pPr>
+              <w:spacing w:after="60"/>
+            </w:pPr>
+            <w:r>
+              <w:rPr>
+                <w:rFonts w:ascii="Calibri" w:cs="Calibri" w:eastAsia="Calibri" w:hAnsi="Calibri"/>
+                <w:b/>
+                <w:bCs/>
+                <w:color w:val="1F3A5F"/>
+                <w:sz w:val="20"/>
+                <w:szCs w:val="20"/>
+              </w:rPr>
+              <w:t xml:space="preserve">4 · Gerente de Riesgos</w:t>
+            </w:r>
+          </w:p>
+          <w:p>
+            <w:pPr>
+              <w:spacing w:after="0"/>
+            </w:pPr>
+            <w:r>
+              <w:rPr>
+                <w:rFonts w:ascii="Calibri" w:cs="Calibri" w:eastAsia="Calibri" w:hAnsi="Calibri"/>
+                <w:sz w:val="18"/>
+                <w:szCs w:val="18"/>
+              </w:rPr>
+              <w:t xml:space="preserve">Aprueba</w:t>
+            </w:r>
+          </w:p>
+        </w:tc>
+        <w:tc>
+          <w:tcPr>
+            <w:tcW w:type="dxa" w:w="360"/>
+            <w:tcBorders>
+              <w:top w:val="none" w:color="FFFFFF" w:sz="0"/>
+              <w:left w:val="none" w:color="FFFFFF" w:sz="0"/>
+              <w:bottom w:val="none" w:color="FFFFFF" w:sz="0"/>
+              <w:right w:val="none" w:color="FFFFFF" w:sz="0"/>
+            </w:tcBorders>
+            <w:vAlign w:val="center"/>
+          </w:tcPr>
+          <w:p>
+            <w:pPr>
+              <w:jc w:val="center"/>
+            </w:pPr>
+            <w:r>
+              <w:rPr>
+                <w:rFonts w:ascii="Calibri" w:cs="Calibri" w:eastAsia="Calibri" w:hAnsi="Calibri"/>
+                <w:color w:val="2E7D8C"/>
+                <w:sz w:val="22"/>
+                <w:szCs w:val="22"/>
+              </w:rPr>
+              <w:t xml:space="preserve">►</w:t>
+            </w:r>
+          </w:p>
+        </w:tc>
+        <w:tc>
+          <w:tcPr>
+            <w:tcW w:type="dxa" w:w="2592"/>
+            <w:tcBorders>
+              <w:top w:val="single" w:color="2E7D8C" w:sz="6"/>
+              <w:left w:val="single" w:color="2E7D8C" w:sz="6"/>
+              <w:bottom w:val="single" w:color="2E7D8C" w:sz="6"/>
+              <w:right w:val="single" w:color="2E7D8C" w:sz="6"/>
+            </w:tcBorders>
+            <w:shd w:fill="EAF2F5" w:color="auto" w:val="clear"/>
+            <w:tcMar>
+              <w:top w:type="dxa" w:w="100"/>
+              <w:left w:type="dxa" w:w="110"/>
+              <w:bottom w:type="dxa" w:w="100"/>
+              <w:right w:type="dxa" w:w="110"/>
+            </w:tcMar>
+          </w:tcPr>
+          <w:p>
+            <w:pPr>
+              <w:spacing w:after="60"/>
+            </w:pPr>
+            <w:r>
+              <w:rPr>
+                <w:rFonts w:ascii="Calibri" w:cs="Calibri" w:eastAsia="Calibri" w:hAnsi="Calibri"/>
+                <w:b/>
+                <w:bCs/>
+                <w:color w:val="1F3A5F"/>
+                <w:sz w:val="20"/>
+                <w:szCs w:val="20"/>
+              </w:rPr>
+              <w:t xml:space="preserve">5 · CEO</w:t>
+            </w:r>
+          </w:p>
+          <w:p>
+            <w:pPr>
+              <w:spacing w:after="0"/>
+            </w:pPr>
+            <w:r>
+              <w:rPr>
+                <w:rFonts w:ascii="Calibri" w:cs="Calibri" w:eastAsia="Calibri" w:hAnsi="Calibri"/>
+                <w:sz w:val="18"/>
+                <w:szCs w:val="18"/>
+              </w:rPr>
+              <w:t xml:space="preserve">Aprobación final; la línea queda disponible</w:t>
             </w:r>
           </w:p>
         </w:tc>
@@ -3283,7 +3753,7 @@
           <w:sz w:val="19"/>
           <w:szCs w:val="19"/>
         </w:rPr>
-        <w:t xml:space="preserve">Del lado de Riesgos, el ruteo de líneas y operaciones lo realiza Agustín Sotz.</w:t>
+        <w:t xml:space="preserve">Del lado de Riesgos, el ruteo de las líneas lo realiza Agustín Sotz.</w:t>
       </w:r>
     </w:p>
     <w:p>
@@ -3299,326 +3769,91 @@
           <w:sz w:val="24"/>
           <w:szCs w:val="24"/>
         </w:rPr>
-        <w:t xml:space="preserve">Carga de una operación de descubierto</w:t>
+        <w:t xml:space="preserve">Puntos críticos</w:t>
       </w:r>
     </w:p>
-    <w:tbl>
-      <w:tblPr>
-        <w:tblW w:type="dxa" w:w="14400"/>
-        <w:tblBorders>
-          <w:top w:val="single" w:color="auto" w:sz="4"/>
-          <w:left w:val="single" w:color="auto" w:sz="4"/>
-          <w:bottom w:val="single" w:color="auto" w:sz="4"/>
-          <w:right w:val="single" w:color="auto" w:sz="4"/>
-          <w:insideH w:val="single" w:color="auto" w:sz="4"/>
-          <w:insideV w:val="single" w:color="auto" w:sz="4"/>
-        </w:tblBorders>
-      </w:tblPr>
-      <w:tblGrid>
-        <w:gridCol w:w="3330"/>
-        <w:gridCol w:w="360"/>
-        <w:gridCol w:w="3330"/>
-        <w:gridCol w:w="360"/>
-        <w:gridCol w:w="3330"/>
-        <w:gridCol w:w="360"/>
-        <w:gridCol w:w="3330"/>
-      </w:tblGrid>
-      <w:tr>
-        <w:tc>
-          <w:tcPr>
-            <w:tcW w:type="dxa" w:w="3330"/>
-            <w:tcBorders>
-              <w:top w:val="single" w:color="2E7D8C" w:sz="6"/>
-              <w:left w:val="single" w:color="2E7D8C" w:sz="6"/>
-              <w:bottom w:val="single" w:color="2E7D8C" w:sz="6"/>
-              <w:right w:val="single" w:color="2E7D8C" w:sz="6"/>
-            </w:tcBorders>
-            <w:shd w:fill="1F3A5F" w:color="auto" w:val="clear"/>
-            <w:tcMar>
-              <w:top w:type="dxa" w:w="100"/>
-              <w:left w:type="dxa" w:w="110"/>
-              <w:bottom w:type="dxa" w:w="100"/>
-              <w:right w:type="dxa" w:w="110"/>
-            </w:tcMar>
-          </w:tcPr>
-          <w:p>
-            <w:pPr>
-              <w:spacing w:after="60"/>
-            </w:pPr>
-            <w:r>
-              <w:rPr>
-                <w:rFonts w:ascii="Calibri" w:cs="Calibri" w:eastAsia="Calibri" w:hAnsi="Calibri"/>
-                <w:b/>
-                <w:bCs/>
-                <w:color w:val="FFFFFF"/>
-                <w:sz w:val="20"/>
-                <w:szCs w:val="20"/>
-              </w:rPr>
-              <w:t xml:space="preserve">1 · Middle Office</w:t>
-            </w:r>
-          </w:p>
-          <w:p>
-            <w:pPr>
-              <w:spacing w:after="0"/>
-            </w:pPr>
-            <w:r>
-              <w:rPr>
-                <w:rFonts w:ascii="Calibri" w:cs="Calibri" w:eastAsia="Calibri" w:hAnsi="Calibri"/>
-                <w:color w:val="FFFFFF"/>
-                <w:sz w:val="18"/>
-                <w:szCs w:val="18"/>
-              </w:rPr>
-              <w:t xml:space="preserve">Carga la operación en COBIS Trámites ingresando vencimiento, monto y tasa</w:t>
-            </w:r>
-          </w:p>
-        </w:tc>
-        <w:tc>
-          <w:tcPr>
-            <w:tcW w:type="dxa" w:w="360"/>
-            <w:tcBorders>
-              <w:top w:val="none" w:color="FFFFFF" w:sz="0"/>
-              <w:left w:val="none" w:color="FFFFFF" w:sz="0"/>
-              <w:bottom w:val="none" w:color="FFFFFF" w:sz="0"/>
-              <w:right w:val="none" w:color="FFFFFF" w:sz="0"/>
-            </w:tcBorders>
-            <w:vAlign w:val="center"/>
-          </w:tcPr>
-          <w:p>
-            <w:pPr>
-              <w:jc w:val="center"/>
-            </w:pPr>
-            <w:r>
-              <w:rPr>
-                <w:rFonts w:ascii="Calibri" w:cs="Calibri" w:eastAsia="Calibri" w:hAnsi="Calibri"/>
-                <w:color w:val="2E7D8C"/>
-                <w:sz w:val="22"/>
-                <w:szCs w:val="22"/>
-              </w:rPr>
-              <w:t xml:space="preserve">►</w:t>
-            </w:r>
-          </w:p>
-        </w:tc>
-        <w:tc>
-          <w:tcPr>
-            <w:tcW w:type="dxa" w:w="3330"/>
-            <w:tcBorders>
-              <w:top w:val="single" w:color="2E7D8C" w:sz="6"/>
-              <w:left w:val="single" w:color="2E7D8C" w:sz="6"/>
-              <w:bottom w:val="single" w:color="2E7D8C" w:sz="6"/>
-              <w:right w:val="single" w:color="2E7D8C" w:sz="6"/>
-            </w:tcBorders>
-            <w:shd w:fill="EAF2F5" w:color="auto" w:val="clear"/>
-            <w:tcMar>
-              <w:top w:type="dxa" w:w="100"/>
-              <w:left w:type="dxa" w:w="110"/>
-              <w:bottom w:type="dxa" w:w="100"/>
-              <w:right w:type="dxa" w:w="110"/>
-            </w:tcMar>
-          </w:tcPr>
-          <w:p>
-            <w:pPr>
-              <w:spacing w:after="60"/>
-            </w:pPr>
-            <w:r>
-              <w:rPr>
-                <w:rFonts w:ascii="Calibri" w:cs="Calibri" w:eastAsia="Calibri" w:hAnsi="Calibri"/>
-                <w:b/>
-                <w:bCs/>
-                <w:color w:val="1F3A5F"/>
-                <w:sz w:val="20"/>
-                <w:szCs w:val="20"/>
-              </w:rPr>
-              <w:t xml:space="preserve">2 · Riesgos</w:t>
-            </w:r>
-          </w:p>
-          <w:p>
-            <w:pPr>
-              <w:spacing w:after="0"/>
-            </w:pPr>
-            <w:r>
-              <w:rPr>
-                <w:rFonts w:ascii="Calibri" w:cs="Calibri" w:eastAsia="Calibri" w:hAnsi="Calibri"/>
-                <w:sz w:val="18"/>
-                <w:szCs w:val="18"/>
-              </w:rPr>
-              <w:t xml:space="preserve">El analista verifica a mano el fraccionamiento</w:t>
-            </w:r>
-          </w:p>
-        </w:tc>
-        <w:tc>
-          <w:tcPr>
-            <w:tcW w:type="dxa" w:w="360"/>
-            <w:tcBorders>
-              <w:top w:val="none" w:color="FFFFFF" w:sz="0"/>
-              <w:left w:val="none" w:color="FFFFFF" w:sz="0"/>
-              <w:bottom w:val="none" w:color="FFFFFF" w:sz="0"/>
-              <w:right w:val="none" w:color="FFFFFF" w:sz="0"/>
-            </w:tcBorders>
-            <w:vAlign w:val="center"/>
-          </w:tcPr>
-          <w:p>
-            <w:pPr>
-              <w:jc w:val="center"/>
-            </w:pPr>
-            <w:r>
-              <w:rPr>
-                <w:rFonts w:ascii="Calibri" w:cs="Calibri" w:eastAsia="Calibri" w:hAnsi="Calibri"/>
-                <w:color w:val="2E7D8C"/>
-                <w:sz w:val="22"/>
-                <w:szCs w:val="22"/>
-              </w:rPr>
-              <w:t xml:space="preserve">►</w:t>
-            </w:r>
-          </w:p>
-        </w:tc>
-        <w:tc>
-          <w:tcPr>
-            <w:tcW w:type="dxa" w:w="3330"/>
-            <w:tcBorders>
-              <w:top w:val="single" w:color="2E7D8C" w:sz="6"/>
-              <w:left w:val="single" w:color="2E7D8C" w:sz="6"/>
-              <w:bottom w:val="single" w:color="2E7D8C" w:sz="6"/>
-              <w:right w:val="single" w:color="2E7D8C" w:sz="6"/>
-            </w:tcBorders>
-            <w:shd w:fill="EAF2F5" w:color="auto" w:val="clear"/>
-            <w:tcMar>
-              <w:top w:type="dxa" w:w="100"/>
-              <w:left w:type="dxa" w:w="110"/>
-              <w:bottom w:type="dxa" w:w="100"/>
-              <w:right w:type="dxa" w:w="110"/>
-            </w:tcMar>
-          </w:tcPr>
-          <w:p>
-            <w:pPr>
-              <w:spacing w:after="60"/>
-            </w:pPr>
-            <w:r>
-              <w:rPr>
-                <w:rFonts w:ascii="Calibri" w:cs="Calibri" w:eastAsia="Calibri" w:hAnsi="Calibri"/>
-                <w:b/>
-                <w:bCs/>
-                <w:color w:val="1F3A5F"/>
-                <w:sz w:val="20"/>
-                <w:szCs w:val="20"/>
-              </w:rPr>
-              <w:t xml:space="preserve">3 · Control manual</w:t>
-            </w:r>
-          </w:p>
-          <w:p>
-            <w:pPr>
-              <w:spacing w:after="0"/>
-            </w:pPr>
-            <w:r>
-              <w:rPr>
-                <w:rFonts w:ascii="Calibri" w:cs="Calibri" w:eastAsia="Calibri" w:hAnsi="Calibri"/>
-                <w:sz w:val="18"/>
-                <w:szCs w:val="18"/>
-              </w:rPr>
-              <w:t xml:space="preserve">Que el grupo no supere el 15% de la RPC y que la suma de operaciones no supere la línea</w:t>
-            </w:r>
-          </w:p>
-        </w:tc>
-        <w:tc>
-          <w:tcPr>
-            <w:tcW w:type="dxa" w:w="360"/>
-            <w:tcBorders>
-              <w:top w:val="none" w:color="FFFFFF" w:sz="0"/>
-              <w:left w:val="none" w:color="FFFFFF" w:sz="0"/>
-              <w:bottom w:val="none" w:color="FFFFFF" w:sz="0"/>
-              <w:right w:val="none" w:color="FFFFFF" w:sz="0"/>
-            </w:tcBorders>
-            <w:vAlign w:val="center"/>
-          </w:tcPr>
-          <w:p>
-            <w:pPr>
-              <w:jc w:val="center"/>
-            </w:pPr>
-            <w:r>
-              <w:rPr>
-                <w:rFonts w:ascii="Calibri" w:cs="Calibri" w:eastAsia="Calibri" w:hAnsi="Calibri"/>
-                <w:color w:val="2E7D8C"/>
-                <w:sz w:val="22"/>
-                <w:szCs w:val="22"/>
-              </w:rPr>
-              <w:t xml:space="preserve">►</w:t>
-            </w:r>
-          </w:p>
-        </w:tc>
-        <w:tc>
-          <w:tcPr>
-            <w:tcW w:type="dxa" w:w="3330"/>
-            <w:tcBorders>
-              <w:top w:val="single" w:color="2E7D8C" w:sz="6"/>
-              <w:left w:val="single" w:color="2E7D8C" w:sz="6"/>
-              <w:bottom w:val="single" w:color="2E7D8C" w:sz="6"/>
-              <w:right w:val="single" w:color="2E7D8C" w:sz="6"/>
-            </w:tcBorders>
-            <w:shd w:fill="EAF2F5" w:color="auto" w:val="clear"/>
-            <w:tcMar>
-              <w:top w:type="dxa" w:w="100"/>
-              <w:left w:type="dxa" w:w="110"/>
-              <w:bottom w:type="dxa" w:w="100"/>
-              <w:right w:type="dxa" w:w="110"/>
-            </w:tcMar>
-          </w:tcPr>
-          <w:p>
-            <w:pPr>
-              <w:spacing w:after="60"/>
-            </w:pPr>
-            <w:r>
-              <w:rPr>
-                <w:rFonts w:ascii="Calibri" w:cs="Calibri" w:eastAsia="Calibri" w:hAnsi="Calibri"/>
-                <w:b/>
-                <w:bCs/>
-                <w:color w:val="1F3A5F"/>
-                <w:sz w:val="20"/>
-                <w:szCs w:val="20"/>
-              </w:rPr>
-              <w:t xml:space="preserve">4 · Alta</w:t>
-            </w:r>
-          </w:p>
-          <w:p>
-            <w:pPr>
-              <w:spacing w:after="0"/>
-            </w:pPr>
-            <w:r>
-              <w:rPr>
-                <w:rFonts w:ascii="Calibri" w:cs="Calibri" w:eastAsia="Calibri" w:hAnsi="Calibri"/>
-                <w:sz w:val="18"/>
-                <w:szCs w:val="18"/>
-              </w:rPr>
-              <w:t xml:space="preserve">Se da de alta el acuerdo</w:t>
-            </w:r>
-          </w:p>
-        </w:tc>
-      </w:tr>
-    </w:tbl>
     <w:p>
       <w:pPr>
-        <w:pBdr>
-          <w:left w:val="single" w:color="2E7D8C" w:sz="24" w:space="8"/>
-        </w:pBdr>
-        <w:shd w:fill="EAF2F5" w:color="auto" w:val="clear"/>
-        <w:spacing w:after="120" w:before="160"/>
-        <w:ind w:left="120"/>
+        <w:pStyle w:val="ListParagraph"/>
+        <w:numPr>
+          <w:ilvl w:val="0"/>
+          <w:numId w:val="2"/>
+        </w:numPr>
+        <w:spacing w:after="60"/>
       </w:pPr>
       <w:r>
         <w:rPr>
           <w:rFonts w:ascii="Calibri" w:cs="Calibri" w:eastAsia="Calibri" w:hAnsi="Calibri"/>
           <w:b/>
           <w:bCs/>
-          <w:sz w:val="20"/>
-          <w:szCs w:val="20"/>
+          <w:sz w:val="22"/>
+          <w:szCs w:val="22"/>
         </w:rPr>
-        <w:t xml:space="preserve">Clave: </w:t>
+        <w:t xml:space="preserve">Doble trabajo: </w:t>
       </w:r>
       <w:r>
         <w:rPr>
           <w:rFonts w:ascii="Calibri" w:cs="Calibri" w:eastAsia="Calibri" w:hAnsi="Calibri"/>
-          <w:sz w:val="20"/>
-          <w:szCs w:val="20"/>
+          <w:sz w:val="22"/>
+          <w:szCs w:val="22"/>
         </w:rPr>
-        <w:t xml:space="preserve">COBIS no controla por grupo económico; todo el control de fraccionamiento depende de una revisión manual.</w:t>
+        <w:t xml:space="preserve">la información de la línea se escribe dos veces, primero en la minuta y después en COBIS.</w:t>
+      </w:r>
+    </w:p>
+    <w:p>
+      <w:pPr>
+        <w:pStyle w:val="ListParagraph"/>
+        <w:numPr>
+          <w:ilvl w:val="0"/>
+          <w:numId w:val="2"/>
+        </w:numPr>
+        <w:spacing w:after="60"/>
+      </w:pPr>
+      <w:r>
+        <w:rPr>
+          <w:rFonts w:ascii="Calibri" w:cs="Calibri" w:eastAsia="Calibri" w:hAnsi="Calibri"/>
+          <w:b/>
+          <w:bCs/>
+          <w:sz w:val="22"/>
+          <w:szCs w:val="22"/>
+        </w:rPr>
+        <w:t xml:space="preserve">Doble aprobación: </w:t>
+      </w:r>
+      <w:r>
+        <w:rPr>
+          <w:rFonts w:ascii="Calibri" w:cs="Calibri" w:eastAsia="Calibri" w:hAnsi="Calibri"/>
+          <w:sz w:val="22"/>
+          <w:szCs w:val="22"/>
+        </w:rPr>
+        <w:t xml:space="preserve">una línea ya aprobada en comité vuelve a pasar por tres aprobaciones sobre la carga.</w:t>
+      </w:r>
+    </w:p>
+    <w:p>
+      <w:pPr>
+        <w:pStyle w:val="ListParagraph"/>
+        <w:numPr>
+          <w:ilvl w:val="0"/>
+          <w:numId w:val="2"/>
+        </w:numPr>
+        <w:spacing w:after="60"/>
+      </w:pPr>
+      <w:r>
+        <w:rPr>
+          <w:rFonts w:ascii="Calibri" w:cs="Calibri" w:eastAsia="Calibri" w:hAnsi="Calibri"/>
+          <w:b/>
+          <w:bCs/>
+          <w:sz w:val="22"/>
+          <w:szCs w:val="22"/>
+        </w:rPr>
+        <w:t xml:space="preserve">Garantías fuera del sistema: </w:t>
+      </w:r>
+      <w:r>
+        <w:rPr>
+          <w:rFonts w:ascii="Calibri" w:cs="Calibri" w:eastAsia="Calibri" w:hAnsi="Calibri"/>
+          <w:sz w:val="22"/>
+          <w:szCs w:val="22"/>
+        </w:rPr>
+        <w:t xml:space="preserve">si la línea requiere garantía, el OK de Activas y las excepciones se gestionan por fuera.</w:t>
       </w:r>
     </w:p>
     <w:p>
@@ -3667,7 +3902,7 @@
           <w:sz w:val="22"/>
           <w:szCs w:val="22"/>
         </w:rPr>
-        <w:t xml:space="preserve">Puntos de dolor detectados en el relevamiento y cómo los resuelve el proyecto</w:t>
+        <w:t xml:space="preserve">Puntos de dolor en la aprobación y carga de líneas, y cómo los resuelve el proyecto</w:t>
       </w:r>
     </w:p>
     <w:tbl>
@@ -3825,7 +4060,7 @@
                 <w:sz w:val="20"/>
                 <w:szCs w:val="20"/>
               </w:rPr>
-              <w:t xml:space="preserve">Dependencia de una persona; si el comité cambia la propuesta hay que rehacerla; no hay historial</w:t>
+              <w:t xml:space="preserve">Dependencia de una persona y ningún historial de lo propuesto y lo aprobado</w:t>
             </w:r>
           </w:p>
         </w:tc>
@@ -3851,7 +4086,7 @@
                 <w:sz w:val="20"/>
                 <w:szCs w:val="20"/>
               </w:rPr>
-              <w:t xml:space="preserve">Módulo A: pantalla de minutas con versiones y aprobación en sistema</w:t>
+              <w:t xml:space="preserve">Módulo A: pantalla de minutas con aprobación en el sistema</w:t>
             </w:r>
           </w:p>
         </w:tc>
@@ -3880,7 +4115,7 @@
                 <w:sz w:val="20"/>
                 <w:szCs w:val="20"/>
               </w:rPr>
-              <w:t xml:space="preserve">La línea se vuelve a tipear en COBIS</w:t>
+              <w:t xml:space="preserve">Cambios del comité corregidos a mano</w:t>
             </w:r>
           </w:p>
         </w:tc>
@@ -3907,7 +4142,7 @@
                 <w:sz w:val="20"/>
                 <w:szCs w:val="20"/>
               </w:rPr>
-              <w:t xml:space="preserve">Doble carga y riesgo de error entre lo aprobado y lo cargado</w:t>
+              <w:t xml:space="preserve">Riesgo de que la minuta final no refleje lo que se decidió</w:t>
             </w:r>
           </w:p>
         </w:tc>
@@ -3934,7 +4169,7 @@
                 <w:sz w:val="20"/>
                 <w:szCs w:val="20"/>
               </w:rPr>
-              <w:t xml:space="preserve">Módulo A/B: la aprobación crea la línea automáticamente</w:t>
+              <w:t xml:space="preserve">Módulo A: cada cambio queda guardado como una nueva versión</w:t>
             </w:r>
           </w:p>
         </w:tc>
@@ -3962,7 +4197,7 @@
                 <w:sz w:val="20"/>
                 <w:szCs w:val="20"/>
               </w:rPr>
-              <w:t xml:space="preserve">Cinco pasos secuenciales de carga y aprobación</w:t>
+              <w:t xml:space="preserve">La línea se vuelve a tipear en COBIS</w:t>
             </w:r>
           </w:p>
         </w:tc>
@@ -3988,7 +4223,7 @@
                 <w:sz w:val="20"/>
                 <w:szCs w:val="20"/>
               </w:rPr>
-              <w:t xml:space="preserve">Demora entre la decisión del comité y la línea disponible</w:t>
+              <w:t xml:space="preserve">Doble carga y riesgo de error entre lo aprobado y lo cargado</w:t>
             </w:r>
           </w:p>
         </w:tc>
@@ -4014,7 +4249,7 @@
                 <w:sz w:val="20"/>
                 <w:szCs w:val="20"/>
               </w:rPr>
-              <w:t xml:space="preserve">La aprobación del comité es la aprobación; se elimina la re-aprobación de la carga</w:t>
+              <w:t xml:space="preserve">Módulos A y B: la aprobación crea la línea automáticamente</w:t>
             </w:r>
           </w:p>
         </w:tc>
@@ -4043,7 +4278,7 @@
                 <w:sz w:val="20"/>
                 <w:szCs w:val="20"/>
               </w:rPr>
-              <w:t xml:space="preserve">Sin control por grupo económico</w:t>
+              <w:t xml:space="preserve">Cinco pasos secuenciales de carga y aprobación</w:t>
             </w:r>
           </w:p>
         </w:tc>
@@ -4070,7 +4305,7 @@
                 <w:sz w:val="20"/>
                 <w:szCs w:val="20"/>
               </w:rPr>
-              <w:t xml:space="preserve">Riesgo regulatorio (15% de la RPC) y de exceso de línea; carga operativa en Riesgos</w:t>
+              <w:t xml:space="preserve">Demora entre la decisión del comité y la línea disponible</w:t>
             </w:r>
           </w:p>
         </w:tc>
@@ -4097,7 +4332,7 @@
                 <w:sz w:val="20"/>
                 <w:szCs w:val="20"/>
               </w:rPr>
-              <w:t xml:space="preserve">Módulo E: control automático en cada operación</w:t>
+              <w:t xml:space="preserve">La aprobación del comité es la única aprobación; se elimina la re-aprobación de la carga</w:t>
             </w:r>
           </w:p>
         </w:tc>
@@ -4125,7 +4360,7 @@
                 <w:sz w:val="20"/>
                 <w:szCs w:val="20"/>
               </w:rPr>
-              <w:t xml:space="preserve">Descubiertos sin valores por defecto ni validación de tasa</w:t>
+              <w:t xml:space="preserve">Garantías dependen del OK de Activas sin excepción formal</w:t>
             </w:r>
           </w:p>
         </w:tc>
@@ -4151,7 +4386,7 @@
                 <w:sz w:val="20"/>
                 <w:szCs w:val="20"/>
               </w:rPr>
-              <w:t xml:space="preserve">Errores de carga y tasas por debajo del costo de dinero</w:t>
+              <w:t xml:space="preserve">Líneas frenadas o excepciones informales</w:t>
             </w:r>
           </w:p>
         </w:tc>
@@ -4177,7 +4412,7 @@
                 <w:sz w:val="20"/>
                 <w:szCs w:val="20"/>
               </w:rPr>
-              <w:t xml:space="preserve">Módulos E y H: valores por defecto y tasa mínima de Mesa</w:t>
+              <w:t xml:space="preserve">Módulo B: estado "pendiente de garantía" y forzado por gerente de Riesgos o CEO, con regularización</w:t>
             </w:r>
           </w:p>
         </w:tc>
@@ -4206,7 +4441,7 @@
                 <w:sz w:val="20"/>
                 <w:szCs w:val="20"/>
               </w:rPr>
-              <w:t xml:space="preserve">Renovaciones sin camino propio</w:t>
+              <w:t xml:space="preserve">Clientes que no están en COBIS MIS</w:t>
             </w:r>
           </w:p>
         </w:tc>
@@ -4233,7 +4468,7 @@
                 <w:sz w:val="20"/>
                 <w:szCs w:val="20"/>
               </w:rPr>
-              <w:t xml:space="preserve">No se puede cursar la nueva operación con la anterior vigente</w:t>
+              <w:t xml:space="preserve">Hay que dar de alta al cliente antes de poder cargar la línea</w:t>
             </w:r>
           </w:p>
         </w:tc>
@@ -4260,7 +4495,7 @@
                 <w:sz w:val="20"/>
                 <w:szCs w:val="20"/>
               </w:rPr>
-              <w:t xml:space="preserve">Módulo F: flujo de renovación con baja y alta automática</w:t>
+              <w:t xml:space="preserve">Módulo B: alta simplificada con CUIT, razón social y rating</w:t>
             </w:r>
           </w:p>
         </w:tc>
@@ -4288,7 +4523,7 @@
                 <w:sz w:val="20"/>
                 <w:szCs w:val="20"/>
               </w:rPr>
-              <w:t xml:space="preserve">Garantías dependen del OK de Activas sin excepción formal</w:t>
+              <w:t xml:space="preserve">Líneas en USD sin ajuste por tipo de cambio</w:t>
             </w:r>
           </w:p>
         </w:tc>
@@ -4314,7 +4549,7 @@
                 <w:sz w:val="20"/>
                 <w:szCs w:val="20"/>
               </w:rPr>
-              <w:t xml:space="preserve">Líneas frenadas o excepciones informales</w:t>
+              <w:t xml:space="preserve">El valor en pesos de la línea queda desactualizado</w:t>
             </w:r>
           </w:p>
         </w:tc>
@@ -4340,7 +4575,7 @@
                 <w:sz w:val="20"/>
                 <w:szCs w:val="20"/>
               </w:rPr>
-              <w:t xml:space="preserve">Forzado controlado por gerente de Riesgos o CEO, con regularización</w:t>
+              <w:t xml:space="preserve">Módulo D: actualización automática según el tipo de cambio</w:t>
             </w:r>
           </w:p>
         </w:tc>
@@ -4396,7 +4631,7 @@
                 <w:sz w:val="20"/>
                 <w:szCs w:val="20"/>
               </w:rPr>
-              <w:t xml:space="preserve">Para operar hay que buscar la línea, su consumo y su vencimiento en distintos lugares</w:t>
+              <w:t xml:space="preserve">Para saber el consumo, el disponible o el vencimiento de una línea hay que buscar en distintos lugares</w:t>
             </w:r>
           </w:p>
         </w:tc>
@@ -4423,92 +4658,28 @@
                 <w:sz w:val="20"/>
                 <w:szCs w:val="20"/>
               </w:rPr>
-              <w:t xml:space="preserve">Módulo C: pantalla de líneas desde la que se cargan todas las operaciones</w:t>
-            </w:r>
-          </w:p>
-        </w:tc>
-      </w:tr>
-      <w:tr>
-        <w:tc>
-          <w:tcPr>
-            <w:tcW w:type="dxa" w:w="4000"/>
-            <w:tcMar>
-              <w:top w:type="dxa" w:w="80"/>
-              <w:left w:type="dxa" w:w="120"/>
-              <w:bottom w:type="dxa" w:w="80"/>
-              <w:right w:type="dxa" w:w="120"/>
-            </w:tcMar>
-          </w:tcPr>
-          <w:p>
-            <w:pPr>
-              <w:spacing w:after="40"/>
-            </w:pPr>
-            <w:r>
-              <w:rPr>
-                <w:rFonts w:ascii="Calibri" w:cs="Calibri" w:eastAsia="Calibri" w:hAnsi="Calibri"/>
-                <w:b/>
-                <w:bCs/>
-                <w:sz w:val="20"/>
-                <w:szCs w:val="20"/>
-              </w:rPr>
-              <w:t xml:space="preserve">Sin visibilidad del circuito</w:t>
-            </w:r>
-          </w:p>
-        </w:tc>
-        <w:tc>
-          <w:tcPr>
-            <w:tcW w:type="dxa" w:w="5200"/>
-            <w:tcMar>
-              <w:top w:type="dxa" w:w="80"/>
-              <w:left w:type="dxa" w:w="120"/>
-              <w:bottom w:type="dxa" w:w="80"/>
-              <w:right w:type="dxa" w:w="120"/>
-            </w:tcMar>
-          </w:tcPr>
-          <w:p>
-            <w:pPr>
-              <w:spacing w:after="40"/>
-            </w:pPr>
-            <w:r>
-              <w:rPr>
-                <w:rFonts w:ascii="Calibri" w:cs="Calibri" w:eastAsia="Calibri" w:hAnsi="Calibri"/>
-                <w:b w:val="false"/>
-                <w:bCs w:val="false"/>
-                <w:sz w:val="20"/>
-                <w:szCs w:val="20"/>
-              </w:rPr>
-              <w:t xml:space="preserve">Se pregunta por mail en qué estado está cada acuerdo</w:t>
-            </w:r>
-          </w:p>
-        </w:tc>
-        <w:tc>
-          <w:tcPr>
-            <w:tcW w:type="dxa" w:w="5200"/>
-            <w:tcMar>
-              <w:top w:type="dxa" w:w="80"/>
-              <w:left w:type="dxa" w:w="120"/>
-              <w:bottom w:type="dxa" w:w="80"/>
-              <w:right w:type="dxa" w:w="120"/>
-            </w:tcMar>
-          </w:tcPr>
-          <w:p>
-            <w:pPr>
-              <w:spacing w:after="40"/>
-            </w:pPr>
-            <w:r>
-              <w:rPr>
-                <w:rFonts w:ascii="Calibri" w:cs="Calibri" w:eastAsia="Calibri" w:hAnsi="Calibri"/>
-                <w:b w:val="false"/>
-                <w:bCs w:val="false"/>
-                <w:sz w:val="20"/>
-                <w:szCs w:val="20"/>
-              </w:rPr>
-              <w:t xml:space="preserve">Módulos G y J: pantalla de seguimiento y visor de vencimientos</w:t>
+              <w:t xml:space="preserve">Módulo C: pantalla de líneas con aprobado, consumido, disponible y estado</w:t>
             </w:r>
           </w:p>
         </w:tc>
       </w:tr>
     </w:tbl>
+    <w:p>
+      <w:pPr>
+        <w:spacing w:after="100" w:before="80"/>
+      </w:pPr>
+      <w:r>
+        <w:rPr>
+          <w:rFonts w:ascii="Calibri" w:cs="Calibri" w:eastAsia="Calibri" w:hAnsi="Calibri"/>
+          <w:i/>
+          <w:iCs/>
+          <w:color w:val="5F6B76"/>
+          <w:sz w:val="19"/>
+          <w:szCs w:val="19"/>
+        </w:rPr>
+        <w:t xml:space="preserve">Los problemas propios de la operatoria (descubiertos, renovaciones y cheques) se tratan en los módulos E a J.</w:t>
+      </w:r>
+    </w:p>
     <w:p>
       <w:pPr>
         <w:pStyle w:val="Heading1"/>
@@ -4555,7 +4726,7 @@
           <w:sz w:val="22"/>
           <w:szCs w:val="22"/>
         </w:rPr>
-        <w:t xml:space="preserve">Todo lo que hoy está en COBIS Trámites y Gestión pasa a COBIS Web</w:t>
+        <w:t xml:space="preserve">El eje del proyecto es la línea de crédito</w:t>
       </w:r>
     </w:p>
     <w:tbl>
@@ -4612,7 +4783,7 @@
                 <w:sz w:val="20"/>
                 <w:szCs w:val="20"/>
               </w:rPr>
-              <w:t xml:space="preserve">Minuta</w:t>
+              <w:t xml:space="preserve">1 · Minuta</w:t>
             </w:r>
           </w:p>
           <w:p>
@@ -4626,7 +4797,7 @@
                 <w:sz w:val="18"/>
                 <w:szCs w:val="18"/>
               </w:rPr>
-              <w:t xml:space="preserve">Se registra y aprueba en la pantalla de minutas</w:t>
+              <w:t xml:space="preserve">Se registra en la pantalla de minutas</w:t>
             </w:r>
           </w:p>
         </w:tc>
@@ -4686,7 +4857,7 @@
                 <w:sz w:val="20"/>
                 <w:szCs w:val="20"/>
               </w:rPr>
-              <w:t xml:space="preserve">Acciones automáticas</w:t>
+              <w:t xml:space="preserve">2 · Aprobación</w:t>
             </w:r>
           </w:p>
           <w:p>
@@ -4699,7 +4870,7 @@
                 <w:sz w:val="18"/>
                 <w:szCs w:val="18"/>
               </w:rPr>
-              <w:t xml:space="preserve">La aprobación crea la línea, pide garantías y notifica</w:t>
+              <w:t xml:space="preserve">El comité aprueba en el sistema</w:t>
             </w:r>
           </w:p>
         </w:tc>
@@ -4759,7 +4930,7 @@
                 <w:sz w:val="20"/>
                 <w:szCs w:val="20"/>
               </w:rPr>
-              <w:t xml:space="preserve">Pantalla de líneas</w:t>
+              <w:t xml:space="preserve">3 · Acciones automáticas</w:t>
             </w:r>
           </w:p>
           <w:p>
@@ -4772,7 +4943,7 @@
                 <w:sz w:val="18"/>
                 <w:szCs w:val="18"/>
               </w:rPr>
-              <w:t xml:space="preserve">Todas las líneas con su consumo; desde acá se opera</w:t>
+              <w:t xml:space="preserve">Alta de la línea, OK de garantías, alta del cliente, firma y avisos</w:t>
             </w:r>
           </w:p>
         </w:tc>
@@ -4832,7 +5003,7 @@
                 <w:sz w:val="20"/>
                 <w:szCs w:val="20"/>
               </w:rPr>
-              <w:t xml:space="preserve">Operaciones</w:t>
+              <w:t xml:space="preserve">4 · Línea activa</w:t>
             </w:r>
           </w:p>
           <w:p>
@@ -4845,7 +5016,7 @@
                 <w:sz w:val="18"/>
                 <w:szCs w:val="18"/>
               </w:rPr>
-              <w:t xml:space="preserve">Descubiertos, renovaciones y cheques con controles</w:t>
+              <w:t xml:space="preserve">Disponible en COBIS, por grupo económico</w:t>
             </w:r>
           </w:p>
         </w:tc>
@@ -4905,7 +5076,7 @@
                 <w:sz w:val="20"/>
                 <w:szCs w:val="20"/>
               </w:rPr>
-              <w:t xml:space="preserve">Seguimiento</w:t>
+              <w:t xml:space="preserve">5 · Pantalla de líneas</w:t>
             </w:r>
           </w:p>
           <w:p>
@@ -4918,7 +5089,7 @@
                 <w:sz w:val="18"/>
                 <w:szCs w:val="18"/>
               </w:rPr>
-              <w:t xml:space="preserve">Pantalla de acuerdos, reportes y vencimientos</w:t>
+              <w:t xml:space="preserve">Aprobado, consumido, disponible, estado y vencimientos</w:t>
             </w:r>
           </w:p>
         </w:tc>
@@ -4926,15 +5097,18 @@
     </w:tbl>
     <w:p>
       <w:pPr>
-        <w:spacing w:after="60" w:before="0"/>
+        <w:spacing w:after="80" w:before="180"/>
       </w:pPr>
       <w:r>
         <w:rPr>
           <w:rFonts w:ascii="Calibri" w:cs="Calibri" w:eastAsia="Calibri" w:hAnsi="Calibri"/>
-          <w:sz w:val="22"/>
-          <w:szCs w:val="22"/>
+          <w:b/>
+          <w:bCs/>
+          <w:color w:val="1F3A5F"/>
+          <w:sz w:val="24"/>
+          <w:szCs w:val="24"/>
         </w:rPr>
-        <w:t xml:space="preserve"> </w:t>
+        <w:t xml:space="preserve">Módulos del núcleo: la línea de crédito</w:t>
       </w:r>
     </w:p>
     <w:tbl>
@@ -5147,7 +5321,7 @@
                 <w:sz w:val="20"/>
                 <w:szCs w:val="20"/>
               </w:rPr>
-              <w:t xml:space="preserve">Registro de la minuta, versiones durante el comité, aprobación en sistema y disparo automático de acciones</w:t>
+              <w:t xml:space="preserve">Registro de la minuta, versiones durante el comité, aprobación en el sistema y disparo automático de acciones</w:t>
             </w:r>
           </w:p>
         </w:tc>
@@ -5363,7 +5537,7 @@
                 <w:sz w:val="20"/>
                 <w:szCs w:val="20"/>
               </w:rPr>
-              <w:t xml:space="preserve">Vista de todas las líneas con aprobado, consumido y disponible; punto de partida para cargar todas las operaciones</w:t>
+              <w:t xml:space="preserve">Vista de todas las líneas con aprobado, consumido, disponible, estado y vencimientos</w:t>
             </w:r>
           </w:p>
         </w:tc>
@@ -5504,108 +5678,153 @@
           </w:p>
         </w:tc>
       </w:tr>
+    </w:tbl>
+    <w:p>
+      <w:pPr>
+        <w:pBdr>
+          <w:left w:val="single" w:color="2E7D8C" w:sz="24" w:space="8"/>
+        </w:pBdr>
+        <w:shd w:fill="EAF2F5" w:color="auto" w:val="clear"/>
+        <w:spacing w:after="120" w:before="160"/>
+        <w:ind w:left="120"/>
+      </w:pPr>
+      <w:r>
+        <w:rPr>
+          <w:rFonts w:ascii="Calibri" w:cs="Calibri" w:eastAsia="Calibri" w:hAnsi="Calibri"/>
+          <w:b/>
+          <w:bCs/>
+          <w:sz w:val="20"/>
+          <w:szCs w:val="20"/>
+        </w:rPr>
+        <w:t xml:space="preserve">Dependencia: </w:t>
+      </w:r>
+      <w:r>
+        <w:rPr>
+          <w:rFonts w:ascii="Calibri" w:cs="Calibri" w:eastAsia="Calibri" w:hAnsi="Calibri"/>
+          <w:sz w:val="20"/>
+          <w:szCs w:val="20"/>
+        </w:rPr>
+        <w:t xml:space="preserve">una línea cargada y activa es la condición para operar. Recién con la línea dada de alta se pueden cargar operaciones desde la pantalla de líneas, y esas operaciones se validan contra ella.</w:t>
+      </w:r>
+    </w:p>
+    <w:p>
+      <w:pPr>
+        <w:spacing w:after="80" w:before="180"/>
+      </w:pPr>
+      <w:r>
+        <w:rPr>
+          <w:rFonts w:ascii="Calibri" w:cs="Calibri" w:eastAsia="Calibri" w:hAnsi="Calibri"/>
+          <w:b/>
+          <w:bCs/>
+          <w:color w:val="1F3A5F"/>
+          <w:sz w:val="24"/>
+          <w:szCs w:val="24"/>
+        </w:rPr>
+        <w:t xml:space="preserve">Módulos que se apoyan en la línea activa</w:t>
+      </w:r>
+    </w:p>
+    <w:tbl>
+      <w:tblPr>
+        <w:tblW w:type="dxa" w:w="14400"/>
+        <w:tblBorders>
+          <w:top w:val="single" w:color="auto" w:sz="4"/>
+          <w:left w:val="single" w:color="auto" w:sz="4"/>
+          <w:bottom w:val="single" w:color="auto" w:sz="4"/>
+          <w:right w:val="single" w:color="auto" w:sz="4"/>
+          <w:insideH w:val="single" w:color="auto" w:sz="4"/>
+          <w:insideV w:val="single" w:color="auto" w:sz="4"/>
+        </w:tblBorders>
+      </w:tblPr>
+      <w:tblGrid>
+        <w:gridCol w:w="600"/>
+        <w:gridCol w:w="3500"/>
+        <w:gridCol w:w="10300"/>
+      </w:tblGrid>
       <w:tr>
+        <w:trPr>
+          <w:tblHeader/>
+        </w:trPr>
         <w:tc>
           <w:tcPr>
             <w:tcW w:type="dxa" w:w="600"/>
-            <w:tcMar>
-              <w:top w:type="dxa" w:w="80"/>
-              <w:left w:type="dxa" w:w="120"/>
-              <w:bottom w:type="dxa" w:w="80"/>
-              <w:right w:type="dxa" w:w="120"/>
-            </w:tcMar>
-          </w:tcPr>
-          <w:p>
-            <w:pPr>
-              <w:spacing w:after="40"/>
-            </w:pPr>
-            <w:r>
-              <w:rPr>
-                <w:rFonts w:ascii="Calibri" w:cs="Calibri" w:eastAsia="Calibri" w:hAnsi="Calibri"/>
-                <w:b/>
-                <w:bCs/>
-                <w:sz w:val="20"/>
-                <w:szCs w:val="20"/>
-              </w:rPr>
-              <w:t xml:space="preserve">E</w:t>
+            <w:shd w:fill="2E7D8C" w:color="auto" w:val="clear"/>
+            <w:tcMar>
+              <w:top w:type="dxa" w:w="80"/>
+              <w:left w:type="dxa" w:w="120"/>
+              <w:bottom w:type="dxa" w:w="80"/>
+              <w:right w:type="dxa" w:w="120"/>
+            </w:tcMar>
+          </w:tcPr>
+          <w:p>
+            <w:pPr>
+              <w:spacing w:after="40"/>
+            </w:pPr>
+            <w:r>
+              <w:rPr>
+                <w:rFonts w:ascii="Calibri" w:cs="Calibri" w:eastAsia="Calibri" w:hAnsi="Calibri"/>
+                <w:b/>
+                <w:bCs/>
+                <w:color w:val="FFFFFF"/>
+                <w:sz w:val="20"/>
+                <w:szCs w:val="20"/>
+              </w:rPr>
+              <w:t xml:space="preserve">#</w:t>
             </w:r>
           </w:p>
         </w:tc>
         <w:tc>
           <w:tcPr>
             <w:tcW w:type="dxa" w:w="3500"/>
-            <w:tcMar>
-              <w:top w:type="dxa" w:w="80"/>
-              <w:left w:type="dxa" w:w="120"/>
-              <w:bottom w:type="dxa" w:w="80"/>
-              <w:right w:type="dxa" w:w="120"/>
-            </w:tcMar>
-          </w:tcPr>
-          <w:p>
-            <w:pPr>
-              <w:spacing w:after="40"/>
-            </w:pPr>
-            <w:r>
-              <w:rPr>
-                <w:rFonts w:ascii="Calibri" w:cs="Calibri" w:eastAsia="Calibri" w:hAnsi="Calibri"/>
-                <w:b w:val="false"/>
-                <w:bCs w:val="false"/>
-                <w:sz w:val="20"/>
-                <w:szCs w:val="20"/>
-              </w:rPr>
-              <w:t xml:space="preserve">Operaciones de descubierto</w:t>
-            </w:r>
-          </w:p>
-        </w:tc>
-        <w:tc>
-          <w:tcPr>
-            <w:tcW w:type="dxa" w:w="7700"/>
-            <w:tcMar>
-              <w:top w:type="dxa" w:w="80"/>
-              <w:left w:type="dxa" w:w="120"/>
-              <w:bottom w:type="dxa" w:w="80"/>
-              <w:right w:type="dxa" w:w="120"/>
-            </w:tcMar>
-          </w:tcPr>
-          <w:p>
-            <w:pPr>
-              <w:spacing w:after="40"/>
-            </w:pPr>
-            <w:r>
-              <w:rPr>
-                <w:rFonts w:ascii="Calibri" w:cs="Calibri" w:eastAsia="Calibri" w:hAnsi="Calibri"/>
-                <w:b w:val="false"/>
-                <w:bCs w:val="false"/>
-                <w:sz w:val="20"/>
-                <w:szCs w:val="20"/>
-              </w:rPr>
-              <w:t xml:space="preserve">Carga guiada, valores por defecto, tasa mínima, fraccionamiento, full numerales y garantías</w:t>
-            </w:r>
-          </w:p>
-        </w:tc>
-        <w:tc>
-          <w:tcPr>
-            <w:tcW w:type="dxa" w:w="2600"/>
-            <w:tcMar>
-              <w:top w:type="dxa" w:w="80"/>
-              <w:left w:type="dxa" w:w="120"/>
-              <w:bottom w:type="dxa" w:w="80"/>
-              <w:right w:type="dxa" w:w="120"/>
-            </w:tcMar>
-          </w:tcPr>
-          <w:p>
-            <w:pPr>
-              <w:spacing w:after="40"/>
-            </w:pPr>
-            <w:r>
-              <w:rPr>
-                <w:rFonts w:ascii="Calibri" w:cs="Calibri" w:eastAsia="Calibri" w:hAnsi="Calibri"/>
-                <w:b w:val="false"/>
-                <w:bCs w:val="false"/>
-                <w:sz w:val="20"/>
-                <w:szCs w:val="20"/>
-              </w:rPr>
-              <w:t xml:space="preserve">Relevamiento 07/10</w:t>
+            <w:shd w:fill="2E7D8C" w:color="auto" w:val="clear"/>
+            <w:tcMar>
+              <w:top w:type="dxa" w:w="80"/>
+              <w:left w:type="dxa" w:w="120"/>
+              <w:bottom w:type="dxa" w:w="80"/>
+              <w:right w:type="dxa" w:w="120"/>
+            </w:tcMar>
+          </w:tcPr>
+          <w:p>
+            <w:pPr>
+              <w:spacing w:after="40"/>
+            </w:pPr>
+            <w:r>
+              <w:rPr>
+                <w:rFonts w:ascii="Calibri" w:cs="Calibri" w:eastAsia="Calibri" w:hAnsi="Calibri"/>
+                <w:b/>
+                <w:bCs/>
+                <w:color w:val="FFFFFF"/>
+                <w:sz w:val="20"/>
+                <w:szCs w:val="20"/>
+              </w:rPr>
+              <w:t xml:space="preserve">Módulo</w:t>
+            </w:r>
+          </w:p>
+        </w:tc>
+        <w:tc>
+          <w:tcPr>
+            <w:tcW w:type="dxa" w:w="10300"/>
+            <w:shd w:fill="2E7D8C" w:color="auto" w:val="clear"/>
+            <w:tcMar>
+              <w:top w:type="dxa" w:w="80"/>
+              <w:left w:type="dxa" w:w="120"/>
+              <w:bottom w:type="dxa" w:w="80"/>
+              <w:right w:type="dxa" w:w="120"/>
+            </w:tcMar>
+          </w:tcPr>
+          <w:p>
+            <w:pPr>
+              <w:spacing w:after="40"/>
+            </w:pPr>
+            <w:r>
+              <w:rPr>
+                <w:rFonts w:ascii="Calibri" w:cs="Calibri" w:eastAsia="Calibri" w:hAnsi="Calibri"/>
+                <w:b/>
+                <w:bCs/>
+                <w:color w:val="FFFFFF"/>
+                <w:sz w:val="20"/>
+                <w:szCs w:val="20"/>
+              </w:rPr>
+              <w:t xml:space="preserve">Qué incluye</w:t>
             </w:r>
           </w:p>
         </w:tc>
@@ -5614,108 +5833,78 @@
         <w:tc>
           <w:tcPr>
             <w:tcW w:type="dxa" w:w="600"/>
-            <w:shd w:fill="EAF2F5" w:color="auto" w:val="clear"/>
-            <w:tcMar>
-              <w:top w:type="dxa" w:w="80"/>
-              <w:left w:type="dxa" w:w="120"/>
-              <w:bottom w:type="dxa" w:w="80"/>
-              <w:right w:type="dxa" w:w="120"/>
-            </w:tcMar>
-          </w:tcPr>
-          <w:p>
-            <w:pPr>
-              <w:spacing w:after="40"/>
-            </w:pPr>
-            <w:r>
-              <w:rPr>
-                <w:rFonts w:ascii="Calibri" w:cs="Calibri" w:eastAsia="Calibri" w:hAnsi="Calibri"/>
-                <w:b/>
-                <w:bCs/>
-                <w:sz w:val="20"/>
-                <w:szCs w:val="20"/>
-              </w:rPr>
-              <w:t xml:space="preserve">F</w:t>
+            <w:tcMar>
+              <w:top w:type="dxa" w:w="80"/>
+              <w:left w:type="dxa" w:w="120"/>
+              <w:bottom w:type="dxa" w:w="80"/>
+              <w:right w:type="dxa" w:w="120"/>
+            </w:tcMar>
+          </w:tcPr>
+          <w:p>
+            <w:pPr>
+              <w:spacing w:after="40"/>
+            </w:pPr>
+            <w:r>
+              <w:rPr>
+                <w:rFonts w:ascii="Calibri" w:cs="Calibri" w:eastAsia="Calibri" w:hAnsi="Calibri"/>
+                <w:b/>
+                <w:bCs/>
+                <w:sz w:val="20"/>
+                <w:szCs w:val="20"/>
+              </w:rPr>
+              <w:t xml:space="preserve">E</w:t>
             </w:r>
           </w:p>
         </w:tc>
         <w:tc>
           <w:tcPr>
             <w:tcW w:type="dxa" w:w="3500"/>
-            <w:shd w:fill="EAF2F5" w:color="auto" w:val="clear"/>
-            <w:tcMar>
-              <w:top w:type="dxa" w:w="80"/>
-              <w:left w:type="dxa" w:w="120"/>
-              <w:bottom w:type="dxa" w:w="80"/>
-              <w:right w:type="dxa" w:w="120"/>
-            </w:tcMar>
-          </w:tcPr>
-          <w:p>
-            <w:pPr>
-              <w:spacing w:after="40"/>
-            </w:pPr>
-            <w:r>
-              <w:rPr>
-                <w:rFonts w:ascii="Calibri" w:cs="Calibri" w:eastAsia="Calibri" w:hAnsi="Calibri"/>
-                <w:b w:val="false"/>
-                <w:bCs w:val="false"/>
-                <w:sz w:val="20"/>
-                <w:szCs w:val="20"/>
-              </w:rPr>
-              <w:t xml:space="preserve">Renovaciones</w:t>
-            </w:r>
-          </w:p>
-        </w:tc>
-        <w:tc>
-          <w:tcPr>
-            <w:tcW w:type="dxa" w:w="7700"/>
-            <w:shd w:fill="EAF2F5" w:color="auto" w:val="clear"/>
-            <w:tcMar>
-              <w:top w:type="dxa" w:w="80"/>
-              <w:left w:type="dxa" w:w="120"/>
-              <w:bottom w:type="dxa" w:w="80"/>
-              <w:right w:type="dxa" w:w="120"/>
-            </w:tcMar>
-          </w:tcPr>
-          <w:p>
-            <w:pPr>
-              <w:spacing w:after="40"/>
-            </w:pPr>
-            <w:r>
-              <w:rPr>
-                <w:rFonts w:ascii="Calibri" w:cs="Calibri" w:eastAsia="Calibri" w:hAnsi="Calibri"/>
-                <w:b w:val="false"/>
-                <w:bCs w:val="false"/>
-                <w:sz w:val="20"/>
-                <w:szCs w:val="20"/>
-              </w:rPr>
-              <w:t xml:space="preserve">Renovación con operación vigente vs. operación nueva</w:t>
-            </w:r>
-          </w:p>
-        </w:tc>
-        <w:tc>
-          <w:tcPr>
-            <w:tcW w:type="dxa" w:w="2600"/>
-            <w:shd w:fill="EAF2F5" w:color="auto" w:val="clear"/>
-            <w:tcMar>
-              <w:top w:type="dxa" w:w="80"/>
-              <w:left w:type="dxa" w:w="120"/>
-              <w:bottom w:type="dxa" w:w="80"/>
-              <w:right w:type="dxa" w:w="120"/>
-            </w:tcMar>
-          </w:tcPr>
-          <w:p>
-            <w:pPr>
-              <w:spacing w:after="40"/>
-            </w:pPr>
-            <w:r>
-              <w:rPr>
-                <w:rFonts w:ascii="Calibri" w:cs="Calibri" w:eastAsia="Calibri" w:hAnsi="Calibri"/>
-                <w:b w:val="false"/>
-                <w:bCs w:val="false"/>
-                <w:sz w:val="20"/>
-                <w:szCs w:val="20"/>
-              </w:rPr>
-              <w:t xml:space="preserve">Relevamiento 07/10</w:t>
+            <w:tcMar>
+              <w:top w:type="dxa" w:w="80"/>
+              <w:left w:type="dxa" w:w="120"/>
+              <w:bottom w:type="dxa" w:w="80"/>
+              <w:right w:type="dxa" w:w="120"/>
+            </w:tcMar>
+          </w:tcPr>
+          <w:p>
+            <w:pPr>
+              <w:spacing w:after="40"/>
+            </w:pPr>
+            <w:r>
+              <w:rPr>
+                <w:rFonts w:ascii="Calibri" w:cs="Calibri" w:eastAsia="Calibri" w:hAnsi="Calibri"/>
+                <w:b w:val="false"/>
+                <w:bCs w:val="false"/>
+                <w:sz w:val="20"/>
+                <w:szCs w:val="20"/>
+              </w:rPr>
+              <w:t xml:space="preserve">Operaciones de descubierto</w:t>
+            </w:r>
+          </w:p>
+        </w:tc>
+        <w:tc>
+          <w:tcPr>
+            <w:tcW w:type="dxa" w:w="10300"/>
+            <w:tcMar>
+              <w:top w:type="dxa" w:w="80"/>
+              <w:left w:type="dxa" w:w="120"/>
+              <w:bottom w:type="dxa" w:w="80"/>
+              <w:right w:type="dxa" w:w="120"/>
+            </w:tcMar>
+          </w:tcPr>
+          <w:p>
+            <w:pPr>
+              <w:spacing w:after="40"/>
+            </w:pPr>
+            <w:r>
+              <w:rPr>
+                <w:rFonts w:ascii="Calibri" w:cs="Calibri" w:eastAsia="Calibri" w:hAnsi="Calibri"/>
+                <w:b w:val="false"/>
+                <w:bCs w:val="false"/>
+                <w:sz w:val="20"/>
+                <w:szCs w:val="20"/>
+              </w:rPr>
+              <w:t xml:space="preserve">Carga guiada, valores por defecto, tasa mínima, fraccionamiento, full numerales y garantías</w:t>
             </w:r>
           </w:p>
         </w:tc>
@@ -5724,104 +5913,81 @@
         <w:tc>
           <w:tcPr>
             <w:tcW w:type="dxa" w:w="600"/>
-            <w:tcMar>
-              <w:top w:type="dxa" w:w="80"/>
-              <w:left w:type="dxa" w:w="120"/>
-              <w:bottom w:type="dxa" w:w="80"/>
-              <w:right w:type="dxa" w:w="120"/>
-            </w:tcMar>
-          </w:tcPr>
-          <w:p>
-            <w:pPr>
-              <w:spacing w:after="40"/>
-            </w:pPr>
-            <w:r>
-              <w:rPr>
-                <w:rFonts w:ascii="Calibri" w:cs="Calibri" w:eastAsia="Calibri" w:hAnsi="Calibri"/>
-                <w:b/>
-                <w:bCs/>
-                <w:sz w:val="20"/>
-                <w:szCs w:val="20"/>
-              </w:rPr>
-              <w:t xml:space="preserve">G</w:t>
+            <w:shd w:fill="EAF2F5" w:color="auto" w:val="clear"/>
+            <w:tcMar>
+              <w:top w:type="dxa" w:w="80"/>
+              <w:left w:type="dxa" w:w="120"/>
+              <w:bottom w:type="dxa" w:w="80"/>
+              <w:right w:type="dxa" w:w="120"/>
+            </w:tcMar>
+          </w:tcPr>
+          <w:p>
+            <w:pPr>
+              <w:spacing w:after="40"/>
+            </w:pPr>
+            <w:r>
+              <w:rPr>
+                <w:rFonts w:ascii="Calibri" w:cs="Calibri" w:eastAsia="Calibri" w:hAnsi="Calibri"/>
+                <w:b/>
+                <w:bCs/>
+                <w:sz w:val="20"/>
+                <w:szCs w:val="20"/>
+              </w:rPr>
+              <w:t xml:space="preserve">F</w:t>
             </w:r>
           </w:p>
         </w:tc>
         <w:tc>
           <w:tcPr>
             <w:tcW w:type="dxa" w:w="3500"/>
-            <w:tcMar>
-              <w:top w:type="dxa" w:w="80"/>
-              <w:left w:type="dxa" w:w="120"/>
-              <w:bottom w:type="dxa" w:w="80"/>
-              <w:right w:type="dxa" w:w="120"/>
-            </w:tcMar>
-          </w:tcPr>
-          <w:p>
-            <w:pPr>
-              <w:spacing w:after="40"/>
-            </w:pPr>
-            <w:r>
-              <w:rPr>
-                <w:rFonts w:ascii="Calibri" w:cs="Calibri" w:eastAsia="Calibri" w:hAnsi="Calibri"/>
-                <w:b w:val="false"/>
-                <w:bCs w:val="false"/>
-                <w:sz w:val="20"/>
-                <w:szCs w:val="20"/>
-              </w:rPr>
-              <w:t xml:space="preserve">Pantalla de seguimiento</w:t>
-            </w:r>
-          </w:p>
-        </w:tc>
-        <w:tc>
-          <w:tcPr>
-            <w:tcW w:type="dxa" w:w="7700"/>
-            <w:tcMar>
-              <w:top w:type="dxa" w:w="80"/>
-              <w:left w:type="dxa" w:w="120"/>
-              <w:bottom w:type="dxa" w:w="80"/>
-              <w:right w:type="dxa" w:w="120"/>
-            </w:tcMar>
-          </w:tcPr>
-          <w:p>
-            <w:pPr>
-              <w:spacing w:after="40"/>
-            </w:pPr>
-            <w:r>
-              <w:rPr>
-                <w:rFonts w:ascii="Calibri" w:cs="Calibri" w:eastAsia="Calibri" w:hAnsi="Calibri"/>
-                <w:b w:val="false"/>
-                <w:bCs w:val="false"/>
-                <w:sz w:val="20"/>
-                <w:szCs w:val="20"/>
-              </w:rPr>
-              <w:t xml:space="preserve">Acuerdos ruteados por día y estado, filtro por cliente, exportación</w:t>
-            </w:r>
-          </w:p>
-        </w:tc>
-        <w:tc>
-          <w:tcPr>
-            <w:tcW w:type="dxa" w:w="2600"/>
-            <w:tcMar>
-              <w:top w:type="dxa" w:w="80"/>
-              <w:left w:type="dxa" w:w="120"/>
-              <w:bottom w:type="dxa" w:w="80"/>
-              <w:right w:type="dxa" w:w="120"/>
-            </w:tcMar>
-          </w:tcPr>
-          <w:p>
-            <w:pPr>
-              <w:spacing w:after="40"/>
-            </w:pPr>
-            <w:r>
-              <w:rPr>
-                <w:rFonts w:ascii="Calibri" w:cs="Calibri" w:eastAsia="Calibri" w:hAnsi="Calibri"/>
-                <w:b w:val="false"/>
-                <w:bCs w:val="false"/>
-                <w:sz w:val="20"/>
-                <w:szCs w:val="20"/>
-              </w:rPr>
-              <w:t xml:space="preserve">Relevamiento 07/10</w:t>
+            <w:shd w:fill="EAF2F5" w:color="auto" w:val="clear"/>
+            <w:tcMar>
+              <w:top w:type="dxa" w:w="80"/>
+              <w:left w:type="dxa" w:w="120"/>
+              <w:bottom w:type="dxa" w:w="80"/>
+              <w:right w:type="dxa" w:w="120"/>
+            </w:tcMar>
+          </w:tcPr>
+          <w:p>
+            <w:pPr>
+              <w:spacing w:after="40"/>
+            </w:pPr>
+            <w:r>
+              <w:rPr>
+                <w:rFonts w:ascii="Calibri" w:cs="Calibri" w:eastAsia="Calibri" w:hAnsi="Calibri"/>
+                <w:b w:val="false"/>
+                <w:bCs w:val="false"/>
+                <w:sz w:val="20"/>
+                <w:szCs w:val="20"/>
+              </w:rPr>
+              <w:t xml:space="preserve">Renovaciones</w:t>
+            </w:r>
+          </w:p>
+        </w:tc>
+        <w:tc>
+          <w:tcPr>
+            <w:tcW w:type="dxa" w:w="10300"/>
+            <w:shd w:fill="EAF2F5" w:color="auto" w:val="clear"/>
+            <w:tcMar>
+              <w:top w:type="dxa" w:w="80"/>
+              <w:left w:type="dxa" w:w="120"/>
+              <w:bottom w:type="dxa" w:w="80"/>
+              <w:right w:type="dxa" w:w="120"/>
+            </w:tcMar>
+          </w:tcPr>
+          <w:p>
+            <w:pPr>
+              <w:spacing w:after="40"/>
+            </w:pPr>
+            <w:r>
+              <w:rPr>
+                <w:rFonts w:ascii="Calibri" w:cs="Calibri" w:eastAsia="Calibri" w:hAnsi="Calibri"/>
+                <w:b w:val="false"/>
+                <w:bCs w:val="false"/>
+                <w:sz w:val="20"/>
+                <w:szCs w:val="20"/>
+              </w:rPr>
+              <w:t xml:space="preserve">Renovación total o con cambio de importe, y operación nueva</w:t>
             </w:r>
           </w:p>
         </w:tc>
@@ -5830,108 +5996,78 @@
         <w:tc>
           <w:tcPr>
             <w:tcW w:type="dxa" w:w="600"/>
-            <w:shd w:fill="EAF2F5" w:color="auto" w:val="clear"/>
-            <w:tcMar>
-              <w:top w:type="dxa" w:w="80"/>
-              <w:left w:type="dxa" w:w="120"/>
-              <w:bottom w:type="dxa" w:w="80"/>
-              <w:right w:type="dxa" w:w="120"/>
-            </w:tcMar>
-          </w:tcPr>
-          <w:p>
-            <w:pPr>
-              <w:spacing w:after="40"/>
-            </w:pPr>
-            <w:r>
-              <w:rPr>
-                <w:rFonts w:ascii="Calibri" w:cs="Calibri" w:eastAsia="Calibri" w:hAnsi="Calibri"/>
-                <w:b/>
-                <w:bCs/>
-                <w:sz w:val="20"/>
-                <w:szCs w:val="20"/>
-              </w:rPr>
-              <w:t xml:space="preserve">H</w:t>
+            <w:tcMar>
+              <w:top w:type="dxa" w:w="80"/>
+              <w:left w:type="dxa" w:w="120"/>
+              <w:bottom w:type="dxa" w:w="80"/>
+              <w:right w:type="dxa" w:w="120"/>
+            </w:tcMar>
+          </w:tcPr>
+          <w:p>
+            <w:pPr>
+              <w:spacing w:after="40"/>
+            </w:pPr>
+            <w:r>
+              <w:rPr>
+                <w:rFonts w:ascii="Calibri" w:cs="Calibri" w:eastAsia="Calibri" w:hAnsi="Calibri"/>
+                <w:b/>
+                <w:bCs/>
+                <w:sz w:val="20"/>
+                <w:szCs w:val="20"/>
+              </w:rPr>
+              <w:t xml:space="preserve">G</w:t>
             </w:r>
           </w:p>
         </w:tc>
         <w:tc>
           <w:tcPr>
             <w:tcW w:type="dxa" w:w="3500"/>
-            <w:shd w:fill="EAF2F5" w:color="auto" w:val="clear"/>
-            <w:tcMar>
-              <w:top w:type="dxa" w:w="80"/>
-              <w:left w:type="dxa" w:w="120"/>
-              <w:bottom w:type="dxa" w:w="80"/>
-              <w:right w:type="dxa" w:w="120"/>
-            </w:tcMar>
-          </w:tcPr>
-          <w:p>
-            <w:pPr>
-              <w:spacing w:after="40"/>
-            </w:pPr>
-            <w:r>
-              <w:rPr>
-                <w:rFonts w:ascii="Calibri" w:cs="Calibri" w:eastAsia="Calibri" w:hAnsi="Calibri"/>
-                <w:b w:val="false"/>
-                <w:bCs w:val="false"/>
-                <w:sz w:val="20"/>
-                <w:szCs w:val="20"/>
-              </w:rPr>
-              <w:t xml:space="preserve">Costo de dinero</w:t>
-            </w:r>
-          </w:p>
-        </w:tc>
-        <w:tc>
-          <w:tcPr>
-            <w:tcW w:type="dxa" w:w="7700"/>
-            <w:shd w:fill="EAF2F5" w:color="auto" w:val="clear"/>
-            <w:tcMar>
-              <w:top w:type="dxa" w:w="80"/>
-              <w:left w:type="dxa" w:w="120"/>
-              <w:bottom w:type="dxa" w:w="80"/>
-              <w:right w:type="dxa" w:w="120"/>
-            </w:tcMar>
-          </w:tcPr>
-          <w:p>
-            <w:pPr>
-              <w:spacing w:after="40"/>
-            </w:pPr>
-            <w:r>
-              <w:rPr>
-                <w:rFonts w:ascii="Calibri" w:cs="Calibri" w:eastAsia="Calibri" w:hAnsi="Calibri"/>
-                <w:b w:val="false"/>
-                <w:bCs w:val="false"/>
-                <w:sz w:val="20"/>
-                <w:szCs w:val="20"/>
-              </w:rPr>
-              <w:t xml:space="preserve">Mesa carga y actualiza las tasas mínimas</w:t>
-            </w:r>
-          </w:p>
-        </w:tc>
-        <w:tc>
-          <w:tcPr>
-            <w:tcW w:type="dxa" w:w="2600"/>
-            <w:shd w:fill="EAF2F5" w:color="auto" w:val="clear"/>
-            <w:tcMar>
-              <w:top w:type="dxa" w:w="80"/>
-              <w:left w:type="dxa" w:w="120"/>
-              <w:bottom w:type="dxa" w:w="80"/>
-              <w:right w:type="dxa" w:w="120"/>
-            </w:tcMar>
-          </w:tcPr>
-          <w:p>
-            <w:pPr>
-              <w:spacing w:after="40"/>
-            </w:pPr>
-            <w:r>
-              <w:rPr>
-                <w:rFonts w:ascii="Calibri" w:cs="Calibri" w:eastAsia="Calibri" w:hAnsi="Calibri"/>
-                <w:b w:val="false"/>
-                <w:bCs w:val="false"/>
-                <w:sz w:val="20"/>
-                <w:szCs w:val="20"/>
-              </w:rPr>
-              <w:t xml:space="preserve">Relevamiento 07/10</w:t>
+            <w:tcMar>
+              <w:top w:type="dxa" w:w="80"/>
+              <w:left w:type="dxa" w:w="120"/>
+              <w:bottom w:type="dxa" w:w="80"/>
+              <w:right w:type="dxa" w:w="120"/>
+            </w:tcMar>
+          </w:tcPr>
+          <w:p>
+            <w:pPr>
+              <w:spacing w:after="40"/>
+            </w:pPr>
+            <w:r>
+              <w:rPr>
+                <w:rFonts w:ascii="Calibri" w:cs="Calibri" w:eastAsia="Calibri" w:hAnsi="Calibri"/>
+                <w:b w:val="false"/>
+                <w:bCs w:val="false"/>
+                <w:sz w:val="20"/>
+                <w:szCs w:val="20"/>
+              </w:rPr>
+              <w:t xml:space="preserve">Pantalla de seguimiento</w:t>
+            </w:r>
+          </w:p>
+        </w:tc>
+        <w:tc>
+          <w:tcPr>
+            <w:tcW w:type="dxa" w:w="10300"/>
+            <w:tcMar>
+              <w:top w:type="dxa" w:w="80"/>
+              <w:left w:type="dxa" w:w="120"/>
+              <w:bottom w:type="dxa" w:w="80"/>
+              <w:right w:type="dxa" w:w="120"/>
+            </w:tcMar>
+          </w:tcPr>
+          <w:p>
+            <w:pPr>
+              <w:spacing w:after="40"/>
+            </w:pPr>
+            <w:r>
+              <w:rPr>
+                <w:rFonts w:ascii="Calibri" w:cs="Calibri" w:eastAsia="Calibri" w:hAnsi="Calibri"/>
+                <w:b w:val="false"/>
+                <w:bCs w:val="false"/>
+                <w:sz w:val="20"/>
+                <w:szCs w:val="20"/>
+              </w:rPr>
+              <w:t xml:space="preserve">Acuerdos ruteados por día y estado, filtro por cliente, exportación</w:t>
             </w:r>
           </w:p>
         </w:tc>
@@ -5940,104 +6076,81 @@
         <w:tc>
           <w:tcPr>
             <w:tcW w:type="dxa" w:w="600"/>
-            <w:tcMar>
-              <w:top w:type="dxa" w:w="80"/>
-              <w:left w:type="dxa" w:w="120"/>
-              <w:bottom w:type="dxa" w:w="80"/>
-              <w:right w:type="dxa" w:w="120"/>
-            </w:tcMar>
-          </w:tcPr>
-          <w:p>
-            <w:pPr>
-              <w:spacing w:after="40"/>
-            </w:pPr>
-            <w:r>
-              <w:rPr>
-                <w:rFonts w:ascii="Calibri" w:cs="Calibri" w:eastAsia="Calibri" w:hAnsi="Calibri"/>
-                <w:b/>
-                <w:bCs/>
-                <w:sz w:val="20"/>
-                <w:szCs w:val="20"/>
-              </w:rPr>
-              <w:t xml:space="preserve">I</w:t>
+            <w:shd w:fill="EAF2F5" w:color="auto" w:val="clear"/>
+            <w:tcMar>
+              <w:top w:type="dxa" w:w="80"/>
+              <w:left w:type="dxa" w:w="120"/>
+              <w:bottom w:type="dxa" w:w="80"/>
+              <w:right w:type="dxa" w:w="120"/>
+            </w:tcMar>
+          </w:tcPr>
+          <w:p>
+            <w:pPr>
+              <w:spacing w:after="40"/>
+            </w:pPr>
+            <w:r>
+              <w:rPr>
+                <w:rFonts w:ascii="Calibri" w:cs="Calibri" w:eastAsia="Calibri" w:hAnsi="Calibri"/>
+                <w:b/>
+                <w:bCs/>
+                <w:sz w:val="20"/>
+                <w:szCs w:val="20"/>
+              </w:rPr>
+              <w:t xml:space="preserve">H</w:t>
             </w:r>
           </w:p>
         </w:tc>
         <w:tc>
           <w:tcPr>
             <w:tcW w:type="dxa" w:w="3500"/>
-            <w:tcMar>
-              <w:top w:type="dxa" w:w="80"/>
-              <w:left w:type="dxa" w:w="120"/>
-              <w:bottom w:type="dxa" w:w="80"/>
-              <w:right w:type="dxa" w:w="120"/>
-            </w:tcMar>
-          </w:tcPr>
-          <w:p>
-            <w:pPr>
-              <w:spacing w:after="40"/>
-            </w:pPr>
-            <w:r>
-              <w:rPr>
-                <w:rFonts w:ascii="Calibri" w:cs="Calibri" w:eastAsia="Calibri" w:hAnsi="Calibri"/>
-                <w:b w:val="false"/>
-                <w:bCs w:val="false"/>
-                <w:sz w:val="20"/>
-                <w:szCs w:val="20"/>
-              </w:rPr>
-              <w:t xml:space="preserve">Cheques</w:t>
-            </w:r>
-          </w:p>
-        </w:tc>
-        <w:tc>
-          <w:tcPr>
-            <w:tcW w:type="dxa" w:w="7700"/>
-            <w:tcMar>
-              <w:top w:type="dxa" w:w="80"/>
-              <w:left w:type="dxa" w:w="120"/>
-              <w:bottom w:type="dxa" w:w="80"/>
-              <w:right w:type="dxa" w:w="120"/>
-            </w:tcMar>
-          </w:tcPr>
-          <w:p>
-            <w:pPr>
-              <w:spacing w:after="40"/>
-            </w:pPr>
-            <w:r>
-              <w:rPr>
-                <w:rFonts w:ascii="Calibri" w:cs="Calibri" w:eastAsia="Calibri" w:hAnsi="Calibri"/>
-                <w:b w:val="false"/>
-                <w:bCs w:val="false"/>
-                <w:sz w:val="20"/>
-                <w:szCs w:val="20"/>
-              </w:rPr>
-              <w:t xml:space="preserve">Endoso, verificación, liquidación, revisión de pendientes y preliquidación</w:t>
-            </w:r>
-          </w:p>
-        </w:tc>
-        <w:tc>
-          <w:tcPr>
-            <w:tcW w:type="dxa" w:w="2600"/>
-            <w:tcMar>
-              <w:top w:type="dxa" w:w="80"/>
-              <w:left w:type="dxa" w:w="120"/>
-              <w:bottom w:type="dxa" w:w="80"/>
-              <w:right w:type="dxa" w:w="120"/>
-            </w:tcMar>
-          </w:tcPr>
-          <w:p>
-            <w:pPr>
-              <w:spacing w:after="40"/>
-            </w:pPr>
-            <w:r>
-              <w:rPr>
-                <w:rFonts w:ascii="Calibri" w:cs="Calibri" w:eastAsia="Calibri" w:hAnsi="Calibri"/>
-                <w:b w:val="false"/>
-                <w:bCs w:val="false"/>
-                <w:sz w:val="20"/>
-                <w:szCs w:val="20"/>
-              </w:rPr>
-              <w:t xml:space="preserve">Relevamiento 07/10</w:t>
+            <w:shd w:fill="EAF2F5" w:color="auto" w:val="clear"/>
+            <w:tcMar>
+              <w:top w:type="dxa" w:w="80"/>
+              <w:left w:type="dxa" w:w="120"/>
+              <w:bottom w:type="dxa" w:w="80"/>
+              <w:right w:type="dxa" w:w="120"/>
+            </w:tcMar>
+          </w:tcPr>
+          <w:p>
+            <w:pPr>
+              <w:spacing w:after="40"/>
+            </w:pPr>
+            <w:r>
+              <w:rPr>
+                <w:rFonts w:ascii="Calibri" w:cs="Calibri" w:eastAsia="Calibri" w:hAnsi="Calibri"/>
+                <w:b w:val="false"/>
+                <w:bCs w:val="false"/>
+                <w:sz w:val="20"/>
+                <w:szCs w:val="20"/>
+              </w:rPr>
+              <w:t xml:space="preserve">Costo de dinero</w:t>
+            </w:r>
+          </w:p>
+        </w:tc>
+        <w:tc>
+          <w:tcPr>
+            <w:tcW w:type="dxa" w:w="10300"/>
+            <w:shd w:fill="EAF2F5" w:color="auto" w:val="clear"/>
+            <w:tcMar>
+              <w:top w:type="dxa" w:w="80"/>
+              <w:left w:type="dxa" w:w="120"/>
+              <w:bottom w:type="dxa" w:w="80"/>
+              <w:right w:type="dxa" w:w="120"/>
+            </w:tcMar>
+          </w:tcPr>
+          <w:p>
+            <w:pPr>
+              <w:spacing w:after="40"/>
+            </w:pPr>
+            <w:r>
+              <w:rPr>
+                <w:rFonts w:ascii="Calibri" w:cs="Calibri" w:eastAsia="Calibri" w:hAnsi="Calibri"/>
+                <w:b w:val="false"/>
+                <w:bCs w:val="false"/>
+                <w:sz w:val="20"/>
+                <w:szCs w:val="20"/>
+              </w:rPr>
+              <w:t xml:space="preserve">Mesa carga y actualiza las tasas mínimas</w:t>
             </w:r>
           </w:p>
         </w:tc>
@@ -6046,6 +6159,86 @@
         <w:tc>
           <w:tcPr>
             <w:tcW w:type="dxa" w:w="600"/>
+            <w:tcMar>
+              <w:top w:type="dxa" w:w="80"/>
+              <w:left w:type="dxa" w:w="120"/>
+              <w:bottom w:type="dxa" w:w="80"/>
+              <w:right w:type="dxa" w:w="120"/>
+            </w:tcMar>
+          </w:tcPr>
+          <w:p>
+            <w:pPr>
+              <w:spacing w:after="40"/>
+            </w:pPr>
+            <w:r>
+              <w:rPr>
+                <w:rFonts w:ascii="Calibri" w:cs="Calibri" w:eastAsia="Calibri" w:hAnsi="Calibri"/>
+                <w:b/>
+                <w:bCs/>
+                <w:sz w:val="20"/>
+                <w:szCs w:val="20"/>
+              </w:rPr>
+              <w:t xml:space="preserve">I</w:t>
+            </w:r>
+          </w:p>
+        </w:tc>
+        <w:tc>
+          <w:tcPr>
+            <w:tcW w:type="dxa" w:w="3500"/>
+            <w:tcMar>
+              <w:top w:type="dxa" w:w="80"/>
+              <w:left w:type="dxa" w:w="120"/>
+              <w:bottom w:type="dxa" w:w="80"/>
+              <w:right w:type="dxa" w:w="120"/>
+            </w:tcMar>
+          </w:tcPr>
+          <w:p>
+            <w:pPr>
+              <w:spacing w:after="40"/>
+            </w:pPr>
+            <w:r>
+              <w:rPr>
+                <w:rFonts w:ascii="Calibri" w:cs="Calibri" w:eastAsia="Calibri" w:hAnsi="Calibri"/>
+                <w:b w:val="false"/>
+                <w:bCs w:val="false"/>
+                <w:sz w:val="20"/>
+                <w:szCs w:val="20"/>
+              </w:rPr>
+              <w:t xml:space="preserve">Cheques</w:t>
+            </w:r>
+          </w:p>
+        </w:tc>
+        <w:tc>
+          <w:tcPr>
+            <w:tcW w:type="dxa" w:w="10300"/>
+            <w:tcMar>
+              <w:top w:type="dxa" w:w="80"/>
+              <w:left w:type="dxa" w:w="120"/>
+              <w:bottom w:type="dxa" w:w="80"/>
+              <w:right w:type="dxa" w:w="120"/>
+            </w:tcMar>
+          </w:tcPr>
+          <w:p>
+            <w:pPr>
+              <w:spacing w:after="40"/>
+            </w:pPr>
+            <w:r>
+              <w:rPr>
+                <w:rFonts w:ascii="Calibri" w:cs="Calibri" w:eastAsia="Calibri" w:hAnsi="Calibri"/>
+                <w:b w:val="false"/>
+                <w:bCs w:val="false"/>
+                <w:sz w:val="20"/>
+                <w:szCs w:val="20"/>
+              </w:rPr>
+              <w:t xml:space="preserve">Endoso, verificación, liquidación, revisión de pendientes y preliquidación</w:t>
+            </w:r>
+          </w:p>
+        </w:tc>
+      </w:tr>
+      <w:tr>
+        <w:tc>
+          <w:tcPr>
+            <w:tcW w:type="dxa" w:w="600"/>
             <w:shd w:fill="EAF2F5" w:color="auto" w:val="clear"/>
             <w:tcMar>
               <w:top w:type="dxa" w:w="80"/>
@@ -6099,7 +6292,7 @@
         </w:tc>
         <w:tc>
           <w:tcPr>
-            <w:tcW w:type="dxa" w:w="7700"/>
+            <w:tcW w:type="dxa" w:w="10300"/>
             <w:shd w:fill="EAF2F5" w:color="auto" w:val="clear"/>
             <w:tcMar>
               <w:top w:type="dxa" w:w="80"/>
@@ -6121,33 +6314,6 @@
                 <w:szCs w:val="20"/>
               </w:rPr>
               <w:t xml:space="preserve">Visor de vencimientos de préstamos y acuerdos con estado de cuota y comprobante</w:t>
-            </w:r>
-          </w:p>
-        </w:tc>
-        <w:tc>
-          <w:tcPr>
-            <w:tcW w:type="dxa" w:w="2600"/>
-            <w:shd w:fill="EAF2F5" w:color="auto" w:val="clear"/>
-            <w:tcMar>
-              <w:top w:type="dxa" w:w="80"/>
-              <w:left w:type="dxa" w:w="120"/>
-              <w:bottom w:type="dxa" w:w="80"/>
-              <w:right w:type="dxa" w:w="120"/>
-            </w:tcMar>
-          </w:tcPr>
-          <w:p>
-            <w:pPr>
-              <w:spacing w:after="40"/>
-            </w:pPr>
-            <w:r>
-              <w:rPr>
-                <w:rFonts w:ascii="Calibri" w:cs="Calibri" w:eastAsia="Calibri" w:hAnsi="Calibri"/>
-                <w:b w:val="false"/>
-                <w:bCs w:val="false"/>
-                <w:sz w:val="20"/>
-                <w:szCs w:val="20"/>
-              </w:rPr>
-              <w:t xml:space="preserve">Relevamiento 07/10</w:t>
             </w:r>
           </w:p>
         </w:tc>

</xml_diff>

<commit_message>
Carga de líneas por Riesgos, garantías por subproducto y pantalla de líneas ampliada
Co-Authored-By: Claude Opus 5.5 <noreply@anthropic.com>
Claude-Session: https://claude.ai/code/session_01JR48ZtjHAJWp3RfTGUyHxs
</commit_message>
<xml_diff>
--- a/Presentacion_Nueva_Aplicacion_Gestion_Middle_Office.docx
+++ b/Presentacion_Nueva_Aplicacion_Gestion_Middle_Office.docx
@@ -1220,7 +1220,7 @@
                 <w:sz w:val="20"/>
                 <w:szCs w:val="20"/>
               </w:rPr>
-              <w:t xml:space="preserve">Módulo C · Pantalla de líneas</w:t>
+              <w:t xml:space="preserve">Módulo C · Línea USD ajustable en pesos</w:t>
             </w:r>
           </w:p>
         </w:tc>
@@ -1328,7 +1328,7 @@
                 <w:sz w:val="20"/>
                 <w:szCs w:val="20"/>
               </w:rPr>
-              <w:t xml:space="preserve">Módulo D · Línea USD ajustable en pesos</w:t>
+              <w:t xml:space="preserve">Módulo D · Pantalla de líneas</w:t>
             </w:r>
           </w:p>
         </w:tc>
@@ -1569,7 +1569,7 @@
           <w:sz w:val="22"/>
           <w:szCs w:val="22"/>
         </w:rPr>
-        <w:t xml:space="preserve">La aprobación y la carga de las líneas de crédito dependen hoy de tareas manuales. La minuta que se presenta en comité se arma a mano y, una vez aprobada, Middle Office vuelve a cargar la línea en COBIS Trámites. Esa carga recorre después cuatro instancias más de verificación y aprobación (Riesgo de Crédito, gerente comercial, gerente de Riesgos y CEO), que confirman una decisión que el comité ya tomó.</w:t>
+        <w:t xml:space="preserve">La aprobación y la carga de las líneas de crédito dependen hoy de tareas manuales. La minuta que se presenta en comité se arma a mano y, una vez aprobada, Riesgo de Crédito vuelve a cargar la línea en COBIS Trámites. Esa carga recorre después cuatro instancias más de control y aprobación (verificación de la carga, gerente comercial, gerente de Riesgos y CEO), que confirman una decisión que el comité ya tomó.</w:t>
       </w:r>
     </w:p>
     <w:p>
@@ -1777,7 +1777,7 @@
           <w:sz w:val="22"/>
           <w:szCs w:val="22"/>
         </w:rPr>
-        <w:t xml:space="preserve">Con la línea activa, desde esa misma pantalla se cargan las operaciones (descubiertos, renovaciones y cheques), que el sistema valida automáticamente contra la línea.</w:t>
+        <w:t xml:space="preserve">Con la línea activa, desde esa misma pantalla se cargan las operaciones (préstamos, descubiertos, renovaciones, prefinanciaciones de exportaciones e importaciones y cheques), que el sistema valida automáticamente contra la línea.</w:t>
       </w:r>
     </w:p>
     <w:p>
@@ -2040,7 +2040,7 @@
                 <w:sz w:val="20"/>
                 <w:szCs w:val="20"/>
               </w:rPr>
-              <w:t xml:space="preserve">La aprobación de la minuta crea o actualiza la línea sin que Middle Office la vuelva a tipear</w:t>
+              <w:t xml:space="preserve">La aprobación de la minuta crea o actualiza la línea sin que haya que volver a tipearla</w:t>
             </w:r>
           </w:p>
         </w:tc>
@@ -2121,7 +2121,7 @@
                 <w:sz w:val="20"/>
                 <w:szCs w:val="20"/>
               </w:rPr>
-              <w:t xml:space="preserve">La línea queda activa al aprobarse la minuta, salvo que espere el OK de garantía</w:t>
+              <w:t xml:space="preserve">La línea queda activa al aprobarse la minuta; solo los subproductos con garantía esperan el OK de Activas</w:t>
             </w:r>
           </w:p>
         </w:tc>
@@ -3060,7 +3060,7 @@
                 <w:sz w:val="18"/>
                 <w:szCs w:val="18"/>
               </w:rPr>
-              <w:t xml:space="preserve">Se arma a mano (hoy la prepara Abril Vázquez)</w:t>
+              <w:t xml:space="preserve">Riesgos la arma a mano (hoy la prepara Abril Vázquez)</w:t>
             </w:r>
           </w:p>
         </w:tc>
@@ -3352,7 +3352,7 @@
                 <w:sz w:val="18"/>
                 <w:szCs w:val="18"/>
               </w:rPr>
-              <w:t xml:space="preserve">La minuta aprobada se envía a Middle Office</w:t>
+              <w:t xml:space="preserve">La minuta aprobada queda en Riesgo de Crédito para su carga</w:t>
             </w:r>
           </w:p>
         </w:tc>
@@ -3428,7 +3428,7 @@
                 <w:sz w:val="20"/>
                 <w:szCs w:val="20"/>
               </w:rPr>
-              <w:t xml:space="preserve">1 · Middle Office</w:t>
+              <w:t xml:space="preserve">1 · Riesgo de Crédito</w:t>
             </w:r>
           </w:p>
           <w:p>
@@ -3502,7 +3502,7 @@
                 <w:sz w:val="20"/>
                 <w:szCs w:val="20"/>
               </w:rPr>
-              <w:t xml:space="preserve">2 · Riesgo de Crédito</w:t>
+              <w:t xml:space="preserve">2 · Control de la carga</w:t>
             </w:r>
           </w:p>
           <w:p>
@@ -3515,7 +3515,7 @@
                 <w:sz w:val="18"/>
                 <w:szCs w:val="18"/>
               </w:rPr>
-              <w:t xml:space="preserve">Verifica que la carga coincida con la línea aprobada</w:t>
+              <w:t xml:space="preserve">Riesgo de Crédito verifica que la carga coincida con la línea aprobada</w:t>
             </w:r>
           </w:p>
         </w:tc>
@@ -4386,7 +4386,7 @@
                 <w:sz w:val="20"/>
                 <w:szCs w:val="20"/>
               </w:rPr>
-              <w:t xml:space="preserve">Líneas frenadas o excepciones informales</w:t>
+              <w:t xml:space="preserve">Líneas completas frenadas por un solo subproducto, o excepciones informales</w:t>
             </w:r>
           </w:p>
         </w:tc>
@@ -4412,7 +4412,7 @@
                 <w:sz w:val="20"/>
                 <w:szCs w:val="20"/>
               </w:rPr>
-              <w:t xml:space="preserve">Módulo B: estado "pendiente de garantía" y forzado por gerente de Riesgos o CEO, con regularización</w:t>
+              <w:t xml:space="preserve">Módulo B: solo quedan pendientes los subproductos con garantía; el resto se activa con la aprobación. Forzado por gerente de Riesgos o CEO, con regularización</w:t>
             </w:r>
           </w:p>
         </w:tc>
@@ -4575,7 +4575,7 @@
                 <w:sz w:val="20"/>
                 <w:szCs w:val="20"/>
               </w:rPr>
-              <w:t xml:space="preserve">Módulo D: actualización automática según el tipo de cambio</w:t>
+              <w:t xml:space="preserve">Módulo C: actualización automática según el tipo de cambio</w:t>
             </w:r>
           </w:p>
         </w:tc>
@@ -4658,7 +4658,7 @@
                 <w:sz w:val="20"/>
                 <w:szCs w:val="20"/>
               </w:rPr>
-              <w:t xml:space="preserve">Módulo C: pantalla de líneas con aprobado, consumido, disponible y estado</w:t>
+              <w:t xml:space="preserve">Módulo D: pantalla de líneas con aprobado, consumido, disponible y estado</w:t>
             </w:r>
           </w:p>
         </w:tc>
@@ -5511,7 +5511,7 @@
                 <w:sz w:val="20"/>
                 <w:szCs w:val="20"/>
               </w:rPr>
-              <w:t xml:space="preserve">Pantalla de líneas</w:t>
+              <w:t xml:space="preserve">Línea en USD ajustable en pesos</w:t>
             </w:r>
           </w:p>
         </w:tc>
@@ -5537,7 +5537,7 @@
                 <w:sz w:val="20"/>
                 <w:szCs w:val="20"/>
               </w:rPr>
-              <w:t xml:space="preserve">Vista de todas las líneas con aprobado, consumido, disponible, estado y vencimientos</w:t>
+              <w:t xml:space="preserve">Actualización de la línea general según el tipo de cambio</w:t>
             </w:r>
           </w:p>
         </w:tc>
@@ -5563,7 +5563,7 @@
                 <w:sz w:val="20"/>
                 <w:szCs w:val="20"/>
               </w:rPr>
-              <w:t xml:space="preserve">Nuevo requerimiento</w:t>
+              <w:t xml:space="preserve">Relevamiento 07/10</w:t>
             </w:r>
           </w:p>
         </w:tc>
@@ -5619,7 +5619,7 @@
                 <w:sz w:val="20"/>
                 <w:szCs w:val="20"/>
               </w:rPr>
-              <w:t xml:space="preserve">Línea en USD ajustable en pesos</w:t>
+              <w:t xml:space="preserve">Pantalla de líneas</w:t>
             </w:r>
           </w:p>
         </w:tc>
@@ -5646,7 +5646,7 @@
                 <w:sz w:val="20"/>
                 <w:szCs w:val="20"/>
               </w:rPr>
-              <w:t xml:space="preserve">Actualización de la línea general según el tipo de cambio</w:t>
+              <w:t xml:space="preserve">Vista de todas las líneas con aprobado, consumido, disponible, estado y vencimientos</w:t>
             </w:r>
           </w:p>
         </w:tc>
@@ -5673,7 +5673,7 @@
                 <w:sz w:val="20"/>
                 <w:szCs w:val="20"/>
               </w:rPr>
-              <w:t xml:space="preserve">Relevamiento 07/10</w:t>
+              <w:t xml:space="preserve">Nuevo requerimiento</w:t>
             </w:r>
           </w:p>
         </w:tc>
@@ -7250,7 +7250,7 @@
                 <w:sz w:val="18"/>
                 <w:szCs w:val="18"/>
               </w:rPr>
-              <w:t xml:space="preserve">La arma Riesgos o el oficial; se puede editar libremente</w:t>
+              <w:t xml:space="preserve">Lo carga Riesgos; se puede editar libremente</w:t>
             </w:r>
           </w:p>
         </w:tc>
@@ -7849,7 +7849,7 @@
                 <w:sz w:val="20"/>
                 <w:szCs w:val="20"/>
               </w:rPr>
-              <w:t xml:space="preserve">Línea creada con el monto, moneda, subproductos y fecha de revisión aprobados; sin carga manual de Middle Office</w:t>
+              <w:t xml:space="preserve">Línea creada con el monto, moneda, subproductos y fecha de revisión aprobados; sin carga manual</w:t>
             </w:r>
           </w:p>
         </w:tc>
@@ -8039,7 +8039,7 @@
                 <w:sz w:val="20"/>
                 <w:szCs w:val="20"/>
               </w:rPr>
-              <w:t xml:space="preserve">La línea tiene garantía asociada</w:t>
+              <w:t xml:space="preserve">Algún subproducto de la línea requiere garantía</w:t>
             </w:r>
           </w:p>
         </w:tc>
@@ -8065,7 +8065,7 @@
                 <w:sz w:val="20"/>
                 <w:szCs w:val="20"/>
               </w:rPr>
-              <w:t xml:space="preserve">La línea queda "pendiente de garantía" hasta el OK; Activas recibe la tarea</w:t>
+              <w:t xml:space="preserve">Solo los subproductos que requieren garantía quedan "pendientes de garantía" hasta que Activas la regularice; el resto se impacta con la aprobación del comité</w:t>
             </w:r>
           </w:p>
         </w:tc>
@@ -8175,7 +8175,7 @@
                 <w:sz w:val="20"/>
                 <w:szCs w:val="20"/>
               </w:rPr>
-              <w:t xml:space="preserve">El gerente de Riesgos o el CEO pueden forzar el alta; queda una tarea de regularización para Activas</w:t>
+              <w:t xml:space="preserve">El gerente de Riesgos o el CEO pueden forzar el alta del subproducto pendiente; queda una tarea de regularización para Activas</w:t>
             </w:r>
           </w:p>
         </w:tc>
@@ -8497,7 +8497,7 @@
                 <w:sz w:val="20"/>
                 <w:szCs w:val="20"/>
               </w:rPr>
-              <w:t xml:space="preserve">Se activa la actualización por tipo de cambio (Módulo D)</w:t>
+              <w:t xml:space="preserve">Se activa la actualización por tipo de cambio (Módulo C)</w:t>
             </w:r>
           </w:p>
         </w:tc>
@@ -8713,7 +8713,7 @@
                 <w:sz w:val="20"/>
                 <w:szCs w:val="20"/>
               </w:rPr>
-              <w:t xml:space="preserve">La línea aparece en la pantalla de líneas (Módulo C) y ya se pueden cargar operaciones</w:t>
+              <w:t xml:space="preserve">La línea aparece en la pantalla de líneas (Módulo D) y ya se pueden cargar operaciones</w:t>
             </w:r>
           </w:p>
         </w:tc>
@@ -9120,7 +9120,7 @@
                 <w:sz w:val="18"/>
                 <w:szCs w:val="18"/>
               </w:rPr>
-              <w:t xml:space="preserve">Carga automática; ajustes del oficial o de Riesgos</w:t>
+              <w:t xml:space="preserve">Carga automática; ajustes de Riesgos si hace falta</w:t>
             </w:r>
           </w:p>
         </w:tc>
@@ -9193,7 +9193,7 @@
                 <w:sz w:val="18"/>
                 <w:szCs w:val="18"/>
               </w:rPr>
-              <w:t xml:space="preserve">¿Requiere garantía? Se espera el OK de Activas</w:t>
+              <w:t xml:space="preserve">Los subproductos con garantía esperan el OK de Activas</w:t>
             </w:r>
           </w:p>
         </w:tc>
@@ -9266,7 +9266,7 @@
                 <w:sz w:val="18"/>
                 <w:szCs w:val="18"/>
               </w:rPr>
-              <w:t xml:space="preserve">Línea activa en COBIS</w:t>
+              <w:t xml:space="preserve">Sin garantía: activos con la aprobación · Con garantía: al regularizarse</w:t>
             </w:r>
           </w:p>
         </w:tc>
@@ -9498,7 +9498,7 @@
                 <w:sz w:val="20"/>
                 <w:szCs w:val="20"/>
               </w:rPr>
-              <w:t xml:space="preserve">Cliente en COBIS MIS, con garantía</w:t>
+              <w:t xml:space="preserve">Cliente en COBIS MIS, con subproductos que requieren garantía</w:t>
             </w:r>
           </w:p>
         </w:tc>
@@ -9525,7 +9525,7 @@
                 <w:sz w:val="20"/>
                 <w:szCs w:val="20"/>
               </w:rPr>
-              <w:t xml:space="preserve">Carga la línea en estado pendiente y espera el OK de Activas; con el OK se da de alta</w:t>
+              <w:t xml:space="preserve">Los subproductos que no requieren garantía se impactan con la aprobación del comité. Solo los que requieren garantía quedan pendientes hasta que Activas la regularice; con el OK se dan de alta</w:t>
             </w:r>
           </w:p>
         </w:tc>
@@ -9606,7 +9606,7 @@
                 <w:sz w:val="20"/>
                 <w:szCs w:val="20"/>
               </w:rPr>
-              <w:t xml:space="preserve">Pantalla para forzar el alta; queda registrada la excepción y la tarea de regularización</w:t>
+              <w:t xml:space="preserve">Pantalla para forzar el alta del subproducto pendiente; queda registrada la excepción y la tarea de regularización</w:t>
             </w:r>
           </w:p>
         </w:tc>
@@ -9837,7 +9837,7 @@
                 <w:sz w:val="20"/>
                 <w:szCs w:val="20"/>
               </w:rPr>
-              <w:t xml:space="preserve">Middle Office tipea la línea a partir de la minuta</w:t>
+              <w:t xml:space="preserve">Riesgo de Crédito tipea la línea a partir de la minuta</w:t>
             </w:r>
           </w:p>
         </w:tc>
@@ -9892,7 +9892,7 @@
                 <w:sz w:val="20"/>
                 <w:szCs w:val="20"/>
               </w:rPr>
-              <w:t xml:space="preserve">Riesgo de Crédito verifica que la carga coincida</w:t>
+              <w:t xml:space="preserve">Se verifica que la carga coincida con lo aprobado</w:t>
             </w:r>
           </w:p>
         </w:tc>
@@ -10029,7 +10029,7 @@
                 <w:sz w:val="20"/>
                 <w:szCs w:val="20"/>
               </w:rPr>
-              <w:t xml:space="preserve">Estado "pendiente de garantía" y forzado con auditoría</w:t>
+              <w:t xml:space="preserve">Solo quedan pendientes los subproductos con garantía; forzado con auditoría</w:t>
             </w:r>
           </w:p>
         </w:tc>
@@ -10062,941 +10062,7 @@
           <w:sz w:val="34"/>
           <w:szCs w:val="34"/>
         </w:rPr>
-        <w:t xml:space="preserve">Módulo C · Pantalla de líneas</w:t>
-      </w:r>
-    </w:p>
-    <w:p>
-      <w:pPr>
-        <w:pBdr>
-          <w:bottom w:val="single" w:color="2E7D8C" w:sz="18" w:space="1"/>
-        </w:pBdr>
-        <w:spacing w:after="220"/>
-      </w:pPr>
-      <w:r>
-        <w:rPr>
-          <w:rFonts w:ascii="Calibri" w:cs="Calibri" w:eastAsia="Calibri" w:hAnsi="Calibri"/>
-          <w:i/>
-          <w:iCs/>
-          <w:color w:val="5F6B76"/>
-          <w:sz w:val="22"/>
-          <w:szCs w:val="22"/>
-        </w:rPr>
-        <w:t xml:space="preserve">Una sola pantalla para revisar todas las líneas y cargar desde ahí todas las operaciones</w:t>
-      </w:r>
-    </w:p>
-    <w:p>
-      <w:pPr>
-        <w:spacing w:after="100" w:before="0"/>
-      </w:pPr>
-      <w:r>
-        <w:rPr>
-          <w:rFonts w:ascii="Calibri" w:cs="Calibri" w:eastAsia="Calibri" w:hAnsi="Calibri"/>
-          <w:b/>
-          <w:bCs/>
-          <w:sz w:val="22"/>
-          <w:szCs w:val="22"/>
-        </w:rPr>
-        <w:t xml:space="preserve">Objetivo. </w:t>
-      </w:r>
-      <w:r>
-        <w:rPr>
-          <w:rFonts w:ascii="Calibri" w:cs="Calibri" w:eastAsia="Calibri" w:hAnsi="Calibri"/>
-          <w:sz w:val="22"/>
-          <w:szCs w:val="22"/>
-        </w:rPr>
-        <w:t xml:space="preserve">Que Middle Office, Riesgos y Comercial tengan en un solo lugar todas las líneas vigentes, con su consumo y su estado, y que todas las operaciones se inicien desde esa pantalla. Así cada operación nace asociada a su línea y los controles se aplican desde el primer momento.</w:t>
-      </w:r>
-    </w:p>
-    <w:p>
-      <w:pPr>
-        <w:spacing w:after="80" w:before="180"/>
-      </w:pPr>
-      <w:r>
-        <w:rPr>
-          <w:rFonts w:ascii="Calibri" w:cs="Calibri" w:eastAsia="Calibri" w:hAnsi="Calibri"/>
-          <w:b/>
-          <w:bCs/>
-          <w:color w:val="1F3A5F"/>
-          <w:sz w:val="24"/>
-          <w:szCs w:val="24"/>
-        </w:rPr>
-        <w:t xml:space="preserve">Qué muestra</w:t>
-      </w:r>
-    </w:p>
-    <w:tbl>
-      <w:tblPr>
-        <w:tblW w:type="dxa" w:w="14400"/>
-        <w:tblBorders>
-          <w:top w:val="single" w:color="auto" w:sz="4"/>
-          <w:left w:val="single" w:color="auto" w:sz="4"/>
-          <w:bottom w:val="single" w:color="auto" w:sz="4"/>
-          <w:right w:val="single" w:color="auto" w:sz="4"/>
-          <w:insideH w:val="single" w:color="auto" w:sz="4"/>
-          <w:insideV w:val="single" w:color="auto" w:sz="4"/>
-        </w:tblBorders>
-      </w:tblPr>
-      <w:tblGrid>
-        <w:gridCol w:w="4200"/>
-        <w:gridCol w:w="10200"/>
-      </w:tblGrid>
-      <w:tr>
-        <w:trPr>
-          <w:tblHeader/>
-        </w:trPr>
-        <w:tc>
-          <w:tcPr>
-            <w:tcW w:type="dxa" w:w="4200"/>
-            <w:shd w:fill="2E7D8C" w:color="auto" w:val="clear"/>
-            <w:tcMar>
-              <w:top w:type="dxa" w:w="80"/>
-              <w:left w:type="dxa" w:w="120"/>
-              <w:bottom w:type="dxa" w:w="80"/>
-              <w:right w:type="dxa" w:w="120"/>
-            </w:tcMar>
-          </w:tcPr>
-          <w:p>
-            <w:pPr>
-              <w:spacing w:after="40"/>
-            </w:pPr>
-            <w:r>
-              <w:rPr>
-                <w:rFonts w:ascii="Calibri" w:cs="Calibri" w:eastAsia="Calibri" w:hAnsi="Calibri"/>
-                <w:b/>
-                <w:bCs/>
-                <w:color w:val="FFFFFF"/>
-                <w:sz w:val="20"/>
-                <w:szCs w:val="20"/>
-              </w:rPr>
-              <w:t xml:space="preserve">Dato</w:t>
-            </w:r>
-          </w:p>
-        </w:tc>
-        <w:tc>
-          <w:tcPr>
-            <w:tcW w:type="dxa" w:w="10200"/>
-            <w:shd w:fill="2E7D8C" w:color="auto" w:val="clear"/>
-            <w:tcMar>
-              <w:top w:type="dxa" w:w="80"/>
-              <w:left w:type="dxa" w:w="120"/>
-              <w:bottom w:type="dxa" w:w="80"/>
-              <w:right w:type="dxa" w:w="120"/>
-            </w:tcMar>
-          </w:tcPr>
-          <w:p>
-            <w:pPr>
-              <w:spacing w:after="40"/>
-            </w:pPr>
-            <w:r>
-              <w:rPr>
-                <w:rFonts w:ascii="Calibri" w:cs="Calibri" w:eastAsia="Calibri" w:hAnsi="Calibri"/>
-                <w:b/>
-                <w:bCs/>
-                <w:color w:val="FFFFFF"/>
-                <w:sz w:val="20"/>
-                <w:szCs w:val="20"/>
-              </w:rPr>
-              <w:t xml:space="preserve">Detalle</w:t>
-            </w:r>
-          </w:p>
-        </w:tc>
-      </w:tr>
-      <w:tr>
-        <w:tc>
-          <w:tcPr>
-            <w:tcW w:type="dxa" w:w="4200"/>
-            <w:tcMar>
-              <w:top w:type="dxa" w:w="80"/>
-              <w:left w:type="dxa" w:w="120"/>
-              <w:bottom w:type="dxa" w:w="80"/>
-              <w:right w:type="dxa" w:w="120"/>
-            </w:tcMar>
-          </w:tcPr>
-          <w:p>
-            <w:pPr>
-              <w:spacing w:after="40"/>
-            </w:pPr>
-            <w:r>
-              <w:rPr>
-                <w:rFonts w:ascii="Calibri" w:cs="Calibri" w:eastAsia="Calibri" w:hAnsi="Calibri"/>
-                <w:b w:val="false"/>
-                <w:bCs w:val="false"/>
-                <w:sz w:val="20"/>
-                <w:szCs w:val="20"/>
-              </w:rPr>
-              <w:t xml:space="preserve">Cliente y grupo económico</w:t>
-            </w:r>
-          </w:p>
-        </w:tc>
-        <w:tc>
-          <w:tcPr>
-            <w:tcW w:type="dxa" w:w="10200"/>
-            <w:tcMar>
-              <w:top w:type="dxa" w:w="80"/>
-              <w:left w:type="dxa" w:w="120"/>
-              <w:bottom w:type="dxa" w:w="80"/>
-              <w:right w:type="dxa" w:w="120"/>
-            </w:tcMar>
-          </w:tcPr>
-          <w:p>
-            <w:pPr>
-              <w:spacing w:after="40"/>
-            </w:pPr>
-            <w:r>
-              <w:rPr>
-                <w:rFonts w:ascii="Calibri" w:cs="Calibri" w:eastAsia="Calibri" w:hAnsi="Calibri"/>
-                <w:b w:val="false"/>
-                <w:bCs w:val="false"/>
-                <w:sz w:val="20"/>
-                <w:szCs w:val="20"/>
-              </w:rPr>
-              <w:t xml:space="preserve">Razón social, CUIT y grupo económico (COBIS MIS)</w:t>
-            </w:r>
-          </w:p>
-        </w:tc>
-      </w:tr>
-      <w:tr>
-        <w:tc>
-          <w:tcPr>
-            <w:tcW w:type="dxa" w:w="4200"/>
-            <w:shd w:fill="EAF2F5" w:color="auto" w:val="clear"/>
-            <w:tcMar>
-              <w:top w:type="dxa" w:w="80"/>
-              <w:left w:type="dxa" w:w="120"/>
-              <w:bottom w:type="dxa" w:w="80"/>
-              <w:right w:type="dxa" w:w="120"/>
-            </w:tcMar>
-          </w:tcPr>
-          <w:p>
-            <w:pPr>
-              <w:spacing w:after="40"/>
-            </w:pPr>
-            <w:r>
-              <w:rPr>
-                <w:rFonts w:ascii="Calibri" w:cs="Calibri" w:eastAsia="Calibri" w:hAnsi="Calibri"/>
-                <w:b w:val="false"/>
-                <w:bCs w:val="false"/>
-                <w:sz w:val="20"/>
-                <w:szCs w:val="20"/>
-              </w:rPr>
-              <w:t xml:space="preserve">Línea</w:t>
-            </w:r>
-          </w:p>
-        </w:tc>
-        <w:tc>
-          <w:tcPr>
-            <w:tcW w:type="dxa" w:w="10200"/>
-            <w:shd w:fill="EAF2F5" w:color="auto" w:val="clear"/>
-            <w:tcMar>
-              <w:top w:type="dxa" w:w="80"/>
-              <w:left w:type="dxa" w:w="120"/>
-              <w:bottom w:type="dxa" w:w="80"/>
-              <w:right w:type="dxa" w:w="120"/>
-            </w:tcMar>
-          </w:tcPr>
-          <w:p>
-            <w:pPr>
-              <w:spacing w:after="40"/>
-            </w:pPr>
-            <w:r>
-              <w:rPr>
-                <w:rFonts w:ascii="Calibri" w:cs="Calibri" w:eastAsia="Calibri" w:hAnsi="Calibri"/>
-                <w:b w:val="false"/>
-                <w:bCs w:val="false"/>
-                <w:sz w:val="20"/>
-                <w:szCs w:val="20"/>
-              </w:rPr>
-              <w:t xml:space="preserve">Producto y subproductos, moneda (incluida USD ajustable en pesos), minuta que la aprobó y fecha de revisión</w:t>
-            </w:r>
-          </w:p>
-        </w:tc>
-      </w:tr>
-      <w:tr>
-        <w:tc>
-          <w:tcPr>
-            <w:tcW w:type="dxa" w:w="4200"/>
-            <w:tcMar>
-              <w:top w:type="dxa" w:w="80"/>
-              <w:left w:type="dxa" w:w="120"/>
-              <w:bottom w:type="dxa" w:w="80"/>
-              <w:right w:type="dxa" w:w="120"/>
-            </w:tcMar>
-          </w:tcPr>
-          <w:p>
-            <w:pPr>
-              <w:spacing w:after="40"/>
-            </w:pPr>
-            <w:r>
-              <w:rPr>
-                <w:rFonts w:ascii="Calibri" w:cs="Calibri" w:eastAsia="Calibri" w:hAnsi="Calibri"/>
-                <w:b w:val="false"/>
-                <w:bCs w:val="false"/>
-                <w:sz w:val="20"/>
-                <w:szCs w:val="20"/>
-              </w:rPr>
-              <w:t xml:space="preserve">Aprobado / consumido / disponible</w:t>
-            </w:r>
-          </w:p>
-        </w:tc>
-        <w:tc>
-          <w:tcPr>
-            <w:tcW w:type="dxa" w:w="10200"/>
-            <w:tcMar>
-              <w:top w:type="dxa" w:w="80"/>
-              <w:left w:type="dxa" w:w="120"/>
-              <w:bottom w:type="dxa" w:w="80"/>
-              <w:right w:type="dxa" w:w="120"/>
-            </w:tcMar>
-          </w:tcPr>
-          <w:p>
-            <w:pPr>
-              <w:spacing w:after="40"/>
-            </w:pPr>
-            <w:r>
-              <w:rPr>
-                <w:rFonts w:ascii="Calibri" w:cs="Calibri" w:eastAsia="Calibri" w:hAnsi="Calibri"/>
-                <w:b w:val="false"/>
-                <w:bCs w:val="false"/>
-                <w:sz w:val="20"/>
-                <w:szCs w:val="20"/>
-              </w:rPr>
-              <w:t xml:space="preserve">Monto de la línea, lo usado por las operaciones vigentes y lo que queda disponible</w:t>
-            </w:r>
-          </w:p>
-        </w:tc>
-      </w:tr>
-      <w:tr>
-        <w:tc>
-          <w:tcPr>
-            <w:tcW w:type="dxa" w:w="4200"/>
-            <w:shd w:fill="EAF2F5" w:color="auto" w:val="clear"/>
-            <w:tcMar>
-              <w:top w:type="dxa" w:w="80"/>
-              <w:left w:type="dxa" w:w="120"/>
-              <w:bottom w:type="dxa" w:w="80"/>
-              <w:right w:type="dxa" w:w="120"/>
-            </w:tcMar>
-          </w:tcPr>
-          <w:p>
-            <w:pPr>
-              <w:spacing w:after="40"/>
-            </w:pPr>
-            <w:r>
-              <w:rPr>
-                <w:rFonts w:ascii="Calibri" w:cs="Calibri" w:eastAsia="Calibri" w:hAnsi="Calibri"/>
-                <w:b w:val="false"/>
-                <w:bCs w:val="false"/>
-                <w:sz w:val="20"/>
-                <w:szCs w:val="20"/>
-              </w:rPr>
-              <w:t xml:space="preserve">Fraccionamiento</w:t>
-            </w:r>
-          </w:p>
-        </w:tc>
-        <w:tc>
-          <w:tcPr>
-            <w:tcW w:type="dxa" w:w="10200"/>
-            <w:shd w:fill="EAF2F5" w:color="auto" w:val="clear"/>
-            <w:tcMar>
-              <w:top w:type="dxa" w:w="80"/>
-              <w:left w:type="dxa" w:w="120"/>
-              <w:bottom w:type="dxa" w:w="80"/>
-              <w:right w:type="dxa" w:w="120"/>
-            </w:tcMar>
-          </w:tcPr>
-          <w:p>
-            <w:pPr>
-              <w:spacing w:after="40"/>
-            </w:pPr>
-            <w:r>
-              <w:rPr>
-                <w:rFonts w:ascii="Calibri" w:cs="Calibri" w:eastAsia="Calibri" w:hAnsi="Calibri"/>
-                <w:b w:val="false"/>
-                <w:bCs w:val="false"/>
-                <w:sz w:val="20"/>
-                <w:szCs w:val="20"/>
-              </w:rPr>
-              <w:t xml:space="preserve">Uso del grupo económico respecto del 15% de la RPC del banco, con alerta al acercarse al límite</w:t>
-            </w:r>
-          </w:p>
-        </w:tc>
-      </w:tr>
-      <w:tr>
-        <w:tc>
-          <w:tcPr>
-            <w:tcW w:type="dxa" w:w="4200"/>
-            <w:tcMar>
-              <w:top w:type="dxa" w:w="80"/>
-              <w:left w:type="dxa" w:w="120"/>
-              <w:bottom w:type="dxa" w:w="80"/>
-              <w:right w:type="dxa" w:w="120"/>
-            </w:tcMar>
-          </w:tcPr>
-          <w:p>
-            <w:pPr>
-              <w:spacing w:after="40"/>
-            </w:pPr>
-            <w:r>
-              <w:rPr>
-                <w:rFonts w:ascii="Calibri" w:cs="Calibri" w:eastAsia="Calibri" w:hAnsi="Calibri"/>
-                <w:b w:val="false"/>
-                <w:bCs w:val="false"/>
-                <w:sz w:val="20"/>
-                <w:szCs w:val="20"/>
-              </w:rPr>
-              <w:t xml:space="preserve">Vencimientos</w:t>
-            </w:r>
-          </w:p>
-        </w:tc>
-        <w:tc>
-          <w:tcPr>
-            <w:tcW w:type="dxa" w:w="10200"/>
-            <w:tcMar>
-              <w:top w:type="dxa" w:w="80"/>
-              <w:left w:type="dxa" w:w="120"/>
-              <w:bottom w:type="dxa" w:w="80"/>
-              <w:right w:type="dxa" w:w="120"/>
-            </w:tcMar>
-          </w:tcPr>
-          <w:p>
-            <w:pPr>
-              <w:spacing w:after="40"/>
-            </w:pPr>
-            <w:r>
-              <w:rPr>
-                <w:rFonts w:ascii="Calibri" w:cs="Calibri" w:eastAsia="Calibri" w:hAnsi="Calibri"/>
-                <w:b w:val="false"/>
-                <w:bCs w:val="false"/>
-                <w:sz w:val="20"/>
-                <w:szCs w:val="20"/>
-              </w:rPr>
-              <w:t xml:space="preserve">Vencimiento de la línea y de las operaciones asociadas</w:t>
-            </w:r>
-          </w:p>
-        </w:tc>
-      </w:tr>
-      <w:tr>
-        <w:tc>
-          <w:tcPr>
-            <w:tcW w:type="dxa" w:w="4200"/>
-            <w:shd w:fill="EAF2F5" w:color="auto" w:val="clear"/>
-            <w:tcMar>
-              <w:top w:type="dxa" w:w="80"/>
-              <w:left w:type="dxa" w:w="120"/>
-              <w:bottom w:type="dxa" w:w="80"/>
-              <w:right w:type="dxa" w:w="120"/>
-            </w:tcMar>
-          </w:tcPr>
-          <w:p>
-            <w:pPr>
-              <w:spacing w:after="40"/>
-            </w:pPr>
-            <w:r>
-              <w:rPr>
-                <w:rFonts w:ascii="Calibri" w:cs="Calibri" w:eastAsia="Calibri" w:hAnsi="Calibri"/>
-                <w:b w:val="false"/>
-                <w:bCs w:val="false"/>
-                <w:sz w:val="20"/>
-                <w:szCs w:val="20"/>
-              </w:rPr>
-              <w:t xml:space="preserve">Estado</w:t>
-            </w:r>
-          </w:p>
-        </w:tc>
-        <w:tc>
-          <w:tcPr>
-            <w:tcW w:type="dxa" w:w="10200"/>
-            <w:shd w:fill="EAF2F5" w:color="auto" w:val="clear"/>
-            <w:tcMar>
-              <w:top w:type="dxa" w:w="80"/>
-              <w:left w:type="dxa" w:w="120"/>
-              <w:bottom w:type="dxa" w:w="80"/>
-              <w:right w:type="dxa" w:w="120"/>
-            </w:tcMar>
-          </w:tcPr>
-          <w:p>
-            <w:pPr>
-              <w:spacing w:after="40"/>
-            </w:pPr>
-            <w:r>
-              <w:rPr>
-                <w:rFonts w:ascii="Calibri" w:cs="Calibri" w:eastAsia="Calibri" w:hAnsi="Calibri"/>
-                <w:b w:val="false"/>
-                <w:bCs w:val="false"/>
-                <w:sz w:val="20"/>
-                <w:szCs w:val="20"/>
-              </w:rPr>
-              <w:t xml:space="preserve">Activa, pendiente de garantía, forzada pendiente de regularizar, vencida o por revisar</w:t>
-            </w:r>
-          </w:p>
-        </w:tc>
-      </w:tr>
-      <w:tr>
-        <w:tc>
-          <w:tcPr>
-            <w:tcW w:type="dxa" w:w="4200"/>
-            <w:tcMar>
-              <w:top w:type="dxa" w:w="80"/>
-              <w:left w:type="dxa" w:w="120"/>
-              <w:bottom w:type="dxa" w:w="80"/>
-              <w:right w:type="dxa" w:w="120"/>
-            </w:tcMar>
-          </w:tcPr>
-          <w:p>
-            <w:pPr>
-              <w:spacing w:after="40"/>
-            </w:pPr>
-            <w:r>
-              <w:rPr>
-                <w:rFonts w:ascii="Calibri" w:cs="Calibri" w:eastAsia="Calibri" w:hAnsi="Calibri"/>
-                <w:b w:val="false"/>
-                <w:bCs w:val="false"/>
-                <w:sz w:val="20"/>
-                <w:szCs w:val="20"/>
-              </w:rPr>
-              <w:t xml:space="preserve">Operaciones vigentes</w:t>
-            </w:r>
-          </w:p>
-        </w:tc>
-        <w:tc>
-          <w:tcPr>
-            <w:tcW w:type="dxa" w:w="10200"/>
-            <w:tcMar>
-              <w:top w:type="dxa" w:w="80"/>
-              <w:left w:type="dxa" w:w="120"/>
-              <w:bottom w:type="dxa" w:w="80"/>
-              <w:right w:type="dxa" w:w="120"/>
-            </w:tcMar>
-          </w:tcPr>
-          <w:p>
-            <w:pPr>
-              <w:spacing w:after="40"/>
-            </w:pPr>
-            <w:r>
-              <w:rPr>
-                <w:rFonts w:ascii="Calibri" w:cs="Calibri" w:eastAsia="Calibri" w:hAnsi="Calibri"/>
-                <w:b w:val="false"/>
-                <w:bCs w:val="false"/>
-                <w:sz w:val="20"/>
-                <w:szCs w:val="20"/>
-              </w:rPr>
-              <w:t xml:space="preserve">Detalle de los acuerdos, descubiertos y cheques que consumen la línea</w:t>
-            </w:r>
-          </w:p>
-        </w:tc>
-      </w:tr>
-    </w:tbl>
-    <w:p>
-      <w:pPr>
-        <w:spacing w:after="80" w:before="180"/>
-      </w:pPr>
-      <w:r>
-        <w:rPr>
-          <w:rFonts w:ascii="Calibri" w:cs="Calibri" w:eastAsia="Calibri" w:hAnsi="Calibri"/>
-          <w:b/>
-          <w:bCs/>
-          <w:color w:val="1F3A5F"/>
-          <w:sz w:val="24"/>
-          <w:szCs w:val="24"/>
-        </w:rPr>
-        <w:t xml:space="preserve">Qué se puede hacer desde la pantalla</w:t>
-      </w:r>
-    </w:p>
-    <w:tbl>
-      <w:tblPr>
-        <w:tblW w:type="dxa" w:w="14400"/>
-        <w:tblBorders>
-          <w:top w:val="single" w:color="auto" w:sz="4"/>
-          <w:left w:val="single" w:color="auto" w:sz="4"/>
-          <w:bottom w:val="single" w:color="auto" w:sz="4"/>
-          <w:right w:val="single" w:color="auto" w:sz="4"/>
-          <w:insideH w:val="single" w:color="auto" w:sz="4"/>
-          <w:insideV w:val="single" w:color="auto" w:sz="4"/>
-        </w:tblBorders>
-      </w:tblPr>
-      <w:tblGrid>
-        <w:gridCol w:w="4200"/>
-        <w:gridCol w:w="10200"/>
-      </w:tblGrid>
-      <w:tr>
-        <w:trPr>
-          <w:tblHeader/>
-        </w:trPr>
-        <w:tc>
-          <w:tcPr>
-            <w:tcW w:type="dxa" w:w="4200"/>
-            <w:shd w:fill="2E7D8C" w:color="auto" w:val="clear"/>
-            <w:tcMar>
-              <w:top w:type="dxa" w:w="80"/>
-              <w:left w:type="dxa" w:w="120"/>
-              <w:bottom w:type="dxa" w:w="80"/>
-              <w:right w:type="dxa" w:w="120"/>
-            </w:tcMar>
-          </w:tcPr>
-          <w:p>
-            <w:pPr>
-              <w:spacing w:after="40"/>
-            </w:pPr>
-            <w:r>
-              <w:rPr>
-                <w:rFonts w:ascii="Calibri" w:cs="Calibri" w:eastAsia="Calibri" w:hAnsi="Calibri"/>
-                <w:b/>
-                <w:bCs/>
-                <w:color w:val="FFFFFF"/>
-                <w:sz w:val="20"/>
-                <w:szCs w:val="20"/>
-              </w:rPr>
-              <w:t xml:space="preserve">Acción</w:t>
-            </w:r>
-          </w:p>
-        </w:tc>
-        <w:tc>
-          <w:tcPr>
-            <w:tcW w:type="dxa" w:w="10200"/>
-            <w:shd w:fill="2E7D8C" w:color="auto" w:val="clear"/>
-            <w:tcMar>
-              <w:top w:type="dxa" w:w="80"/>
-              <w:left w:type="dxa" w:w="120"/>
-              <w:bottom w:type="dxa" w:w="80"/>
-              <w:right w:type="dxa" w:w="120"/>
-            </w:tcMar>
-          </w:tcPr>
-          <w:p>
-            <w:pPr>
-              <w:spacing w:after="40"/>
-            </w:pPr>
-            <w:r>
-              <w:rPr>
-                <w:rFonts w:ascii="Calibri" w:cs="Calibri" w:eastAsia="Calibri" w:hAnsi="Calibri"/>
-                <w:b/>
-                <w:bCs/>
-                <w:color w:val="FFFFFF"/>
-                <w:sz w:val="20"/>
-                <w:szCs w:val="20"/>
-              </w:rPr>
-              <w:t xml:space="preserve">Resultado</w:t>
-            </w:r>
-          </w:p>
-        </w:tc>
-      </w:tr>
-      <w:tr>
-        <w:tc>
-          <w:tcPr>
-            <w:tcW w:type="dxa" w:w="4200"/>
-            <w:tcMar>
-              <w:top w:type="dxa" w:w="80"/>
-              <w:left w:type="dxa" w:w="120"/>
-              <w:bottom w:type="dxa" w:w="80"/>
-              <w:right w:type="dxa" w:w="120"/>
-            </w:tcMar>
-          </w:tcPr>
-          <w:p>
-            <w:pPr>
-              <w:spacing w:after="40"/>
-            </w:pPr>
-            <w:r>
-              <w:rPr>
-                <w:rFonts w:ascii="Calibri" w:cs="Calibri" w:eastAsia="Calibri" w:hAnsi="Calibri"/>
-                <w:b w:val="false"/>
-                <w:bCs w:val="false"/>
-                <w:sz w:val="20"/>
-                <w:szCs w:val="20"/>
-              </w:rPr>
-              <w:t xml:space="preserve">Cargar operación de descubierto</w:t>
-            </w:r>
-          </w:p>
-        </w:tc>
-        <w:tc>
-          <w:tcPr>
-            <w:tcW w:type="dxa" w:w="10200"/>
-            <w:tcMar>
-              <w:top w:type="dxa" w:w="80"/>
-              <w:left w:type="dxa" w:w="120"/>
-              <w:bottom w:type="dxa" w:w="80"/>
-              <w:right w:type="dxa" w:w="120"/>
-            </w:tcMar>
-          </w:tcPr>
-          <w:p>
-            <w:pPr>
-              <w:spacing w:after="40"/>
-            </w:pPr>
-            <w:r>
-              <w:rPr>
-                <w:rFonts w:ascii="Calibri" w:cs="Calibri" w:eastAsia="Calibri" w:hAnsi="Calibri"/>
-                <w:b w:val="false"/>
-                <w:bCs w:val="false"/>
-                <w:sz w:val="20"/>
-                <w:szCs w:val="20"/>
-              </w:rPr>
-              <w:t xml:space="preserve">Abre la carga (Módulo E) con el cliente, la línea, el vencimiento y el disponible ya completos</w:t>
-            </w:r>
-          </w:p>
-        </w:tc>
-      </w:tr>
-      <w:tr>
-        <w:tc>
-          <w:tcPr>
-            <w:tcW w:type="dxa" w:w="4200"/>
-            <w:shd w:fill="EAF2F5" w:color="auto" w:val="clear"/>
-            <w:tcMar>
-              <w:top w:type="dxa" w:w="80"/>
-              <w:left w:type="dxa" w:w="120"/>
-              <w:bottom w:type="dxa" w:w="80"/>
-              <w:right w:type="dxa" w:w="120"/>
-            </w:tcMar>
-          </w:tcPr>
-          <w:p>
-            <w:pPr>
-              <w:spacing w:after="40"/>
-            </w:pPr>
-            <w:r>
-              <w:rPr>
-                <w:rFonts w:ascii="Calibri" w:cs="Calibri" w:eastAsia="Calibri" w:hAnsi="Calibri"/>
-                <w:b w:val="false"/>
-                <w:bCs w:val="false"/>
-                <w:sz w:val="20"/>
-                <w:szCs w:val="20"/>
-              </w:rPr>
-              <w:t xml:space="preserve">Renovar una operación</w:t>
-            </w:r>
-          </w:p>
-        </w:tc>
-        <w:tc>
-          <w:tcPr>
-            <w:tcW w:type="dxa" w:w="10200"/>
-            <w:shd w:fill="EAF2F5" w:color="auto" w:val="clear"/>
-            <w:tcMar>
-              <w:top w:type="dxa" w:w="80"/>
-              <w:left w:type="dxa" w:w="120"/>
-              <w:bottom w:type="dxa" w:w="80"/>
-              <w:right w:type="dxa" w:w="120"/>
-            </w:tcMar>
-          </w:tcPr>
-          <w:p>
-            <w:pPr>
-              <w:spacing w:after="40"/>
-            </w:pPr>
-            <w:r>
-              <w:rPr>
-                <w:rFonts w:ascii="Calibri" w:cs="Calibri" w:eastAsia="Calibri" w:hAnsi="Calibri"/>
-                <w:b w:val="false"/>
-                <w:bCs w:val="false"/>
-                <w:sz w:val="20"/>
-                <w:szCs w:val="20"/>
-              </w:rPr>
-              <w:t xml:space="preserve">Abre la renovación (Módulo F) sobre la operación vigente elegida</w:t>
-            </w:r>
-          </w:p>
-        </w:tc>
-      </w:tr>
-      <w:tr>
-        <w:tc>
-          <w:tcPr>
-            <w:tcW w:type="dxa" w:w="4200"/>
-            <w:tcMar>
-              <w:top w:type="dxa" w:w="80"/>
-              <w:left w:type="dxa" w:w="120"/>
-              <w:bottom w:type="dxa" w:w="80"/>
-              <w:right w:type="dxa" w:w="120"/>
-            </w:tcMar>
-          </w:tcPr>
-          <w:p>
-            <w:pPr>
-              <w:spacing w:after="40"/>
-            </w:pPr>
-            <w:r>
-              <w:rPr>
-                <w:rFonts w:ascii="Calibri" w:cs="Calibri" w:eastAsia="Calibri" w:hAnsi="Calibri"/>
-                <w:b w:val="false"/>
-                <w:bCs w:val="false"/>
-                <w:sz w:val="20"/>
-                <w:szCs w:val="20"/>
-              </w:rPr>
-              <w:t xml:space="preserve">Descontar cheques</w:t>
-            </w:r>
-          </w:p>
-        </w:tc>
-        <w:tc>
-          <w:tcPr>
-            <w:tcW w:type="dxa" w:w="10200"/>
-            <w:tcMar>
-              <w:top w:type="dxa" w:w="80"/>
-              <w:left w:type="dxa" w:w="120"/>
-              <w:bottom w:type="dxa" w:w="80"/>
-              <w:right w:type="dxa" w:w="120"/>
-            </w:tcMar>
-          </w:tcPr>
-          <w:p>
-            <w:pPr>
-              <w:spacing w:after="40"/>
-            </w:pPr>
-            <w:r>
-              <w:rPr>
-                <w:rFonts w:ascii="Calibri" w:cs="Calibri" w:eastAsia="Calibri" w:hAnsi="Calibri"/>
-                <w:b w:val="false"/>
-                <w:bCs w:val="false"/>
-                <w:sz w:val="20"/>
-                <w:szCs w:val="20"/>
-              </w:rPr>
-              <w:t xml:space="preserve">Abre el circuito de cheques (Módulo I) sobre la línea</w:t>
-            </w:r>
-          </w:p>
-        </w:tc>
-      </w:tr>
-      <w:tr>
-        <w:tc>
-          <w:tcPr>
-            <w:tcW w:type="dxa" w:w="4200"/>
-            <w:shd w:fill="EAF2F5" w:color="auto" w:val="clear"/>
-            <w:tcMar>
-              <w:top w:type="dxa" w:w="80"/>
-              <w:left w:type="dxa" w:w="120"/>
-              <w:bottom w:type="dxa" w:w="80"/>
-              <w:right w:type="dxa" w:w="120"/>
-            </w:tcMar>
-          </w:tcPr>
-          <w:p>
-            <w:pPr>
-              <w:spacing w:after="40"/>
-            </w:pPr>
-            <w:r>
-              <w:rPr>
-                <w:rFonts w:ascii="Calibri" w:cs="Calibri" w:eastAsia="Calibri" w:hAnsi="Calibri"/>
-                <w:b w:val="false"/>
-                <w:bCs w:val="false"/>
-                <w:sz w:val="20"/>
-                <w:szCs w:val="20"/>
-              </w:rPr>
-              <w:t xml:space="preserve">Ver la minuta y el historial</w:t>
-            </w:r>
-          </w:p>
-        </w:tc>
-        <w:tc>
-          <w:tcPr>
-            <w:tcW w:type="dxa" w:w="10200"/>
-            <w:shd w:fill="EAF2F5" w:color="auto" w:val="clear"/>
-            <w:tcMar>
-              <w:top w:type="dxa" w:w="80"/>
-              <w:left w:type="dxa" w:w="120"/>
-              <w:bottom w:type="dxa" w:w="80"/>
-              <w:right w:type="dxa" w:w="120"/>
-            </w:tcMar>
-          </w:tcPr>
-          <w:p>
-            <w:pPr>
-              <w:spacing w:after="40"/>
-            </w:pPr>
-            <w:r>
-              <w:rPr>
-                <w:rFonts w:ascii="Calibri" w:cs="Calibri" w:eastAsia="Calibri" w:hAnsi="Calibri"/>
-                <w:b w:val="false"/>
-                <w:bCs w:val="false"/>
-                <w:sz w:val="20"/>
-                <w:szCs w:val="20"/>
-              </w:rPr>
-              <w:t xml:space="preserve">Acceso a la minuta aprobada, sus versiones y las acciones ejecutadas</w:t>
-            </w:r>
-          </w:p>
-        </w:tc>
-      </w:tr>
-      <w:tr>
-        <w:tc>
-          <w:tcPr>
-            <w:tcW w:type="dxa" w:w="4200"/>
-            <w:tcMar>
-              <w:top w:type="dxa" w:w="80"/>
-              <w:left w:type="dxa" w:w="120"/>
-              <w:bottom w:type="dxa" w:w="80"/>
-              <w:right w:type="dxa" w:w="120"/>
-            </w:tcMar>
-          </w:tcPr>
-          <w:p>
-            <w:pPr>
-              <w:spacing w:after="40"/>
-            </w:pPr>
-            <w:r>
-              <w:rPr>
-                <w:rFonts w:ascii="Calibri" w:cs="Calibri" w:eastAsia="Calibri" w:hAnsi="Calibri"/>
-                <w:b w:val="false"/>
-                <w:bCs w:val="false"/>
-                <w:sz w:val="20"/>
-                <w:szCs w:val="20"/>
-              </w:rPr>
-              <w:t xml:space="preserve">Filtrar y exportar</w:t>
-            </w:r>
-          </w:p>
-        </w:tc>
-        <w:tc>
-          <w:tcPr>
-            <w:tcW w:type="dxa" w:w="10200"/>
-            <w:tcMar>
-              <w:top w:type="dxa" w:w="80"/>
-              <w:left w:type="dxa" w:w="120"/>
-              <w:bottom w:type="dxa" w:w="80"/>
-              <w:right w:type="dxa" w:w="120"/>
-            </w:tcMar>
-          </w:tcPr>
-          <w:p>
-            <w:pPr>
-              <w:spacing w:after="40"/>
-            </w:pPr>
-            <w:r>
-              <w:rPr>
-                <w:rFonts w:ascii="Calibri" w:cs="Calibri" w:eastAsia="Calibri" w:hAnsi="Calibri"/>
-                <w:b w:val="false"/>
-                <w:bCs w:val="false"/>
-                <w:sz w:val="20"/>
-                <w:szCs w:val="20"/>
-              </w:rPr>
-              <w:t xml:space="preserve">Por cliente, CUIT, grupo, oficial, producto, estado o vencimiento; exportar a Excel</w:t>
-            </w:r>
-          </w:p>
-        </w:tc>
-      </w:tr>
-    </w:tbl>
-    <w:p>
-      <w:pPr>
-        <w:spacing w:after="100" w:before="80"/>
-      </w:pPr>
-      <w:r>
-        <w:rPr>
-          <w:rFonts w:ascii="Calibri" w:cs="Calibri" w:eastAsia="Calibri" w:hAnsi="Calibri"/>
-          <w:i/>
-          <w:iCs/>
-          <w:color w:val="5F6B76"/>
-          <w:sz w:val="19"/>
-          <w:szCs w:val="19"/>
-        </w:rPr>
-        <w:t xml:space="preserve">Reemplaza la pantalla de consumido de línea actual: deja de ser solo de consulta y pasa a ser el punto de entrada de toda la operatoria.</w:t>
-      </w:r>
-    </w:p>
-    <w:p>
-      <w:pPr>
-        <w:pStyle w:val="Heading1"/>
-        <w:pageBreakBefore/>
-        <w:shd w:fill="1F3A5F" w:color="auto" w:val="clear"/>
-        <w:spacing w:after="0"/>
-      </w:pPr>
-      <w:r>
-        <w:rPr>
-          <w:rFonts w:ascii="Calibri" w:cs="Calibri" w:eastAsia="Calibri" w:hAnsi="Calibri"/>
-          <w:b/>
-          <w:bCs/>
-          <w:color w:val="9FD3DE"/>
-          <w:sz w:val="30"/>
-          <w:szCs w:val="30"/>
-        </w:rPr>
-        <w:t xml:space="preserve">  10  </w:t>
-      </w:r>
-      <w:r>
-        <w:rPr>
-          <w:rFonts w:ascii="Calibri" w:cs="Calibri" w:eastAsia="Calibri" w:hAnsi="Calibri"/>
-          <w:b/>
-          <w:bCs/>
-          <w:color w:val="FFFFFF"/>
-          <w:sz w:val="34"/>
-          <w:szCs w:val="34"/>
-        </w:rPr>
-        <w:t xml:space="preserve">Módulo D · Línea en USD ajustable en pesos</w:t>
+        <w:t xml:space="preserve">Módulo C · Línea en USD ajustable en pesos</w:t>
       </w:r>
     </w:p>
     <w:p>
@@ -11251,6 +10317,1155 @@
           <w:sz w:val="30"/>
           <w:szCs w:val="30"/>
         </w:rPr>
+        <w:t xml:space="preserve">  10  </w:t>
+      </w:r>
+      <w:r>
+        <w:rPr>
+          <w:rFonts w:ascii="Calibri" w:cs="Calibri" w:eastAsia="Calibri" w:hAnsi="Calibri"/>
+          <w:b/>
+          <w:bCs/>
+          <w:color w:val="FFFFFF"/>
+          <w:sz w:val="34"/>
+          <w:szCs w:val="34"/>
+        </w:rPr>
+        <w:t xml:space="preserve">Módulo D · Pantalla de líneas</w:t>
+      </w:r>
+    </w:p>
+    <w:p>
+      <w:pPr>
+        <w:pBdr>
+          <w:bottom w:val="single" w:color="2E7D8C" w:sz="18" w:space="1"/>
+        </w:pBdr>
+        <w:spacing w:after="220"/>
+      </w:pPr>
+      <w:r>
+        <w:rPr>
+          <w:rFonts w:ascii="Calibri" w:cs="Calibri" w:eastAsia="Calibri" w:hAnsi="Calibri"/>
+          <w:i/>
+          <w:iCs/>
+          <w:color w:val="5F6B76"/>
+          <w:sz w:val="22"/>
+          <w:szCs w:val="22"/>
+        </w:rPr>
+        <w:t xml:space="preserve">Punto de consulta de todas las líneas y punto de inicio de todas las operaciones</w:t>
+      </w:r>
+    </w:p>
+    <w:p>
+      <w:pPr>
+        <w:spacing w:after="100" w:before="0"/>
+      </w:pPr>
+      <w:r>
+        <w:rPr>
+          <w:rFonts w:ascii="Calibri" w:cs="Calibri" w:eastAsia="Calibri" w:hAnsi="Calibri"/>
+          <w:b/>
+          <w:bCs/>
+          <w:sz w:val="22"/>
+          <w:szCs w:val="22"/>
+        </w:rPr>
+        <w:t xml:space="preserve">Objetivo. </w:t>
+      </w:r>
+      <w:r>
+        <w:rPr>
+          <w:rFonts w:ascii="Calibri" w:cs="Calibri" w:eastAsia="Calibri" w:hAnsi="Calibri"/>
+          <w:sz w:val="22"/>
+          <w:szCs w:val="22"/>
+        </w:rPr>
+        <w:t xml:space="preserve">Reunir en una sola pantalla todas las líneas de crédito vigentes, con lo aprobado, lo consumido, lo disponible, su estado y sus vencimientos. La pantalla cumple dos funciones:</w:t>
+      </w:r>
+    </w:p>
+    <w:p>
+      <w:pPr>
+        <w:pStyle w:val="ListParagraph"/>
+        <w:numPr>
+          <w:ilvl w:val="0"/>
+          <w:numId w:val="2"/>
+        </w:numPr>
+        <w:spacing w:after="60"/>
+      </w:pPr>
+      <w:r>
+        <w:rPr>
+          <w:rFonts w:ascii="Calibri" w:cs="Calibri" w:eastAsia="Calibri" w:hAnsi="Calibri"/>
+          <w:b/>
+          <w:bCs/>
+          <w:sz w:val="22"/>
+          <w:szCs w:val="22"/>
+        </w:rPr>
+        <w:t xml:space="preserve">Visualización: </w:t>
+      </w:r>
+      <w:r>
+        <w:rPr>
+          <w:rFonts w:ascii="Calibri" w:cs="Calibri" w:eastAsia="Calibri" w:hAnsi="Calibri"/>
+          <w:sz w:val="22"/>
+          <w:szCs w:val="22"/>
+        </w:rPr>
+        <w:t xml:space="preserve">Middle Office, Riesgos y Comercial consultan en un solo lugar la situación de cada línea y de cada grupo económico.</w:t>
+      </w:r>
+    </w:p>
+    <w:p>
+      <w:pPr>
+        <w:pStyle w:val="ListParagraph"/>
+        <w:numPr>
+          <w:ilvl w:val="0"/>
+          <w:numId w:val="2"/>
+        </w:numPr>
+        <w:spacing w:after="60"/>
+      </w:pPr>
+      <w:r>
+        <w:rPr>
+          <w:rFonts w:ascii="Calibri" w:cs="Calibri" w:eastAsia="Calibri" w:hAnsi="Calibri"/>
+          <w:b/>
+          <w:bCs/>
+          <w:sz w:val="22"/>
+          <w:szCs w:val="22"/>
+        </w:rPr>
+        <w:t xml:space="preserve">Inicio de la carga de operaciones: </w:t>
+      </w:r>
+      <w:r>
+        <w:rPr>
+          <w:rFonts w:ascii="Calibri" w:cs="Calibri" w:eastAsia="Calibri" w:hAnsi="Calibri"/>
+          <w:sz w:val="22"/>
+          <w:szCs w:val="22"/>
+        </w:rPr>
+        <w:t xml:space="preserve">toda operación se inicia desde aquí, sobre la línea elegida. Así cada operación nace asociada a su línea y los controles de disponible, fraccionamiento y tasa se aplican desde el primer momento.</w:t>
+      </w:r>
+    </w:p>
+    <w:p>
+      <w:pPr>
+        <w:spacing w:after="80" w:before="180"/>
+      </w:pPr>
+      <w:r>
+        <w:rPr>
+          <w:rFonts w:ascii="Calibri" w:cs="Calibri" w:eastAsia="Calibri" w:hAnsi="Calibri"/>
+          <w:b/>
+          <w:bCs/>
+          <w:color w:val="1F3A5F"/>
+          <w:sz w:val="24"/>
+          <w:szCs w:val="24"/>
+        </w:rPr>
+        <w:t xml:space="preserve">Qué muestra</w:t>
+      </w:r>
+    </w:p>
+    <w:tbl>
+      <w:tblPr>
+        <w:tblW w:type="dxa" w:w="14400"/>
+        <w:tblBorders>
+          <w:top w:val="single" w:color="auto" w:sz="4"/>
+          <w:left w:val="single" w:color="auto" w:sz="4"/>
+          <w:bottom w:val="single" w:color="auto" w:sz="4"/>
+          <w:right w:val="single" w:color="auto" w:sz="4"/>
+          <w:insideH w:val="single" w:color="auto" w:sz="4"/>
+          <w:insideV w:val="single" w:color="auto" w:sz="4"/>
+        </w:tblBorders>
+      </w:tblPr>
+      <w:tblGrid>
+        <w:gridCol w:w="4200"/>
+        <w:gridCol w:w="10200"/>
+      </w:tblGrid>
+      <w:tr>
+        <w:trPr>
+          <w:tblHeader/>
+        </w:trPr>
+        <w:tc>
+          <w:tcPr>
+            <w:tcW w:type="dxa" w:w="4200"/>
+            <w:shd w:fill="2E7D8C" w:color="auto" w:val="clear"/>
+            <w:tcMar>
+              <w:top w:type="dxa" w:w="80"/>
+              <w:left w:type="dxa" w:w="120"/>
+              <w:bottom w:type="dxa" w:w="80"/>
+              <w:right w:type="dxa" w:w="120"/>
+            </w:tcMar>
+          </w:tcPr>
+          <w:p>
+            <w:pPr>
+              <w:spacing w:after="40"/>
+            </w:pPr>
+            <w:r>
+              <w:rPr>
+                <w:rFonts w:ascii="Calibri" w:cs="Calibri" w:eastAsia="Calibri" w:hAnsi="Calibri"/>
+                <w:b/>
+                <w:bCs/>
+                <w:color w:val="FFFFFF"/>
+                <w:sz w:val="20"/>
+                <w:szCs w:val="20"/>
+              </w:rPr>
+              <w:t xml:space="preserve">Dato</w:t>
+            </w:r>
+          </w:p>
+        </w:tc>
+        <w:tc>
+          <w:tcPr>
+            <w:tcW w:type="dxa" w:w="10200"/>
+            <w:shd w:fill="2E7D8C" w:color="auto" w:val="clear"/>
+            <w:tcMar>
+              <w:top w:type="dxa" w:w="80"/>
+              <w:left w:type="dxa" w:w="120"/>
+              <w:bottom w:type="dxa" w:w="80"/>
+              <w:right w:type="dxa" w:w="120"/>
+            </w:tcMar>
+          </w:tcPr>
+          <w:p>
+            <w:pPr>
+              <w:spacing w:after="40"/>
+            </w:pPr>
+            <w:r>
+              <w:rPr>
+                <w:rFonts w:ascii="Calibri" w:cs="Calibri" w:eastAsia="Calibri" w:hAnsi="Calibri"/>
+                <w:b/>
+                <w:bCs/>
+                <w:color w:val="FFFFFF"/>
+                <w:sz w:val="20"/>
+                <w:szCs w:val="20"/>
+              </w:rPr>
+              <w:t xml:space="preserve">Detalle</w:t>
+            </w:r>
+          </w:p>
+        </w:tc>
+      </w:tr>
+      <w:tr>
+        <w:tc>
+          <w:tcPr>
+            <w:tcW w:type="dxa" w:w="4200"/>
+            <w:tcMar>
+              <w:top w:type="dxa" w:w="80"/>
+              <w:left w:type="dxa" w:w="120"/>
+              <w:bottom w:type="dxa" w:w="80"/>
+              <w:right w:type="dxa" w:w="120"/>
+            </w:tcMar>
+          </w:tcPr>
+          <w:p>
+            <w:pPr>
+              <w:spacing w:after="40"/>
+            </w:pPr>
+            <w:r>
+              <w:rPr>
+                <w:rFonts w:ascii="Calibri" w:cs="Calibri" w:eastAsia="Calibri" w:hAnsi="Calibri"/>
+                <w:b w:val="false"/>
+                <w:bCs w:val="false"/>
+                <w:sz w:val="20"/>
+                <w:szCs w:val="20"/>
+              </w:rPr>
+              <w:t xml:space="preserve">Cliente y grupo económico</w:t>
+            </w:r>
+          </w:p>
+        </w:tc>
+        <w:tc>
+          <w:tcPr>
+            <w:tcW w:type="dxa" w:w="10200"/>
+            <w:tcMar>
+              <w:top w:type="dxa" w:w="80"/>
+              <w:left w:type="dxa" w:w="120"/>
+              <w:bottom w:type="dxa" w:w="80"/>
+              <w:right w:type="dxa" w:w="120"/>
+            </w:tcMar>
+          </w:tcPr>
+          <w:p>
+            <w:pPr>
+              <w:spacing w:after="40"/>
+            </w:pPr>
+            <w:r>
+              <w:rPr>
+                <w:rFonts w:ascii="Calibri" w:cs="Calibri" w:eastAsia="Calibri" w:hAnsi="Calibri"/>
+                <w:b w:val="false"/>
+                <w:bCs w:val="false"/>
+                <w:sz w:val="20"/>
+                <w:szCs w:val="20"/>
+              </w:rPr>
+              <w:t xml:space="preserve">Razón social, CUIT y grupo económico (COBIS MIS)</w:t>
+            </w:r>
+          </w:p>
+        </w:tc>
+      </w:tr>
+      <w:tr>
+        <w:tc>
+          <w:tcPr>
+            <w:tcW w:type="dxa" w:w="4200"/>
+            <w:shd w:fill="EAF2F5" w:color="auto" w:val="clear"/>
+            <w:tcMar>
+              <w:top w:type="dxa" w:w="80"/>
+              <w:left w:type="dxa" w:w="120"/>
+              <w:bottom w:type="dxa" w:w="80"/>
+              <w:right w:type="dxa" w:w="120"/>
+            </w:tcMar>
+          </w:tcPr>
+          <w:p>
+            <w:pPr>
+              <w:spacing w:after="40"/>
+            </w:pPr>
+            <w:r>
+              <w:rPr>
+                <w:rFonts w:ascii="Calibri" w:cs="Calibri" w:eastAsia="Calibri" w:hAnsi="Calibri"/>
+                <w:b w:val="false"/>
+                <w:bCs w:val="false"/>
+                <w:sz w:val="20"/>
+                <w:szCs w:val="20"/>
+              </w:rPr>
+              <w:t xml:space="preserve">Línea</w:t>
+            </w:r>
+          </w:p>
+        </w:tc>
+        <w:tc>
+          <w:tcPr>
+            <w:tcW w:type="dxa" w:w="10200"/>
+            <w:shd w:fill="EAF2F5" w:color="auto" w:val="clear"/>
+            <w:tcMar>
+              <w:top w:type="dxa" w:w="80"/>
+              <w:left w:type="dxa" w:w="120"/>
+              <w:bottom w:type="dxa" w:w="80"/>
+              <w:right w:type="dxa" w:w="120"/>
+            </w:tcMar>
+          </w:tcPr>
+          <w:p>
+            <w:pPr>
+              <w:spacing w:after="40"/>
+            </w:pPr>
+            <w:r>
+              <w:rPr>
+                <w:rFonts w:ascii="Calibri" w:cs="Calibri" w:eastAsia="Calibri" w:hAnsi="Calibri"/>
+                <w:b w:val="false"/>
+                <w:bCs w:val="false"/>
+                <w:sz w:val="20"/>
+                <w:szCs w:val="20"/>
+              </w:rPr>
+              <w:t xml:space="preserve">Producto y subproductos, moneda (incluida USD ajustable en pesos), minuta que la aprobó y fecha de revisión</w:t>
+            </w:r>
+          </w:p>
+        </w:tc>
+      </w:tr>
+      <w:tr>
+        <w:tc>
+          <w:tcPr>
+            <w:tcW w:type="dxa" w:w="4200"/>
+            <w:tcMar>
+              <w:top w:type="dxa" w:w="80"/>
+              <w:left w:type="dxa" w:w="120"/>
+              <w:bottom w:type="dxa" w:w="80"/>
+              <w:right w:type="dxa" w:w="120"/>
+            </w:tcMar>
+          </w:tcPr>
+          <w:p>
+            <w:pPr>
+              <w:spacing w:after="40"/>
+            </w:pPr>
+            <w:r>
+              <w:rPr>
+                <w:rFonts w:ascii="Calibri" w:cs="Calibri" w:eastAsia="Calibri" w:hAnsi="Calibri"/>
+                <w:b w:val="false"/>
+                <w:bCs w:val="false"/>
+                <w:sz w:val="20"/>
+                <w:szCs w:val="20"/>
+              </w:rPr>
+              <w:t xml:space="preserve">Aprobado / consumido / disponible</w:t>
+            </w:r>
+          </w:p>
+        </w:tc>
+        <w:tc>
+          <w:tcPr>
+            <w:tcW w:type="dxa" w:w="10200"/>
+            <w:tcMar>
+              <w:top w:type="dxa" w:w="80"/>
+              <w:left w:type="dxa" w:w="120"/>
+              <w:bottom w:type="dxa" w:w="80"/>
+              <w:right w:type="dxa" w:w="120"/>
+            </w:tcMar>
+          </w:tcPr>
+          <w:p>
+            <w:pPr>
+              <w:spacing w:after="40"/>
+            </w:pPr>
+            <w:r>
+              <w:rPr>
+                <w:rFonts w:ascii="Calibri" w:cs="Calibri" w:eastAsia="Calibri" w:hAnsi="Calibri"/>
+                <w:b w:val="false"/>
+                <w:bCs w:val="false"/>
+                <w:sz w:val="20"/>
+                <w:szCs w:val="20"/>
+              </w:rPr>
+              <w:t xml:space="preserve">Monto de la línea, lo usado por las operaciones vigentes y lo que queda disponible</w:t>
+            </w:r>
+          </w:p>
+        </w:tc>
+      </w:tr>
+      <w:tr>
+        <w:tc>
+          <w:tcPr>
+            <w:tcW w:type="dxa" w:w="4200"/>
+            <w:shd w:fill="EAF2F5" w:color="auto" w:val="clear"/>
+            <w:tcMar>
+              <w:top w:type="dxa" w:w="80"/>
+              <w:left w:type="dxa" w:w="120"/>
+              <w:bottom w:type="dxa" w:w="80"/>
+              <w:right w:type="dxa" w:w="120"/>
+            </w:tcMar>
+          </w:tcPr>
+          <w:p>
+            <w:pPr>
+              <w:spacing w:after="40"/>
+            </w:pPr>
+            <w:r>
+              <w:rPr>
+                <w:rFonts w:ascii="Calibri" w:cs="Calibri" w:eastAsia="Calibri" w:hAnsi="Calibri"/>
+                <w:b w:val="false"/>
+                <w:bCs w:val="false"/>
+                <w:sz w:val="20"/>
+                <w:szCs w:val="20"/>
+              </w:rPr>
+              <w:t xml:space="preserve">Fraccionamiento</w:t>
+            </w:r>
+          </w:p>
+        </w:tc>
+        <w:tc>
+          <w:tcPr>
+            <w:tcW w:type="dxa" w:w="10200"/>
+            <w:shd w:fill="EAF2F5" w:color="auto" w:val="clear"/>
+            <w:tcMar>
+              <w:top w:type="dxa" w:w="80"/>
+              <w:left w:type="dxa" w:w="120"/>
+              <w:bottom w:type="dxa" w:w="80"/>
+              <w:right w:type="dxa" w:w="120"/>
+            </w:tcMar>
+          </w:tcPr>
+          <w:p>
+            <w:pPr>
+              <w:spacing w:after="40"/>
+            </w:pPr>
+            <w:r>
+              <w:rPr>
+                <w:rFonts w:ascii="Calibri" w:cs="Calibri" w:eastAsia="Calibri" w:hAnsi="Calibri"/>
+                <w:b w:val="false"/>
+                <w:bCs w:val="false"/>
+                <w:sz w:val="20"/>
+                <w:szCs w:val="20"/>
+              </w:rPr>
+              <w:t xml:space="preserve">Uso del grupo económico respecto del 15% de la RPC del banco, con alerta al acercarse al límite</w:t>
+            </w:r>
+          </w:p>
+        </w:tc>
+      </w:tr>
+      <w:tr>
+        <w:tc>
+          <w:tcPr>
+            <w:tcW w:type="dxa" w:w="4200"/>
+            <w:tcMar>
+              <w:top w:type="dxa" w:w="80"/>
+              <w:left w:type="dxa" w:w="120"/>
+              <w:bottom w:type="dxa" w:w="80"/>
+              <w:right w:type="dxa" w:w="120"/>
+            </w:tcMar>
+          </w:tcPr>
+          <w:p>
+            <w:pPr>
+              <w:spacing w:after="40"/>
+            </w:pPr>
+            <w:r>
+              <w:rPr>
+                <w:rFonts w:ascii="Calibri" w:cs="Calibri" w:eastAsia="Calibri" w:hAnsi="Calibri"/>
+                <w:b w:val="false"/>
+                <w:bCs w:val="false"/>
+                <w:sz w:val="20"/>
+                <w:szCs w:val="20"/>
+              </w:rPr>
+              <w:t xml:space="preserve">Vencimientos</w:t>
+            </w:r>
+          </w:p>
+        </w:tc>
+        <w:tc>
+          <w:tcPr>
+            <w:tcW w:type="dxa" w:w="10200"/>
+            <w:tcMar>
+              <w:top w:type="dxa" w:w="80"/>
+              <w:left w:type="dxa" w:w="120"/>
+              <w:bottom w:type="dxa" w:w="80"/>
+              <w:right w:type="dxa" w:w="120"/>
+            </w:tcMar>
+          </w:tcPr>
+          <w:p>
+            <w:pPr>
+              <w:spacing w:after="40"/>
+            </w:pPr>
+            <w:r>
+              <w:rPr>
+                <w:rFonts w:ascii="Calibri" w:cs="Calibri" w:eastAsia="Calibri" w:hAnsi="Calibri"/>
+                <w:b w:val="false"/>
+                <w:bCs w:val="false"/>
+                <w:sz w:val="20"/>
+                <w:szCs w:val="20"/>
+              </w:rPr>
+              <w:t xml:space="preserve">Vencimiento de la línea y de las operaciones asociadas</w:t>
+            </w:r>
+          </w:p>
+        </w:tc>
+      </w:tr>
+      <w:tr>
+        <w:tc>
+          <w:tcPr>
+            <w:tcW w:type="dxa" w:w="4200"/>
+            <w:shd w:fill="EAF2F5" w:color="auto" w:val="clear"/>
+            <w:tcMar>
+              <w:top w:type="dxa" w:w="80"/>
+              <w:left w:type="dxa" w:w="120"/>
+              <w:bottom w:type="dxa" w:w="80"/>
+              <w:right w:type="dxa" w:w="120"/>
+            </w:tcMar>
+          </w:tcPr>
+          <w:p>
+            <w:pPr>
+              <w:spacing w:after="40"/>
+            </w:pPr>
+            <w:r>
+              <w:rPr>
+                <w:rFonts w:ascii="Calibri" w:cs="Calibri" w:eastAsia="Calibri" w:hAnsi="Calibri"/>
+                <w:b w:val="false"/>
+                <w:bCs w:val="false"/>
+                <w:sz w:val="20"/>
+                <w:szCs w:val="20"/>
+              </w:rPr>
+              <w:t xml:space="preserve">Estado</w:t>
+            </w:r>
+          </w:p>
+        </w:tc>
+        <w:tc>
+          <w:tcPr>
+            <w:tcW w:type="dxa" w:w="10200"/>
+            <w:shd w:fill="EAF2F5" w:color="auto" w:val="clear"/>
+            <w:tcMar>
+              <w:top w:type="dxa" w:w="80"/>
+              <w:left w:type="dxa" w:w="120"/>
+              <w:bottom w:type="dxa" w:w="80"/>
+              <w:right w:type="dxa" w:w="120"/>
+            </w:tcMar>
+          </w:tcPr>
+          <w:p>
+            <w:pPr>
+              <w:spacing w:after="40"/>
+            </w:pPr>
+            <w:r>
+              <w:rPr>
+                <w:rFonts w:ascii="Calibri" w:cs="Calibri" w:eastAsia="Calibri" w:hAnsi="Calibri"/>
+                <w:b w:val="false"/>
+                <w:bCs w:val="false"/>
+                <w:sz w:val="20"/>
+                <w:szCs w:val="20"/>
+              </w:rPr>
+              <w:t xml:space="preserve">Por subproducto: activo, pendiente de garantía, forzado pendiente de regularizar, vencido o por revisar</w:t>
+            </w:r>
+          </w:p>
+        </w:tc>
+      </w:tr>
+      <w:tr>
+        <w:tc>
+          <w:tcPr>
+            <w:tcW w:type="dxa" w:w="4200"/>
+            <w:tcMar>
+              <w:top w:type="dxa" w:w="80"/>
+              <w:left w:type="dxa" w:w="120"/>
+              <w:bottom w:type="dxa" w:w="80"/>
+              <w:right w:type="dxa" w:w="120"/>
+            </w:tcMar>
+          </w:tcPr>
+          <w:p>
+            <w:pPr>
+              <w:spacing w:after="40"/>
+            </w:pPr>
+            <w:r>
+              <w:rPr>
+                <w:rFonts w:ascii="Calibri" w:cs="Calibri" w:eastAsia="Calibri" w:hAnsi="Calibri"/>
+                <w:b w:val="false"/>
+                <w:bCs w:val="false"/>
+                <w:sz w:val="20"/>
+                <w:szCs w:val="20"/>
+              </w:rPr>
+              <w:t xml:space="preserve">Operaciones vigentes</w:t>
+            </w:r>
+          </w:p>
+        </w:tc>
+        <w:tc>
+          <w:tcPr>
+            <w:tcW w:type="dxa" w:w="10200"/>
+            <w:tcMar>
+              <w:top w:type="dxa" w:w="80"/>
+              <w:left w:type="dxa" w:w="120"/>
+              <w:bottom w:type="dxa" w:w="80"/>
+              <w:right w:type="dxa" w:w="120"/>
+            </w:tcMar>
+          </w:tcPr>
+          <w:p>
+            <w:pPr>
+              <w:spacing w:after="40"/>
+            </w:pPr>
+            <w:r>
+              <w:rPr>
+                <w:rFonts w:ascii="Calibri" w:cs="Calibri" w:eastAsia="Calibri" w:hAnsi="Calibri"/>
+                <w:b w:val="false"/>
+                <w:bCs w:val="false"/>
+                <w:sz w:val="20"/>
+                <w:szCs w:val="20"/>
+              </w:rPr>
+              <w:t xml:space="preserve">Detalle de los préstamos, descubiertos, prefinanciaciones y cheques que consumen la línea</w:t>
+            </w:r>
+          </w:p>
+        </w:tc>
+      </w:tr>
+    </w:tbl>
+    <w:p>
+      <w:pPr>
+        <w:pStyle w:val="Heading1"/>
+        <w:pageBreakBefore/>
+        <w:shd w:fill="1F3A5F" w:color="auto" w:val="clear"/>
+        <w:spacing w:after="0"/>
+      </w:pPr>
+      <w:r>
+        <w:rPr>
+          <w:rFonts w:ascii="Calibri" w:cs="Calibri" w:eastAsia="Calibri" w:hAnsi="Calibri"/>
+          <w:b/>
+          <w:bCs/>
+          <w:color w:val="9FD3DE"/>
+          <w:sz w:val="30"/>
+          <w:szCs w:val="30"/>
+        </w:rPr>
+        <w:t xml:space="preserve">  10  </w:t>
+      </w:r>
+      <w:r>
+        <w:rPr>
+          <w:rFonts w:ascii="Calibri" w:cs="Calibri" w:eastAsia="Calibri" w:hAnsi="Calibri"/>
+          <w:b/>
+          <w:bCs/>
+          <w:color w:val="FFFFFF"/>
+          <w:sz w:val="34"/>
+          <w:szCs w:val="34"/>
+        </w:rPr>
+        <w:t xml:space="preserve">Módulo D · Carga de operaciones desde la pantalla de líneas</w:t>
+      </w:r>
+    </w:p>
+    <w:p>
+      <w:pPr>
+        <w:pBdr>
+          <w:bottom w:val="single" w:color="2E7D8C" w:sz="18" w:space="1"/>
+        </w:pBdr>
+        <w:spacing w:after="220"/>
+      </w:pPr>
+      <w:r>
+        <w:rPr>
+          <w:rFonts w:ascii="Calibri" w:cs="Calibri" w:eastAsia="Calibri" w:hAnsi="Calibri"/>
+          <w:i/>
+          <w:iCs/>
+          <w:color w:val="5F6B76"/>
+          <w:sz w:val="22"/>
+          <w:szCs w:val="22"/>
+        </w:rPr>
+        <w:t xml:space="preserve">La pantalla de líneas no es solo de consulta: es el punto de inicio de toda la operatoria</w:t>
+      </w:r>
+    </w:p>
+    <w:p>
+      <w:pPr>
+        <w:spacing w:after="80" w:before="0"/>
+      </w:pPr>
+      <w:r>
+        <w:rPr>
+          <w:rFonts w:ascii="Calibri" w:cs="Calibri" w:eastAsia="Calibri" w:hAnsi="Calibri"/>
+          <w:b/>
+          <w:bCs/>
+          <w:color w:val="1F3A5F"/>
+          <w:sz w:val="24"/>
+          <w:szCs w:val="24"/>
+        </w:rPr>
+        <w:t xml:space="preserve">Qué se puede hacer desde la pantalla</w:t>
+      </w:r>
+    </w:p>
+    <w:tbl>
+      <w:tblPr>
+        <w:tblW w:type="dxa" w:w="14400"/>
+        <w:tblBorders>
+          <w:top w:val="single" w:color="auto" w:sz="4"/>
+          <w:left w:val="single" w:color="auto" w:sz="4"/>
+          <w:bottom w:val="single" w:color="auto" w:sz="4"/>
+          <w:right w:val="single" w:color="auto" w:sz="4"/>
+          <w:insideH w:val="single" w:color="auto" w:sz="4"/>
+          <w:insideV w:val="single" w:color="auto" w:sz="4"/>
+        </w:tblBorders>
+      </w:tblPr>
+      <w:tblGrid>
+        <w:gridCol w:w="4200"/>
+        <w:gridCol w:w="10200"/>
+      </w:tblGrid>
+      <w:tr>
+        <w:trPr>
+          <w:tblHeader/>
+        </w:trPr>
+        <w:tc>
+          <w:tcPr>
+            <w:tcW w:type="dxa" w:w="4200"/>
+            <w:shd w:fill="2E7D8C" w:color="auto" w:val="clear"/>
+            <w:tcMar>
+              <w:top w:type="dxa" w:w="80"/>
+              <w:left w:type="dxa" w:w="120"/>
+              <w:bottom w:type="dxa" w:w="80"/>
+              <w:right w:type="dxa" w:w="120"/>
+            </w:tcMar>
+          </w:tcPr>
+          <w:p>
+            <w:pPr>
+              <w:spacing w:after="40"/>
+            </w:pPr>
+            <w:r>
+              <w:rPr>
+                <w:rFonts w:ascii="Calibri" w:cs="Calibri" w:eastAsia="Calibri" w:hAnsi="Calibri"/>
+                <w:b/>
+                <w:bCs/>
+                <w:color w:val="FFFFFF"/>
+                <w:sz w:val="20"/>
+                <w:szCs w:val="20"/>
+              </w:rPr>
+              <w:t xml:space="preserve">Acción</w:t>
+            </w:r>
+          </w:p>
+        </w:tc>
+        <w:tc>
+          <w:tcPr>
+            <w:tcW w:type="dxa" w:w="10200"/>
+            <w:shd w:fill="2E7D8C" w:color="auto" w:val="clear"/>
+            <w:tcMar>
+              <w:top w:type="dxa" w:w="80"/>
+              <w:left w:type="dxa" w:w="120"/>
+              <w:bottom w:type="dxa" w:w="80"/>
+              <w:right w:type="dxa" w:w="120"/>
+            </w:tcMar>
+          </w:tcPr>
+          <w:p>
+            <w:pPr>
+              <w:spacing w:after="40"/>
+            </w:pPr>
+            <w:r>
+              <w:rPr>
+                <w:rFonts w:ascii="Calibri" w:cs="Calibri" w:eastAsia="Calibri" w:hAnsi="Calibri"/>
+                <w:b/>
+                <w:bCs/>
+                <w:color w:val="FFFFFF"/>
+                <w:sz w:val="20"/>
+                <w:szCs w:val="20"/>
+              </w:rPr>
+              <w:t xml:space="preserve">Resultado</w:t>
+            </w:r>
+          </w:p>
+        </w:tc>
+      </w:tr>
+      <w:tr>
+        <w:tc>
+          <w:tcPr>
+            <w:tcW w:type="dxa" w:w="4200"/>
+            <w:tcMar>
+              <w:top w:type="dxa" w:w="80"/>
+              <w:left w:type="dxa" w:w="120"/>
+              <w:bottom w:type="dxa" w:w="80"/>
+              <w:right w:type="dxa" w:w="120"/>
+            </w:tcMar>
+          </w:tcPr>
+          <w:p>
+            <w:pPr>
+              <w:spacing w:after="40"/>
+            </w:pPr>
+            <w:r>
+              <w:rPr>
+                <w:rFonts w:ascii="Calibri" w:cs="Calibri" w:eastAsia="Calibri" w:hAnsi="Calibri"/>
+                <w:b w:val="false"/>
+                <w:bCs w:val="false"/>
+                <w:sz w:val="20"/>
+                <w:szCs w:val="20"/>
+              </w:rPr>
+              <w:t xml:space="preserve">Cargar operación de préstamo</w:t>
+            </w:r>
+          </w:p>
+        </w:tc>
+        <w:tc>
+          <w:tcPr>
+            <w:tcW w:type="dxa" w:w="10200"/>
+            <w:tcMar>
+              <w:top w:type="dxa" w:w="80"/>
+              <w:left w:type="dxa" w:w="120"/>
+              <w:bottom w:type="dxa" w:w="80"/>
+              <w:right w:type="dxa" w:w="120"/>
+            </w:tcMar>
+          </w:tcPr>
+          <w:p>
+            <w:pPr>
+              <w:spacing w:after="40"/>
+            </w:pPr>
+            <w:r>
+              <w:rPr>
+                <w:rFonts w:ascii="Calibri" w:cs="Calibri" w:eastAsia="Calibri" w:hAnsi="Calibri"/>
+                <w:b w:val="false"/>
+                <w:bCs w:val="false"/>
+                <w:sz w:val="20"/>
+                <w:szCs w:val="20"/>
+              </w:rPr>
+              <w:t xml:space="preserve">Abre la carga del préstamo con el cliente, la línea y el disponible ya completos</w:t>
+            </w:r>
+          </w:p>
+        </w:tc>
+      </w:tr>
+      <w:tr>
+        <w:tc>
+          <w:tcPr>
+            <w:tcW w:type="dxa" w:w="4200"/>
+            <w:shd w:fill="EAF2F5" w:color="auto" w:val="clear"/>
+            <w:tcMar>
+              <w:top w:type="dxa" w:w="80"/>
+              <w:left w:type="dxa" w:w="120"/>
+              <w:bottom w:type="dxa" w:w="80"/>
+              <w:right w:type="dxa" w:w="120"/>
+            </w:tcMar>
+          </w:tcPr>
+          <w:p>
+            <w:pPr>
+              <w:spacing w:after="40"/>
+            </w:pPr>
+            <w:r>
+              <w:rPr>
+                <w:rFonts w:ascii="Calibri" w:cs="Calibri" w:eastAsia="Calibri" w:hAnsi="Calibri"/>
+                <w:b w:val="false"/>
+                <w:bCs w:val="false"/>
+                <w:sz w:val="20"/>
+                <w:szCs w:val="20"/>
+              </w:rPr>
+              <w:t xml:space="preserve">Cargar prefinanciación de exportaciones e importaciones</w:t>
+            </w:r>
+          </w:p>
+        </w:tc>
+        <w:tc>
+          <w:tcPr>
+            <w:tcW w:type="dxa" w:w="10200"/>
+            <w:shd w:fill="EAF2F5" w:color="auto" w:val="clear"/>
+            <w:tcMar>
+              <w:top w:type="dxa" w:w="80"/>
+              <w:left w:type="dxa" w:w="120"/>
+              <w:bottom w:type="dxa" w:w="80"/>
+              <w:right w:type="dxa" w:w="120"/>
+            </w:tcMar>
+          </w:tcPr>
+          <w:p>
+            <w:pPr>
+              <w:spacing w:after="40"/>
+            </w:pPr>
+            <w:r>
+              <w:rPr>
+                <w:rFonts w:ascii="Calibri" w:cs="Calibri" w:eastAsia="Calibri" w:hAnsi="Calibri"/>
+                <w:b w:val="false"/>
+                <w:bCs w:val="false"/>
+                <w:sz w:val="20"/>
+                <w:szCs w:val="20"/>
+              </w:rPr>
+              <w:t xml:space="preserve">Abre la carga de la operación de comercio exterior sobre la línea elegida</w:t>
+            </w:r>
+          </w:p>
+        </w:tc>
+      </w:tr>
+      <w:tr>
+        <w:tc>
+          <w:tcPr>
+            <w:tcW w:type="dxa" w:w="4200"/>
+            <w:tcMar>
+              <w:top w:type="dxa" w:w="80"/>
+              <w:left w:type="dxa" w:w="120"/>
+              <w:bottom w:type="dxa" w:w="80"/>
+              <w:right w:type="dxa" w:w="120"/>
+            </w:tcMar>
+          </w:tcPr>
+          <w:p>
+            <w:pPr>
+              <w:spacing w:after="40"/>
+            </w:pPr>
+            <w:r>
+              <w:rPr>
+                <w:rFonts w:ascii="Calibri" w:cs="Calibri" w:eastAsia="Calibri" w:hAnsi="Calibri"/>
+                <w:b w:val="false"/>
+                <w:bCs w:val="false"/>
+                <w:sz w:val="20"/>
+                <w:szCs w:val="20"/>
+              </w:rPr>
+              <w:t xml:space="preserve">Cargar operación de descubierto</w:t>
+            </w:r>
+          </w:p>
+        </w:tc>
+        <w:tc>
+          <w:tcPr>
+            <w:tcW w:type="dxa" w:w="10200"/>
+            <w:tcMar>
+              <w:top w:type="dxa" w:w="80"/>
+              <w:left w:type="dxa" w:w="120"/>
+              <w:bottom w:type="dxa" w:w="80"/>
+              <w:right w:type="dxa" w:w="120"/>
+            </w:tcMar>
+          </w:tcPr>
+          <w:p>
+            <w:pPr>
+              <w:spacing w:after="40"/>
+            </w:pPr>
+            <w:r>
+              <w:rPr>
+                <w:rFonts w:ascii="Calibri" w:cs="Calibri" w:eastAsia="Calibri" w:hAnsi="Calibri"/>
+                <w:b w:val="false"/>
+                <w:bCs w:val="false"/>
+                <w:sz w:val="20"/>
+                <w:szCs w:val="20"/>
+              </w:rPr>
+              <w:t xml:space="preserve">Abre la carga (Módulo E) con el cliente, la línea, el vencimiento y el disponible ya completos</w:t>
+            </w:r>
+          </w:p>
+        </w:tc>
+      </w:tr>
+      <w:tr>
+        <w:tc>
+          <w:tcPr>
+            <w:tcW w:type="dxa" w:w="4200"/>
+            <w:shd w:fill="EAF2F5" w:color="auto" w:val="clear"/>
+            <w:tcMar>
+              <w:top w:type="dxa" w:w="80"/>
+              <w:left w:type="dxa" w:w="120"/>
+              <w:bottom w:type="dxa" w:w="80"/>
+              <w:right w:type="dxa" w:w="120"/>
+            </w:tcMar>
+          </w:tcPr>
+          <w:p>
+            <w:pPr>
+              <w:spacing w:after="40"/>
+            </w:pPr>
+            <w:r>
+              <w:rPr>
+                <w:rFonts w:ascii="Calibri" w:cs="Calibri" w:eastAsia="Calibri" w:hAnsi="Calibri"/>
+                <w:b w:val="false"/>
+                <w:bCs w:val="false"/>
+                <w:sz w:val="20"/>
+                <w:szCs w:val="20"/>
+              </w:rPr>
+              <w:t xml:space="preserve">Renovar una operación</w:t>
+            </w:r>
+          </w:p>
+        </w:tc>
+        <w:tc>
+          <w:tcPr>
+            <w:tcW w:type="dxa" w:w="10200"/>
+            <w:shd w:fill="EAF2F5" w:color="auto" w:val="clear"/>
+            <w:tcMar>
+              <w:top w:type="dxa" w:w="80"/>
+              <w:left w:type="dxa" w:w="120"/>
+              <w:bottom w:type="dxa" w:w="80"/>
+              <w:right w:type="dxa" w:w="120"/>
+            </w:tcMar>
+          </w:tcPr>
+          <w:p>
+            <w:pPr>
+              <w:spacing w:after="40"/>
+            </w:pPr>
+            <w:r>
+              <w:rPr>
+                <w:rFonts w:ascii="Calibri" w:cs="Calibri" w:eastAsia="Calibri" w:hAnsi="Calibri"/>
+                <w:b w:val="false"/>
+                <w:bCs w:val="false"/>
+                <w:sz w:val="20"/>
+                <w:szCs w:val="20"/>
+              </w:rPr>
+              <w:t xml:space="preserve">Abre la renovación (Módulo F) sobre la operación vigente elegida</w:t>
+            </w:r>
+          </w:p>
+        </w:tc>
+      </w:tr>
+      <w:tr>
+        <w:tc>
+          <w:tcPr>
+            <w:tcW w:type="dxa" w:w="4200"/>
+            <w:tcMar>
+              <w:top w:type="dxa" w:w="80"/>
+              <w:left w:type="dxa" w:w="120"/>
+              <w:bottom w:type="dxa" w:w="80"/>
+              <w:right w:type="dxa" w:w="120"/>
+            </w:tcMar>
+          </w:tcPr>
+          <w:p>
+            <w:pPr>
+              <w:spacing w:after="40"/>
+            </w:pPr>
+            <w:r>
+              <w:rPr>
+                <w:rFonts w:ascii="Calibri" w:cs="Calibri" w:eastAsia="Calibri" w:hAnsi="Calibri"/>
+                <w:b w:val="false"/>
+                <w:bCs w:val="false"/>
+                <w:sz w:val="20"/>
+                <w:szCs w:val="20"/>
+              </w:rPr>
+              <w:t xml:space="preserve">Descontar cheques</w:t>
+            </w:r>
+          </w:p>
+        </w:tc>
+        <w:tc>
+          <w:tcPr>
+            <w:tcW w:type="dxa" w:w="10200"/>
+            <w:tcMar>
+              <w:top w:type="dxa" w:w="80"/>
+              <w:left w:type="dxa" w:w="120"/>
+              <w:bottom w:type="dxa" w:w="80"/>
+              <w:right w:type="dxa" w:w="120"/>
+            </w:tcMar>
+          </w:tcPr>
+          <w:p>
+            <w:pPr>
+              <w:spacing w:after="40"/>
+            </w:pPr>
+            <w:r>
+              <w:rPr>
+                <w:rFonts w:ascii="Calibri" w:cs="Calibri" w:eastAsia="Calibri" w:hAnsi="Calibri"/>
+                <w:b w:val="false"/>
+                <w:bCs w:val="false"/>
+                <w:sz w:val="20"/>
+                <w:szCs w:val="20"/>
+              </w:rPr>
+              <w:t xml:space="preserve">Abre el circuito de cheques (Módulo I) sobre la línea</w:t>
+            </w:r>
+          </w:p>
+        </w:tc>
+      </w:tr>
+      <w:tr>
+        <w:tc>
+          <w:tcPr>
+            <w:tcW w:type="dxa" w:w="4200"/>
+            <w:shd w:fill="EAF2F5" w:color="auto" w:val="clear"/>
+            <w:tcMar>
+              <w:top w:type="dxa" w:w="80"/>
+              <w:left w:type="dxa" w:w="120"/>
+              <w:bottom w:type="dxa" w:w="80"/>
+              <w:right w:type="dxa" w:w="120"/>
+            </w:tcMar>
+          </w:tcPr>
+          <w:p>
+            <w:pPr>
+              <w:spacing w:after="40"/>
+            </w:pPr>
+            <w:r>
+              <w:rPr>
+                <w:rFonts w:ascii="Calibri" w:cs="Calibri" w:eastAsia="Calibri" w:hAnsi="Calibri"/>
+                <w:b w:val="false"/>
+                <w:bCs w:val="false"/>
+                <w:sz w:val="20"/>
+                <w:szCs w:val="20"/>
+              </w:rPr>
+              <w:t xml:space="preserve">Ver la minuta y el historial</w:t>
+            </w:r>
+          </w:p>
+        </w:tc>
+        <w:tc>
+          <w:tcPr>
+            <w:tcW w:type="dxa" w:w="10200"/>
+            <w:shd w:fill="EAF2F5" w:color="auto" w:val="clear"/>
+            <w:tcMar>
+              <w:top w:type="dxa" w:w="80"/>
+              <w:left w:type="dxa" w:w="120"/>
+              <w:bottom w:type="dxa" w:w="80"/>
+              <w:right w:type="dxa" w:w="120"/>
+            </w:tcMar>
+          </w:tcPr>
+          <w:p>
+            <w:pPr>
+              <w:spacing w:after="40"/>
+            </w:pPr>
+            <w:r>
+              <w:rPr>
+                <w:rFonts w:ascii="Calibri" w:cs="Calibri" w:eastAsia="Calibri" w:hAnsi="Calibri"/>
+                <w:b w:val="false"/>
+                <w:bCs w:val="false"/>
+                <w:sz w:val="20"/>
+                <w:szCs w:val="20"/>
+              </w:rPr>
+              <w:t xml:space="preserve">Acceso a la minuta aprobada, sus versiones y las acciones ejecutadas</w:t>
+            </w:r>
+          </w:p>
+        </w:tc>
+      </w:tr>
+      <w:tr>
+        <w:tc>
+          <w:tcPr>
+            <w:tcW w:type="dxa" w:w="4200"/>
+            <w:tcMar>
+              <w:top w:type="dxa" w:w="80"/>
+              <w:left w:type="dxa" w:w="120"/>
+              <w:bottom w:type="dxa" w:w="80"/>
+              <w:right w:type="dxa" w:w="120"/>
+            </w:tcMar>
+          </w:tcPr>
+          <w:p>
+            <w:pPr>
+              <w:spacing w:after="40"/>
+            </w:pPr>
+            <w:r>
+              <w:rPr>
+                <w:rFonts w:ascii="Calibri" w:cs="Calibri" w:eastAsia="Calibri" w:hAnsi="Calibri"/>
+                <w:b w:val="false"/>
+                <w:bCs w:val="false"/>
+                <w:sz w:val="20"/>
+                <w:szCs w:val="20"/>
+              </w:rPr>
+              <w:t xml:space="preserve">Filtrar y exportar</w:t>
+            </w:r>
+          </w:p>
+        </w:tc>
+        <w:tc>
+          <w:tcPr>
+            <w:tcW w:type="dxa" w:w="10200"/>
+            <w:tcMar>
+              <w:top w:type="dxa" w:w="80"/>
+              <w:left w:type="dxa" w:w="120"/>
+              <w:bottom w:type="dxa" w:w="80"/>
+              <w:right w:type="dxa" w:w="120"/>
+            </w:tcMar>
+          </w:tcPr>
+          <w:p>
+            <w:pPr>
+              <w:spacing w:after="40"/>
+            </w:pPr>
+            <w:r>
+              <w:rPr>
+                <w:rFonts w:ascii="Calibri" w:cs="Calibri" w:eastAsia="Calibri" w:hAnsi="Calibri"/>
+                <w:b w:val="false"/>
+                <w:bCs w:val="false"/>
+                <w:sz w:val="20"/>
+                <w:szCs w:val="20"/>
+              </w:rPr>
+              <w:t xml:space="preserve">Por cliente, CUIT, grupo, oficial, producto, estado o vencimiento; exportar a Excel</w:t>
+            </w:r>
+          </w:p>
+        </w:tc>
+      </w:tr>
+    </w:tbl>
+    <w:p>
+      <w:pPr>
+        <w:spacing w:after="100" w:before="80"/>
+      </w:pPr>
+      <w:r>
+        <w:rPr>
+          <w:rFonts w:ascii="Calibri" w:cs="Calibri" w:eastAsia="Calibri" w:hAnsi="Calibri"/>
+          <w:i/>
+          <w:iCs/>
+          <w:color w:val="5F6B76"/>
+          <w:sz w:val="19"/>
+          <w:szCs w:val="19"/>
+        </w:rPr>
+        <w:t xml:space="preserve">Reemplaza la pantalla de consumido de línea actual: deja de ser solo de consulta y pasa a ser el punto de entrada de toda la operatoria. El circuito de préstamos y de prefinanciaciones queda por relevar.</w:t>
+      </w:r>
+    </w:p>
+    <w:p>
+      <w:pPr>
+        <w:pStyle w:val="Heading1"/>
+        <w:pageBreakBefore/>
+        <w:shd w:fill="1F3A5F" w:color="auto" w:val="clear"/>
+        <w:spacing w:after="0"/>
+      </w:pPr>
+      <w:r>
+        <w:rPr>
+          <w:rFonts w:ascii="Calibri" w:cs="Calibri" w:eastAsia="Calibri" w:hAnsi="Calibri"/>
+          <w:b/>
+          <w:bCs/>
+          <w:color w:val="9FD3DE"/>
+          <w:sz w:val="30"/>
+          <w:szCs w:val="30"/>
+        </w:rPr>
         <w:t xml:space="preserve">  11  </w:t>
       </w:r>
       <w:r>
@@ -11354,7 +11569,7 @@
                 <w:sz w:val="18"/>
                 <w:szCs w:val="18"/>
               </w:rPr>
-              <w:t xml:space="preserve">Desde la pantalla de líneas (Módulo C), sobre la línea elegida</w:t>
+              <w:t xml:space="preserve">Desde la pantalla de líneas (Módulo D), sobre la línea elegida</w:t>
             </w:r>
           </w:p>
         </w:tc>
@@ -11922,7 +12137,7 @@
                 <w:sz w:val="20"/>
                 <w:szCs w:val="20"/>
               </w:rPr>
-              <w:t xml:space="preserve">Desde la pantalla de líneas (Módulo C): se elige la línea y se abre la carga con el cliente, la línea y el disponible ya completos</w:t>
+              <w:t xml:space="preserve">Desde la pantalla de líneas (Módulo D): se elige la línea y se abre la carga con el cliente, la línea y el disponible ya completos</w:t>
             </w:r>
           </w:p>
         </w:tc>
@@ -16398,7 +16613,7 @@
                 <w:sz w:val="20"/>
                 <w:szCs w:val="20"/>
               </w:rPr>
-              <w:t xml:space="preserve">Garantía</w:t>
+              <w:t xml:space="preserve">Garantía en la línea</w:t>
             </w:r>
           </w:p>
         </w:tc>
@@ -16425,7 +16640,7 @@
                 <w:sz w:val="20"/>
                 <w:szCs w:val="20"/>
               </w:rPr>
-              <w:t xml:space="preserve">Línea / operación</w:t>
+              <w:t xml:space="preserve">Subproductos de la línea</w:t>
             </w:r>
           </w:p>
         </w:tc>
@@ -16452,7 +16667,7 @@
                 <w:sz w:val="20"/>
                 <w:szCs w:val="20"/>
               </w:rPr>
-              <w:t xml:space="preserve">Alta condicionada al OK de Activas, salvo forzado por gerente de Riesgos o CEO con regularización</w:t>
+              <w:t xml:space="preserve">Solo los subproductos que requieren garantía quedan pendientes hasta el OK de Activas (salvo forzado por gerente de Riesgos o CEO, con regularización); los demás se impactan con la aprobación del comité</w:t>
             </w:r>
           </w:p>
         </w:tc>
@@ -16480,6 +16695,87 @@
                 <w:sz w:val="20"/>
                 <w:szCs w:val="20"/>
               </w:rPr>
+              <w:t xml:space="preserve">Garantía en la operación</w:t>
+            </w:r>
+          </w:p>
+        </w:tc>
+        <w:tc>
+          <w:tcPr>
+            <w:tcW w:type="dxa" w:w="3000"/>
+            <w:tcMar>
+              <w:top w:type="dxa" w:w="80"/>
+              <w:left w:type="dxa" w:w="120"/>
+              <w:bottom w:type="dxa" w:w="80"/>
+              <w:right w:type="dxa" w:w="120"/>
+            </w:tcMar>
+          </w:tcPr>
+          <w:p>
+            <w:pPr>
+              <w:spacing w:after="40"/>
+            </w:pPr>
+            <w:r>
+              <w:rPr>
+                <w:rFonts w:ascii="Calibri" w:cs="Calibri" w:eastAsia="Calibri" w:hAnsi="Calibri"/>
+                <w:b w:val="false"/>
+                <w:bCs w:val="false"/>
+                <w:sz w:val="20"/>
+                <w:szCs w:val="20"/>
+              </w:rPr>
+              <w:t xml:space="preserve">Operación</w:t>
+            </w:r>
+          </w:p>
+        </w:tc>
+        <w:tc>
+          <w:tcPr>
+            <w:tcW w:type="dxa" w:w="7800"/>
+            <w:tcMar>
+              <w:top w:type="dxa" w:w="80"/>
+              <w:left w:type="dxa" w:w="120"/>
+              <w:bottom w:type="dxa" w:w="80"/>
+              <w:right w:type="dxa" w:w="120"/>
+            </w:tcMar>
+          </w:tcPr>
+          <w:p>
+            <w:pPr>
+              <w:spacing w:after="40"/>
+            </w:pPr>
+            <w:r>
+              <w:rPr>
+                <w:rFonts w:ascii="Calibri" w:cs="Calibri" w:eastAsia="Calibri" w:hAnsi="Calibri"/>
+                <w:b w:val="false"/>
+                <w:bCs w:val="false"/>
+                <w:sz w:val="20"/>
+                <w:szCs w:val="20"/>
+              </w:rPr>
+              <w:t xml:space="preserve">Alta del acuerdo condicionada al OK de Activas sobre la garantía cargada</w:t>
+            </w:r>
+          </w:p>
+        </w:tc>
+      </w:tr>
+      <w:tr>
+        <w:tc>
+          <w:tcPr>
+            <w:tcW w:type="dxa" w:w="3600"/>
+            <w:shd w:fill="EAF2F5" w:color="auto" w:val="clear"/>
+            <w:tcMar>
+              <w:top w:type="dxa" w:w="80"/>
+              <w:left w:type="dxa" w:w="120"/>
+              <w:bottom w:type="dxa" w:w="80"/>
+              <w:right w:type="dxa" w:w="120"/>
+            </w:tcMar>
+          </w:tcPr>
+          <w:p>
+            <w:pPr>
+              <w:spacing w:after="40"/>
+            </w:pPr>
+            <w:r>
+              <w:rPr>
+                <w:rFonts w:ascii="Calibri" w:cs="Calibri" w:eastAsia="Calibri" w:hAnsi="Calibri"/>
+                <w:b/>
+                <w:bCs/>
+                <w:sz w:val="20"/>
+                <w:szCs w:val="20"/>
+              </w:rPr>
               <w:t xml:space="preserve">Auditoría</w:t>
             </w:r>
           </w:p>
@@ -16487,6 +16783,7 @@
         <w:tc>
           <w:tcPr>
             <w:tcW w:type="dxa" w:w="3000"/>
+            <w:shd w:fill="EAF2F5" w:color="auto" w:val="clear"/>
             <w:tcMar>
               <w:top w:type="dxa" w:w="80"/>
               <w:left w:type="dxa" w:w="120"/>
@@ -16513,6 +16810,7 @@
         <w:tc>
           <w:tcPr>
             <w:tcW w:type="dxa" w:w="7800"/>
+            <w:shd w:fill="EAF2F5" w:color="auto" w:val="clear"/>
             <w:tcMar>
               <w:top w:type="dxa" w:w="80"/>
               <w:left w:type="dxa" w:w="120"/>
@@ -16861,7 +17159,7 @@
                 <w:sz w:val="20"/>
                 <w:szCs w:val="20"/>
               </w:rPr>
-              <w:t xml:space="preserve">Crear / editar minuta</w:t>
+              <w:t xml:space="preserve">Crear / editar minuta (borrador)</w:t>
             </w:r>
           </w:p>
         </w:tc>
@@ -16939,7 +17237,7 @@
                 <w:sz w:val="20"/>
                 <w:szCs w:val="20"/>
               </w:rPr>
-              <w:t xml:space="preserve">●</w:t>
+              <w:t xml:space="preserve">○</w:t>
             </w:r>
           </w:p>
         </w:tc>
@@ -16991,7 +17289,7 @@
                 <w:sz w:val="20"/>
                 <w:szCs w:val="20"/>
               </w:rPr>
-              <w:t xml:space="preserve">○</w:t>
+              <w:t xml:space="preserve"/>
             </w:r>
           </w:p>
         </w:tc>
@@ -17874,6 +18172,434 @@
                 <w:szCs w:val="20"/>
               </w:rPr>
               <w:t xml:space="preserve">●</w:t>
+            </w:r>
+          </w:p>
+        </w:tc>
+        <w:tc>
+          <w:tcPr>
+            <w:tcW w:type="dxa" w:w="1400"/>
+            <w:tcMar>
+              <w:top w:type="dxa" w:w="80"/>
+              <w:left w:type="dxa" w:w="120"/>
+              <w:bottom w:type="dxa" w:w="80"/>
+              <w:right w:type="dxa" w:w="120"/>
+            </w:tcMar>
+          </w:tcPr>
+          <w:p>
+            <w:pPr>
+              <w:spacing w:after="40"/>
+            </w:pPr>
+            <w:r>
+              <w:rPr>
+                <w:rFonts w:ascii="Calibri" w:cs="Calibri" w:eastAsia="Calibri" w:hAnsi="Calibri"/>
+                <w:b w:val="false"/>
+                <w:bCs w:val="false"/>
+                <w:sz w:val="20"/>
+                <w:szCs w:val="20"/>
+              </w:rPr>
+              <w:t xml:space="preserve"/>
+            </w:r>
+          </w:p>
+        </w:tc>
+      </w:tr>
+      <w:tr>
+        <w:tc>
+          <w:tcPr>
+            <w:tcW w:type="dxa" w:w="4000"/>
+            <w:shd w:fill="EAF2F5" w:color="auto" w:val="clear"/>
+            <w:tcMar>
+              <w:top w:type="dxa" w:w="80"/>
+              <w:left w:type="dxa" w:w="120"/>
+              <w:bottom w:type="dxa" w:w="80"/>
+              <w:right w:type="dxa" w:w="120"/>
+            </w:tcMar>
+          </w:tcPr>
+          <w:p>
+            <w:pPr>
+              <w:spacing w:after="40"/>
+            </w:pPr>
+            <w:r>
+              <w:rPr>
+                <w:rFonts w:ascii="Calibri" w:cs="Calibri" w:eastAsia="Calibri" w:hAnsi="Calibri"/>
+                <w:b/>
+                <w:bCs/>
+                <w:sz w:val="20"/>
+                <w:szCs w:val="20"/>
+              </w:rPr>
+              <w:t xml:space="preserve">Cargar operación de préstamo</w:t>
+            </w:r>
+          </w:p>
+        </w:tc>
+        <w:tc>
+          <w:tcPr>
+            <w:tcW w:type="dxa" w:w="1500"/>
+            <w:shd w:fill="EAF2F5" w:color="auto" w:val="clear"/>
+            <w:tcMar>
+              <w:top w:type="dxa" w:w="80"/>
+              <w:left w:type="dxa" w:w="120"/>
+              <w:bottom w:type="dxa" w:w="80"/>
+              <w:right w:type="dxa" w:w="120"/>
+            </w:tcMar>
+          </w:tcPr>
+          <w:p>
+            <w:pPr>
+              <w:spacing w:after="40"/>
+            </w:pPr>
+            <w:r>
+              <w:rPr>
+                <w:rFonts w:ascii="Calibri" w:cs="Calibri" w:eastAsia="Calibri" w:hAnsi="Calibri"/>
+                <w:b w:val="false"/>
+                <w:bCs w:val="false"/>
+                <w:sz w:val="20"/>
+                <w:szCs w:val="20"/>
+              </w:rPr>
+              <w:t xml:space="preserve">●</w:t>
+            </w:r>
+          </w:p>
+        </w:tc>
+        <w:tc>
+          <w:tcPr>
+            <w:tcW w:type="dxa" w:w="1600"/>
+            <w:shd w:fill="EAF2F5" w:color="auto" w:val="clear"/>
+            <w:tcMar>
+              <w:top w:type="dxa" w:w="80"/>
+              <w:left w:type="dxa" w:w="120"/>
+              <w:bottom w:type="dxa" w:w="80"/>
+              <w:right w:type="dxa" w:w="120"/>
+            </w:tcMar>
+          </w:tcPr>
+          <w:p>
+            <w:pPr>
+              <w:spacing w:after="40"/>
+            </w:pPr>
+            <w:r>
+              <w:rPr>
+                <w:rFonts w:ascii="Calibri" w:cs="Calibri" w:eastAsia="Calibri" w:hAnsi="Calibri"/>
+                <w:b w:val="false"/>
+                <w:bCs w:val="false"/>
+                <w:sz w:val="20"/>
+                <w:szCs w:val="20"/>
+              </w:rPr>
+              <w:t xml:space="preserve"/>
+            </w:r>
+          </w:p>
+        </w:tc>
+        <w:tc>
+          <w:tcPr>
+            <w:tcW w:type="dxa" w:w="1400"/>
+            <w:shd w:fill="EAF2F5" w:color="auto" w:val="clear"/>
+            <w:tcMar>
+              <w:top w:type="dxa" w:w="80"/>
+              <w:left w:type="dxa" w:w="120"/>
+              <w:bottom w:type="dxa" w:w="80"/>
+              <w:right w:type="dxa" w:w="120"/>
+            </w:tcMar>
+          </w:tcPr>
+          <w:p>
+            <w:pPr>
+              <w:spacing w:after="40"/>
+            </w:pPr>
+            <w:r>
+              <w:rPr>
+                <w:rFonts w:ascii="Calibri" w:cs="Calibri" w:eastAsia="Calibri" w:hAnsi="Calibri"/>
+                <w:b w:val="false"/>
+                <w:bCs w:val="false"/>
+                <w:sz w:val="20"/>
+                <w:szCs w:val="20"/>
+              </w:rPr>
+              <w:t xml:space="preserve"/>
+            </w:r>
+          </w:p>
+        </w:tc>
+        <w:tc>
+          <w:tcPr>
+            <w:tcW w:type="dxa" w:w="1100"/>
+            <w:shd w:fill="EAF2F5" w:color="auto" w:val="clear"/>
+            <w:tcMar>
+              <w:top w:type="dxa" w:w="80"/>
+              <w:left w:type="dxa" w:w="120"/>
+              <w:bottom w:type="dxa" w:w="80"/>
+              <w:right w:type="dxa" w:w="120"/>
+            </w:tcMar>
+          </w:tcPr>
+          <w:p>
+            <w:pPr>
+              <w:spacing w:after="40"/>
+            </w:pPr>
+            <w:r>
+              <w:rPr>
+                <w:rFonts w:ascii="Calibri" w:cs="Calibri" w:eastAsia="Calibri" w:hAnsi="Calibri"/>
+                <w:b w:val="false"/>
+                <w:bCs w:val="false"/>
+                <w:sz w:val="20"/>
+                <w:szCs w:val="20"/>
+              </w:rPr>
+              <w:t xml:space="preserve"/>
+            </w:r>
+          </w:p>
+        </w:tc>
+        <w:tc>
+          <w:tcPr>
+            <w:tcW w:type="dxa" w:w="2000"/>
+            <w:shd w:fill="EAF2F5" w:color="auto" w:val="clear"/>
+            <w:tcMar>
+              <w:top w:type="dxa" w:w="80"/>
+              <w:left w:type="dxa" w:w="120"/>
+              <w:bottom w:type="dxa" w:w="80"/>
+              <w:right w:type="dxa" w:w="120"/>
+            </w:tcMar>
+          </w:tcPr>
+          <w:p>
+            <w:pPr>
+              <w:spacing w:after="40"/>
+            </w:pPr>
+            <w:r>
+              <w:rPr>
+                <w:rFonts w:ascii="Calibri" w:cs="Calibri" w:eastAsia="Calibri" w:hAnsi="Calibri"/>
+                <w:b w:val="false"/>
+                <w:bCs w:val="false"/>
+                <w:sz w:val="20"/>
+                <w:szCs w:val="20"/>
+              </w:rPr>
+              <w:t xml:space="preserve"/>
+            </w:r>
+          </w:p>
+        </w:tc>
+        <w:tc>
+          <w:tcPr>
+            <w:tcW w:type="dxa" w:w="1400"/>
+            <w:shd w:fill="EAF2F5" w:color="auto" w:val="clear"/>
+            <w:tcMar>
+              <w:top w:type="dxa" w:w="80"/>
+              <w:left w:type="dxa" w:w="120"/>
+              <w:bottom w:type="dxa" w:w="80"/>
+              <w:right w:type="dxa" w:w="120"/>
+            </w:tcMar>
+          </w:tcPr>
+          <w:p>
+            <w:pPr>
+              <w:spacing w:after="40"/>
+            </w:pPr>
+            <w:r>
+              <w:rPr>
+                <w:rFonts w:ascii="Calibri" w:cs="Calibri" w:eastAsia="Calibri" w:hAnsi="Calibri"/>
+                <w:b w:val="false"/>
+                <w:bCs w:val="false"/>
+                <w:sz w:val="20"/>
+                <w:szCs w:val="20"/>
+              </w:rPr>
+              <w:t xml:space="preserve"/>
+            </w:r>
+          </w:p>
+        </w:tc>
+        <w:tc>
+          <w:tcPr>
+            <w:tcW w:type="dxa" w:w="1400"/>
+            <w:shd w:fill="EAF2F5" w:color="auto" w:val="clear"/>
+            <w:tcMar>
+              <w:top w:type="dxa" w:w="80"/>
+              <w:left w:type="dxa" w:w="120"/>
+              <w:bottom w:type="dxa" w:w="80"/>
+              <w:right w:type="dxa" w:w="120"/>
+            </w:tcMar>
+          </w:tcPr>
+          <w:p>
+            <w:pPr>
+              <w:spacing w:after="40"/>
+            </w:pPr>
+            <w:r>
+              <w:rPr>
+                <w:rFonts w:ascii="Calibri" w:cs="Calibri" w:eastAsia="Calibri" w:hAnsi="Calibri"/>
+                <w:b w:val="false"/>
+                <w:bCs w:val="false"/>
+                <w:sz w:val="20"/>
+                <w:szCs w:val="20"/>
+              </w:rPr>
+              <w:t xml:space="preserve"/>
+            </w:r>
+          </w:p>
+        </w:tc>
+      </w:tr>
+      <w:tr>
+        <w:tc>
+          <w:tcPr>
+            <w:tcW w:type="dxa" w:w="4000"/>
+            <w:tcMar>
+              <w:top w:type="dxa" w:w="80"/>
+              <w:left w:type="dxa" w:w="120"/>
+              <w:bottom w:type="dxa" w:w="80"/>
+              <w:right w:type="dxa" w:w="120"/>
+            </w:tcMar>
+          </w:tcPr>
+          <w:p>
+            <w:pPr>
+              <w:spacing w:after="40"/>
+            </w:pPr>
+            <w:r>
+              <w:rPr>
+                <w:rFonts w:ascii="Calibri" w:cs="Calibri" w:eastAsia="Calibri" w:hAnsi="Calibri"/>
+                <w:b/>
+                <w:bCs/>
+                <w:sz w:val="20"/>
+                <w:szCs w:val="20"/>
+              </w:rPr>
+              <w:t xml:space="preserve">Cargar prefinanciación de expo / impo</w:t>
+            </w:r>
+          </w:p>
+        </w:tc>
+        <w:tc>
+          <w:tcPr>
+            <w:tcW w:type="dxa" w:w="1500"/>
+            <w:tcMar>
+              <w:top w:type="dxa" w:w="80"/>
+              <w:left w:type="dxa" w:w="120"/>
+              <w:bottom w:type="dxa" w:w="80"/>
+              <w:right w:type="dxa" w:w="120"/>
+            </w:tcMar>
+          </w:tcPr>
+          <w:p>
+            <w:pPr>
+              <w:spacing w:after="40"/>
+            </w:pPr>
+            <w:r>
+              <w:rPr>
+                <w:rFonts w:ascii="Calibri" w:cs="Calibri" w:eastAsia="Calibri" w:hAnsi="Calibri"/>
+                <w:b w:val="false"/>
+                <w:bCs w:val="false"/>
+                <w:sz w:val="20"/>
+                <w:szCs w:val="20"/>
+              </w:rPr>
+              <w:t xml:space="preserve">●</w:t>
+            </w:r>
+          </w:p>
+        </w:tc>
+        <w:tc>
+          <w:tcPr>
+            <w:tcW w:type="dxa" w:w="1600"/>
+            <w:tcMar>
+              <w:top w:type="dxa" w:w="80"/>
+              <w:left w:type="dxa" w:w="120"/>
+              <w:bottom w:type="dxa" w:w="80"/>
+              <w:right w:type="dxa" w:w="120"/>
+            </w:tcMar>
+          </w:tcPr>
+          <w:p>
+            <w:pPr>
+              <w:spacing w:after="40"/>
+            </w:pPr>
+            <w:r>
+              <w:rPr>
+                <w:rFonts w:ascii="Calibri" w:cs="Calibri" w:eastAsia="Calibri" w:hAnsi="Calibri"/>
+                <w:b w:val="false"/>
+                <w:bCs w:val="false"/>
+                <w:sz w:val="20"/>
+                <w:szCs w:val="20"/>
+              </w:rPr>
+              <w:t xml:space="preserve"/>
+            </w:r>
+          </w:p>
+        </w:tc>
+        <w:tc>
+          <w:tcPr>
+            <w:tcW w:type="dxa" w:w="1400"/>
+            <w:tcMar>
+              <w:top w:type="dxa" w:w="80"/>
+              <w:left w:type="dxa" w:w="120"/>
+              <w:bottom w:type="dxa" w:w="80"/>
+              <w:right w:type="dxa" w:w="120"/>
+            </w:tcMar>
+          </w:tcPr>
+          <w:p>
+            <w:pPr>
+              <w:spacing w:after="40"/>
+            </w:pPr>
+            <w:r>
+              <w:rPr>
+                <w:rFonts w:ascii="Calibri" w:cs="Calibri" w:eastAsia="Calibri" w:hAnsi="Calibri"/>
+                <w:b w:val="false"/>
+                <w:bCs w:val="false"/>
+                <w:sz w:val="20"/>
+                <w:szCs w:val="20"/>
+              </w:rPr>
+              <w:t xml:space="preserve"/>
+            </w:r>
+          </w:p>
+        </w:tc>
+        <w:tc>
+          <w:tcPr>
+            <w:tcW w:type="dxa" w:w="1100"/>
+            <w:tcMar>
+              <w:top w:type="dxa" w:w="80"/>
+              <w:left w:type="dxa" w:w="120"/>
+              <w:bottom w:type="dxa" w:w="80"/>
+              <w:right w:type="dxa" w:w="120"/>
+            </w:tcMar>
+          </w:tcPr>
+          <w:p>
+            <w:pPr>
+              <w:spacing w:after="40"/>
+            </w:pPr>
+            <w:r>
+              <w:rPr>
+                <w:rFonts w:ascii="Calibri" w:cs="Calibri" w:eastAsia="Calibri" w:hAnsi="Calibri"/>
+                <w:b w:val="false"/>
+                <w:bCs w:val="false"/>
+                <w:sz w:val="20"/>
+                <w:szCs w:val="20"/>
+              </w:rPr>
+              <w:t xml:space="preserve"/>
+            </w:r>
+          </w:p>
+        </w:tc>
+        <w:tc>
+          <w:tcPr>
+            <w:tcW w:type="dxa" w:w="2000"/>
+            <w:tcMar>
+              <w:top w:type="dxa" w:w="80"/>
+              <w:left w:type="dxa" w:w="120"/>
+              <w:bottom w:type="dxa" w:w="80"/>
+              <w:right w:type="dxa" w:w="120"/>
+            </w:tcMar>
+          </w:tcPr>
+          <w:p>
+            <w:pPr>
+              <w:spacing w:after="40"/>
+            </w:pPr>
+            <w:r>
+              <w:rPr>
+                <w:rFonts w:ascii="Calibri" w:cs="Calibri" w:eastAsia="Calibri" w:hAnsi="Calibri"/>
+                <w:b w:val="false"/>
+                <w:bCs w:val="false"/>
+                <w:sz w:val="20"/>
+                <w:szCs w:val="20"/>
+              </w:rPr>
+              <w:t xml:space="preserve"/>
+            </w:r>
+          </w:p>
+        </w:tc>
+        <w:tc>
+          <w:tcPr>
+            <w:tcW w:type="dxa" w:w="1400"/>
+            <w:tcMar>
+              <w:top w:type="dxa" w:w="80"/>
+              <w:left w:type="dxa" w:w="120"/>
+              <w:bottom w:type="dxa" w:w="80"/>
+              <w:right w:type="dxa" w:w="120"/>
+            </w:tcMar>
+          </w:tcPr>
+          <w:p>
+            <w:pPr>
+              <w:spacing w:after="40"/>
+            </w:pPr>
+            <w:r>
+              <w:rPr>
+                <w:rFonts w:ascii="Calibri" w:cs="Calibri" w:eastAsia="Calibri" w:hAnsi="Calibri"/>
+                <w:b w:val="false"/>
+                <w:bCs w:val="false"/>
+                <w:sz w:val="20"/>
+                <w:szCs w:val="20"/>
+              </w:rPr>
+              <w:t xml:space="preserve"/>
             </w:r>
           </w:p>
         </w:tc>
@@ -19425,102 +20151,25 @@
     </w:p>
     <w:p>
       <w:pPr>
-        <w:spacing w:after="80" w:before="180"/>
+        <w:spacing w:after="100" w:before="120"/>
       </w:pPr>
       <w:r>
         <w:rPr>
           <w:rFonts w:ascii="Calibri" w:cs="Calibri" w:eastAsia="Calibri" w:hAnsi="Calibri"/>
           <w:b/>
           <w:bCs/>
-          <w:color w:val="1F3A5F"/>
-          <w:sz w:val="24"/>
-          <w:szCs w:val="24"/>
+          <w:sz w:val="20"/>
+          <w:szCs w:val="20"/>
         </w:rPr>
-        <w:t xml:space="preserve">Otros actores</w:t>
-      </w:r>
-    </w:p>
-    <w:p>
-      <w:pPr>
-        <w:pStyle w:val="ListParagraph"/>
-        <w:numPr>
-          <w:ilvl w:val="0"/>
-          <w:numId w:val="2"/>
-        </w:numPr>
-        <w:spacing w:after="60"/>
-      </w:pPr>
-      <w:r>
-        <w:rPr>
-          <w:rFonts w:ascii="Calibri" w:cs="Calibri" w:eastAsia="Calibri" w:hAnsi="Calibri"/>
-          <w:b/>
-          <w:bCs/>
-          <w:sz w:val="22"/>
-          <w:szCs w:val="22"/>
-        </w:rPr>
-        <w:t xml:space="preserve">Red BI: </w:t>
+        <w:t xml:space="preserve">Otros actores: </w:t>
       </w:r>
       <w:r>
         <w:rPr>
           <w:rFonts w:ascii="Calibri" w:cs="Calibri" w:eastAsia="Calibri" w:hAnsi="Calibri"/>
-          <w:sz w:val="22"/>
-          <w:szCs w:val="22"/>
+          <w:sz w:val="20"/>
+          <w:szCs w:val="20"/>
         </w:rPr>
-        <w:t xml:space="preserve">desarrollo de las funcionalidades en COBIS Web.</w:t>
-      </w:r>
-    </w:p>
-    <w:p>
-      <w:pPr>
-        <w:pStyle w:val="ListParagraph"/>
-        <w:numPr>
-          <w:ilvl w:val="0"/>
-          <w:numId w:val="2"/>
-        </w:numPr>
-        <w:spacing w:after="60"/>
-      </w:pPr>
-      <w:r>
-        <w:rPr>
-          <w:rFonts w:ascii="Calibri" w:cs="Calibri" w:eastAsia="Calibri" w:hAnsi="Calibri"/>
-          <w:b/>
-          <w:bCs/>
-          <w:sz w:val="22"/>
-          <w:szCs w:val="22"/>
-        </w:rPr>
-        <w:t xml:space="preserve">Accusys: </w:t>
-      </w:r>
-      <w:r>
-        <w:rPr>
-          <w:rFonts w:ascii="Calibri" w:cs="Calibri" w:eastAsia="Calibri" w:hAnsi="Calibri"/>
-          <w:sz w:val="22"/>
-          <w:szCs w:val="22"/>
-        </w:rPr>
-        <w:t xml:space="preserve">definición de la línea en USD ajustable en pesos.</w:t>
-      </w:r>
-    </w:p>
-    <w:p>
-      <w:pPr>
-        <w:pStyle w:val="ListParagraph"/>
-        <w:numPr>
-          <w:ilvl w:val="0"/>
-          <w:numId w:val="2"/>
-        </w:numPr>
-        <w:spacing w:after="60"/>
-      </w:pPr>
-      <w:r>
-        <w:rPr>
-          <w:rFonts w:ascii="Calibri" w:cs="Calibri" w:eastAsia="Calibri" w:hAnsi="Calibri"/>
-          <w:b/>
-          <w:bCs/>
-          <w:sz w:val="22"/>
-          <w:szCs w:val="22"/>
-        </w:rPr>
-        <w:t xml:space="preserve">Sistemas / Operaciones (Daniel Semino, Jonathan Domínguez): </w:t>
-      </w:r>
-      <w:r>
-        <w:rPr>
-          <w:rFonts w:ascii="Calibri" w:cs="Calibri" w:eastAsia="Calibri" w:hAnsi="Calibri"/>
-          <w:sz w:val="22"/>
-          <w:szCs w:val="22"/>
-        </w:rPr>
-        <w:t xml:space="preserve">relevamiento, coordinación y seguimiento del proyecto.</w:t>
+        <w:t xml:space="preserve">Red BI (desarrollo en COBIS Web) · Accusys (línea en USD ajustable en pesos) · Sistemas / Operaciones, Daniel Semino y Jonathan Domínguez (relevamiento, coordinación y seguimiento).</w:t>
       </w:r>
     </w:p>
     <w:p>
@@ -20509,7 +21158,7 @@
                 <w:sz w:val="20"/>
                 <w:szCs w:val="20"/>
               </w:rPr>
-              <w:t xml:space="preserve">C (pantalla de líneas) · E (descubiertos) · F (renovaciones) · G (seguimiento)</w:t>
+              <w:t xml:space="preserve">D (pantalla de líneas) · E (descubiertos) · F (renovaciones) · G (seguimiento)</w:t>
             </w:r>
           </w:p>
         </w:tc>
@@ -20617,7 +21266,7 @@
                 <w:sz w:val="20"/>
                 <w:szCs w:val="20"/>
               </w:rPr>
-              <w:t xml:space="preserve">I (cheques) · J (reportes) · D (USD ajustable)</w:t>
+              <w:t xml:space="preserve">I (cheques) · J (reportes) · C (USD ajustable)</w:t>
             </w:r>
           </w:p>
         </w:tc>
@@ -20989,7 +21638,7 @@
                 <w:sz w:val="20"/>
                 <w:szCs w:val="20"/>
               </w:rPr>
-              <w:t xml:space="preserve">Bloquea el Módulo D</w:t>
+              <w:t xml:space="preserve">Bloquea el Módulo C</w:t>
             </w:r>
           </w:p>
         </w:tc>
@@ -21152,7 +21801,7 @@
                 <w:sz w:val="20"/>
                 <w:szCs w:val="20"/>
               </w:rPr>
-              <w:t xml:space="preserve">Líneas pendientes de garantía</w:t>
+              <w:t xml:space="preserve">Subproductos pendientes de garantía</w:t>
             </w:r>
           </w:p>
         </w:tc>
@@ -21296,7 +21945,7 @@
           <w:sz w:val="22"/>
           <w:szCs w:val="22"/>
         </w:rPr>
-        <w:t xml:space="preserve">Quién carga la minuta en la nueva pantalla (Riesgos, el oficial o ambos) y quién la aprueba en el sistema durante el comité.</w:t>
+        <w:t xml:space="preserve">Quién registra en el sistema la aprobación durante el comité (el borrador lo carga Riesgos).</w:t>
       </w:r>
     </w:p>
     <w:p>
@@ -21315,6 +21964,24 @@
           <w:szCs w:val="22"/>
         </w:rPr>
         <w:t xml:space="preserve">Lista definitiva de acciones automáticas de la aprobación y qué pasa si una falla.</w:t>
+      </w:r>
+    </w:p>
+    <w:p>
+      <w:pPr>
+        <w:pStyle w:val="ListParagraph"/>
+        <w:numPr>
+          <w:ilvl w:val="0"/>
+          <w:numId w:val="2"/>
+        </w:numPr>
+        <w:spacing w:after="60"/>
+      </w:pPr>
+      <w:r>
+        <w:rPr>
+          <w:rFonts w:ascii="Calibri" w:cs="Calibri" w:eastAsia="Calibri" w:hAnsi="Calibri"/>
+          <w:sz w:val="22"/>
+          <w:szCs w:val="22"/>
+        </w:rPr>
+        <w:t xml:space="preserve">Relevar el circuito de carga de préstamos y de prefinanciaciones de exportaciones e importaciones desde la pantalla de líneas.</w:t>
       </w:r>
     </w:p>
     <w:p>

</xml_diff>

<commit_message>
Nuevo circuito de descuento de cheques y recibos en vencimientos
Co-Authored-By: Claude Opus 5.5 <noreply@anthropic.com>
Claude-Session: https://claude.ai/code/session_01JR48ZtjHAJWp3RfTGUyHxs
</commit_message>
<xml_diff>
--- a/Presentacion_Nueva_Aplicacion_Gestion_Middle_Office.docx
+++ b/Presentacion_Nueva_Aplicacion_Gestion_Middle_Office.docx
@@ -624,7 +624,7 @@
                 <w:sz w:val="20"/>
                 <w:szCs w:val="20"/>
               </w:rPr>
-              <w:t xml:space="preserve">Módulo H · Cheques</w:t>
+              <w:t xml:space="preserve">Módulo H · Descuento de cheques</w:t>
             </w:r>
           </w:p>
         </w:tc>
@@ -6123,7 +6123,7 @@
                 <w:sz w:val="20"/>
                 <w:szCs w:val="20"/>
               </w:rPr>
-              <w:t xml:space="preserve">Cheques</w:t>
+              <w:t xml:space="preserve">Descuento de cheques</w:t>
             </w:r>
           </w:p>
         </w:tc>
@@ -6150,7 +6150,7 @@
                 <w:sz w:val="20"/>
                 <w:szCs w:val="20"/>
               </w:rPr>
-              <w:t xml:space="preserve">Endoso, verificación, liquidación, revisión de pendientes y preliquidación</w:t>
+              <w:t xml:space="preserve">Cheques endosados, selección con scoring, control de línea, simulación, excepciones por Riesgos, acuerdo marco y desembolso</w:t>
             </w:r>
           </w:p>
         </w:tc>
@@ -11318,7 +11318,7 @@
                 <w:sz w:val="20"/>
                 <w:szCs w:val="20"/>
               </w:rPr>
-              <w:t xml:space="preserve">Abre el circuito de cheques (Módulo H) sobre la línea</w:t>
+              <w:t xml:space="preserve">Abre la operación de descuento (Módulo H) con los cheques endosados por el cliente</w:t>
             </w:r>
           </w:p>
         </w:tc>
@@ -14550,7 +14550,7 @@
           <w:sz w:val="34"/>
           <w:szCs w:val="34"/>
         </w:rPr>
-        <w:t xml:space="preserve">Módulo H · Cheques</w:t>
+        <w:t xml:space="preserve">Módulo H · Descuento de cheques</w:t>
       </w:r>
     </w:p>
     <w:p>
@@ -14569,7 +14569,23 @@
           <w:sz w:val="22"/>
           <w:szCs w:val="22"/>
         </w:rPr>
-        <w:t xml:space="preserve">Descuento de cheques sobre una línea aprobada</w:t>
+        <w:t xml:space="preserve">Circuito propuesto: de los cheques endosados a la operación desembolsada</w:t>
+      </w:r>
+    </w:p>
+    <w:p>
+      <w:pPr>
+        <w:spacing w:after="80" w:before="0"/>
+      </w:pPr>
+      <w:r>
+        <w:rPr>
+          <w:rFonts w:ascii="Calibri" w:cs="Calibri" w:eastAsia="Calibri" w:hAnsi="Calibri"/>
+          <w:b/>
+          <w:bCs/>
+          <w:color w:val="1F3A5F"/>
+          <w:sz w:val="24"/>
+          <w:szCs w:val="24"/>
+        </w:rPr>
+        <w:t xml:space="preserve">Selección y aprobación de los cheques</w:t>
       </w:r>
     </w:p>
     <w:tbl>
@@ -14585,22 +14601,18 @@
         </w:tblBorders>
       </w:tblPr>
       <w:tblGrid>
-        <w:gridCol w:w="2100"/>
+        <w:gridCol w:w="3330"/>
         <w:gridCol w:w="360"/>
-        <w:gridCol w:w="2100"/>
+        <w:gridCol w:w="3330"/>
         <w:gridCol w:w="360"/>
-        <w:gridCol w:w="2100"/>
+        <w:gridCol w:w="3330"/>
         <w:gridCol w:w="360"/>
-        <w:gridCol w:w="2100"/>
-        <w:gridCol w:w="360"/>
-        <w:gridCol w:w="2100"/>
-        <w:gridCol w:w="360"/>
-        <w:gridCol w:w="2100"/>
+        <w:gridCol w:w="3330"/>
       </w:tblGrid>
       <w:tr>
         <w:tc>
           <w:tcPr>
-            <w:tcW w:type="dxa" w:w="2100"/>
+            <w:tcW w:type="dxa" w:w="3330"/>
             <w:tcBorders>
               <w:top w:val="single" w:color="2E7D8C" w:sz="6"/>
               <w:left w:val="single" w:color="2E7D8C" w:sz="6"/>
@@ -14628,7 +14640,7 @@
                 <w:sz w:val="20"/>
                 <w:szCs w:val="20"/>
               </w:rPr>
-              <w:t xml:space="preserve">1 · Línea</w:t>
+              <w:t xml:space="preserve">1 · Endoso</w:t>
             </w:r>
           </w:p>
           <w:p>
@@ -14642,7 +14654,7 @@
                 <w:sz w:val="18"/>
                 <w:szCs w:val="18"/>
               </w:rPr>
-              <w:t xml:space="preserve">El cliente tiene línea vigente</w:t>
+              <w:t xml:space="preserve">El cliente endosa a favor de VALO los cheques a descontar</w:t>
             </w:r>
           </w:p>
         </w:tc>
@@ -14674,7 +14686,7 @@
         </w:tc>
         <w:tc>
           <w:tcPr>
-            <w:tcW w:type="dxa" w:w="2100"/>
+            <w:tcW w:type="dxa" w:w="3330"/>
             <w:tcBorders>
               <w:top w:val="single" w:color="2E7D8C" w:sz="6"/>
               <w:left w:val="single" w:color="2E7D8C" w:sz="6"/>
@@ -14702,7 +14714,7 @@
                 <w:sz w:val="20"/>
                 <w:szCs w:val="20"/>
               </w:rPr>
-              <w:t xml:space="preserve">2 · Endoso</w:t>
+              <w:t xml:space="preserve">2 · Carga</w:t>
             </w:r>
           </w:p>
           <w:p>
@@ -14715,7 +14727,7 @@
                 <w:sz w:val="18"/>
                 <w:szCs w:val="18"/>
               </w:rPr>
-              <w:t xml:space="preserve">El cliente endosa todos los cheques a favor de VALO</w:t>
+              <w:t xml:space="preserve">Middle Office carga la operación de descuento desde la pantalla de líneas; el sistema trae todos los cheques endosados</w:t>
             </w:r>
           </w:p>
         </w:tc>
@@ -14747,7 +14759,7 @@
         </w:tc>
         <w:tc>
           <w:tcPr>
-            <w:tcW w:type="dxa" w:w="2100"/>
+            <w:tcW w:type="dxa" w:w="3330"/>
             <w:tcBorders>
               <w:top w:val="single" w:color="2E7D8C" w:sz="6"/>
               <w:left w:val="single" w:color="2E7D8C" w:sz="6"/>
@@ -14775,7 +14787,7 @@
                 <w:sz w:val="20"/>
                 <w:szCs w:val="20"/>
               </w:rPr>
-              <w:t xml:space="preserve">3 · Verificación</w:t>
+              <w:t xml:space="preserve">3 · Selección y scoring</w:t>
             </w:r>
           </w:p>
           <w:p>
@@ -14788,7 +14800,7 @@
                 <w:sz w:val="18"/>
                 <w:szCs w:val="18"/>
               </w:rPr>
-              <w:t xml:space="preserve">Corre el proceso de verificación de aceptación (desarrollado por Martín)</w:t>
+              <w:t xml:space="preserve">Middle selecciona los cheques, que pasan por la validación de scoring (desarrollo de modernización)</w:t>
             </w:r>
           </w:p>
         </w:tc>
@@ -14820,7 +14832,7 @@
         </w:tc>
         <w:tc>
           <w:tcPr>
-            <w:tcW w:type="dxa" w:w="2100"/>
+            <w:tcW w:type="dxa" w:w="3330"/>
             <w:tcBorders>
               <w:top w:val="single" w:color="2E7D8C" w:sz="6"/>
               <w:left w:val="single" w:color="2E7D8C" w:sz="6"/>
@@ -14848,7 +14860,7 @@
                 <w:sz w:val="20"/>
                 <w:szCs w:val="20"/>
               </w:rPr>
-              <w:t xml:space="preserve">4 · Liquidación</w:t>
+              <w:t xml:space="preserve">4 · Línea</w:t>
             </w:r>
           </w:p>
           <w:p>
@@ -14861,153 +14873,7 @@
                 <w:sz w:val="18"/>
                 <w:szCs w:val="18"/>
               </w:rPr>
-              <w:t xml:space="preserve">Con OK, Middle selecciona los cheques y los liquida</w:t>
-            </w:r>
-          </w:p>
-        </w:tc>
-        <w:tc>
-          <w:tcPr>
-            <w:tcW w:type="dxa" w:w="360"/>
-            <w:tcBorders>
-              <w:top w:val="none" w:color="FFFFFF" w:sz="0"/>
-              <w:left w:val="none" w:color="FFFFFF" w:sz="0"/>
-              <w:bottom w:val="none" w:color="FFFFFF" w:sz="0"/>
-              <w:right w:val="none" w:color="FFFFFF" w:sz="0"/>
-            </w:tcBorders>
-            <w:vAlign w:val="center"/>
-          </w:tcPr>
-          <w:p>
-            <w:pPr>
-              <w:jc w:val="center"/>
-            </w:pPr>
-            <w:r>
-              <w:rPr>
-                <w:rFonts w:ascii="Calibri" w:cs="Calibri" w:eastAsia="Calibri" w:hAnsi="Calibri"/>
-                <w:color w:val="2E7D8C"/>
-                <w:sz w:val="22"/>
-                <w:szCs w:val="22"/>
-              </w:rPr>
-              <w:t xml:space="preserve">►</w:t>
-            </w:r>
-          </w:p>
-        </w:tc>
-        <w:tc>
-          <w:tcPr>
-            <w:tcW w:type="dxa" w:w="2100"/>
-            <w:tcBorders>
-              <w:top w:val="single" w:color="2E7D8C" w:sz="6"/>
-              <w:left w:val="single" w:color="2E7D8C" w:sz="6"/>
-              <w:bottom w:val="single" w:color="2E7D8C" w:sz="6"/>
-              <w:right w:val="single" w:color="2E7D8C" w:sz="6"/>
-            </w:tcBorders>
-            <w:shd w:fill="EAF2F5" w:color="auto" w:val="clear"/>
-            <w:tcMar>
-              <w:top w:type="dxa" w:w="100"/>
-              <w:left w:type="dxa" w:w="110"/>
-              <w:bottom w:type="dxa" w:w="100"/>
-              <w:right w:type="dxa" w:w="110"/>
-            </w:tcMar>
-          </w:tcPr>
-          <w:p>
-            <w:pPr>
-              <w:spacing w:after="60"/>
-            </w:pPr>
-            <w:r>
-              <w:rPr>
-                <w:rFonts w:ascii="Calibri" w:cs="Calibri" w:eastAsia="Calibri" w:hAnsi="Calibri"/>
-                <w:b/>
-                <w:bCs/>
-                <w:color w:val="1F3A5F"/>
-                <w:sz w:val="20"/>
-                <w:szCs w:val="20"/>
-              </w:rPr>
-              <w:t xml:space="preserve">5 · Pendientes</w:t>
-            </w:r>
-          </w:p>
-          <w:p>
-            <w:pPr>
-              <w:spacing w:after="0"/>
-            </w:pPr>
-            <w:r>
-              <w:rPr>
-                <w:rFonts w:ascii="Calibri" w:cs="Calibri" w:eastAsia="Calibri" w:hAnsi="Calibri"/>
-                <w:sz w:val="18"/>
-                <w:szCs w:val="18"/>
-              </w:rPr>
-              <w:t xml:space="preserve">Riesgos revisa; si no da el OK se rechaza el endoso</w:t>
-            </w:r>
-          </w:p>
-        </w:tc>
-        <w:tc>
-          <w:tcPr>
-            <w:tcW w:type="dxa" w:w="360"/>
-            <w:tcBorders>
-              <w:top w:val="none" w:color="FFFFFF" w:sz="0"/>
-              <w:left w:val="none" w:color="FFFFFF" w:sz="0"/>
-              <w:bottom w:val="none" w:color="FFFFFF" w:sz="0"/>
-              <w:right w:val="none" w:color="FFFFFF" w:sz="0"/>
-            </w:tcBorders>
-            <w:vAlign w:val="center"/>
-          </w:tcPr>
-          <w:p>
-            <w:pPr>
-              <w:jc w:val="center"/>
-            </w:pPr>
-            <w:r>
-              <w:rPr>
-                <w:rFonts w:ascii="Calibri" w:cs="Calibri" w:eastAsia="Calibri" w:hAnsi="Calibri"/>
-                <w:color w:val="2E7D8C"/>
-                <w:sz w:val="22"/>
-                <w:szCs w:val="22"/>
-              </w:rPr>
-              <w:t xml:space="preserve">►</w:t>
-            </w:r>
-          </w:p>
-        </w:tc>
-        <w:tc>
-          <w:tcPr>
-            <w:tcW w:type="dxa" w:w="2100"/>
-            <w:tcBorders>
-              <w:top w:val="single" w:color="2E7D8C" w:sz="6"/>
-              <w:left w:val="single" w:color="2E7D8C" w:sz="6"/>
-              <w:bottom w:val="single" w:color="2E7D8C" w:sz="6"/>
-              <w:right w:val="single" w:color="2E7D8C" w:sz="6"/>
-            </w:tcBorders>
-            <w:shd w:fill="EAF2F5" w:color="auto" w:val="clear"/>
-            <w:tcMar>
-              <w:top w:type="dxa" w:w="100"/>
-              <w:left w:type="dxa" w:w="110"/>
-              <w:bottom w:type="dxa" w:w="100"/>
-              <w:right w:type="dxa" w:w="110"/>
-            </w:tcMar>
-          </w:tcPr>
-          <w:p>
-            <w:pPr>
-              <w:spacing w:after="60"/>
-            </w:pPr>
-            <w:r>
-              <w:rPr>
-                <w:rFonts w:ascii="Calibri" w:cs="Calibri" w:eastAsia="Calibri" w:hAnsi="Calibri"/>
-                <w:b/>
-                <w:bCs/>
-                <w:color w:val="1F3A5F"/>
-                <w:sz w:val="20"/>
-                <w:szCs w:val="20"/>
-              </w:rPr>
-              <w:t xml:space="preserve">6 · Preliquidación</w:t>
-            </w:r>
-          </w:p>
-          <w:p>
-            <w:pPr>
-              <w:spacing w:after="0"/>
-            </w:pPr>
-            <w:r>
-              <w:rPr>
-                <w:rFonts w:ascii="Calibri" w:cs="Calibri" w:eastAsia="Calibri" w:hAnsi="Calibri"/>
-                <w:sz w:val="18"/>
-                <w:szCs w:val="18"/>
-              </w:rPr>
-              <w:t xml:space="preserve">Se carga la tasa y el cliente da el OK</w:t>
+              <w:t xml:space="preserve">Al seleccionar, el sistema controla que haya línea disponible para la compra</w:t>
             </w:r>
           </w:p>
         </w:tc>
@@ -15026,105 +14892,1928 @@
           <w:sz w:val="24"/>
           <w:szCs w:val="24"/>
         </w:rPr>
-        <w:t xml:space="preserve">Reglas</w:t>
+        <w:t xml:space="preserve">Simulación, excepciones y cierre</w:t>
       </w:r>
     </w:p>
+    <w:tbl>
+      <w:tblPr>
+        <w:tblW w:type="dxa" w:w="14400"/>
+        <w:tblBorders>
+          <w:top w:val="single" w:color="auto" w:sz="4"/>
+          <w:left w:val="single" w:color="auto" w:sz="4"/>
+          <w:bottom w:val="single" w:color="auto" w:sz="4"/>
+          <w:right w:val="single" w:color="auto" w:sz="4"/>
+          <w:insideH w:val="single" w:color="auto" w:sz="4"/>
+          <w:insideV w:val="single" w:color="auto" w:sz="4"/>
+        </w:tblBorders>
+      </w:tblPr>
+      <w:tblGrid>
+        <w:gridCol w:w="3330"/>
+        <w:gridCol w:w="360"/>
+        <w:gridCol w:w="3330"/>
+        <w:gridCol w:w="360"/>
+        <w:gridCol w:w="3330"/>
+        <w:gridCol w:w="360"/>
+        <w:gridCol w:w="3330"/>
+      </w:tblGrid>
+      <w:tr>
+        <w:tc>
+          <w:tcPr>
+            <w:tcW w:type="dxa" w:w="3330"/>
+            <w:tcBorders>
+              <w:top w:val="single" w:color="2E7D8C" w:sz="6"/>
+              <w:left w:val="single" w:color="2E7D8C" w:sz="6"/>
+              <w:bottom w:val="single" w:color="2E7D8C" w:sz="6"/>
+              <w:right w:val="single" w:color="2E7D8C" w:sz="6"/>
+            </w:tcBorders>
+            <w:shd w:fill="1F3A5F" w:color="auto" w:val="clear"/>
+            <w:tcMar>
+              <w:top w:type="dxa" w:w="100"/>
+              <w:left w:type="dxa" w:w="110"/>
+              <w:bottom w:type="dxa" w:w="100"/>
+              <w:right w:type="dxa" w:w="110"/>
+            </w:tcMar>
+          </w:tcPr>
+          <w:p>
+            <w:pPr>
+              <w:spacing w:after="60"/>
+            </w:pPr>
+            <w:r>
+              <w:rPr>
+                <w:rFonts w:ascii="Calibri" w:cs="Calibri" w:eastAsia="Calibri" w:hAnsi="Calibri"/>
+                <w:b/>
+                <w:bCs/>
+                <w:color w:val="FFFFFF"/>
+                <w:sz w:val="20"/>
+                <w:szCs w:val="20"/>
+              </w:rPr>
+              <w:t xml:space="preserve">5 · Simulación</w:t>
+            </w:r>
+          </w:p>
+          <w:p>
+            <w:pPr>
+              <w:spacing w:after="0"/>
+            </w:pPr>
+            <w:r>
+              <w:rPr>
+                <w:rFonts w:ascii="Calibri" w:cs="Calibri" w:eastAsia="Calibri" w:hAnsi="Calibri"/>
+                <w:color w:val="FFFFFF"/>
+                <w:sz w:val="18"/>
+                <w:szCs w:val="18"/>
+              </w:rPr>
+              <w:t xml:space="preserve">Con los cheques aprobados, simulación con la tasa de descuento precargada, para compartir con el cliente</w:t>
+            </w:r>
+          </w:p>
+        </w:tc>
+        <w:tc>
+          <w:tcPr>
+            <w:tcW w:type="dxa" w:w="360"/>
+            <w:tcBorders>
+              <w:top w:val="none" w:color="FFFFFF" w:sz="0"/>
+              <w:left w:val="none" w:color="FFFFFF" w:sz="0"/>
+              <w:bottom w:val="none" w:color="FFFFFF" w:sz="0"/>
+              <w:right w:val="none" w:color="FFFFFF" w:sz="0"/>
+            </w:tcBorders>
+            <w:vAlign w:val="center"/>
+          </w:tcPr>
+          <w:p>
+            <w:pPr>
+              <w:jc w:val="center"/>
+            </w:pPr>
+            <w:r>
+              <w:rPr>
+                <w:rFonts w:ascii="Calibri" w:cs="Calibri" w:eastAsia="Calibri" w:hAnsi="Calibri"/>
+                <w:color w:val="2E7D8C"/>
+                <w:sz w:val="22"/>
+                <w:szCs w:val="22"/>
+              </w:rPr>
+              <w:t xml:space="preserve">►</w:t>
+            </w:r>
+          </w:p>
+        </w:tc>
+        <w:tc>
+          <w:tcPr>
+            <w:tcW w:type="dxa" w:w="3330"/>
+            <w:tcBorders>
+              <w:top w:val="single" w:color="2E7D8C" w:sz="6"/>
+              <w:left w:val="single" w:color="2E7D8C" w:sz="6"/>
+              <w:bottom w:val="single" w:color="2E7D8C" w:sz="6"/>
+              <w:right w:val="single" w:color="2E7D8C" w:sz="6"/>
+            </w:tcBorders>
+            <w:shd w:fill="EAF2F5" w:color="auto" w:val="clear"/>
+            <w:tcMar>
+              <w:top w:type="dxa" w:w="100"/>
+              <w:left w:type="dxa" w:w="110"/>
+              <w:bottom w:type="dxa" w:w="100"/>
+              <w:right w:type="dxa" w:w="110"/>
+            </w:tcMar>
+          </w:tcPr>
+          <w:p>
+            <w:pPr>
+              <w:spacing w:after="60"/>
+            </w:pPr>
+            <w:r>
+              <w:rPr>
+                <w:rFonts w:ascii="Calibri" w:cs="Calibri" w:eastAsia="Calibri" w:hAnsi="Calibri"/>
+                <w:b/>
+                <w:bCs/>
+                <w:color w:val="1F3A5F"/>
+                <w:sz w:val="20"/>
+                <w:szCs w:val="20"/>
+              </w:rPr>
+              <w:t xml:space="preserve">6 · Excepciones</w:t>
+            </w:r>
+          </w:p>
+          <w:p>
+            <w:pPr>
+              <w:spacing w:after="0"/>
+            </w:pPr>
+            <w:r>
+              <w:rPr>
+                <w:rFonts w:ascii="Calibri" w:cs="Calibri" w:eastAsia="Calibri" w:hAnsi="Calibri"/>
+                <w:sz w:val="18"/>
+                <w:szCs w:val="18"/>
+              </w:rPr>
+              <w:t xml:space="preserve">Si se quiere comprar un eCheq no seleccionado por el scoring, pasa a Riesgos para su análisis y OK</w:t>
+            </w:r>
+          </w:p>
+        </w:tc>
+        <w:tc>
+          <w:tcPr>
+            <w:tcW w:type="dxa" w:w="360"/>
+            <w:tcBorders>
+              <w:top w:val="none" w:color="FFFFFF" w:sz="0"/>
+              <w:left w:val="none" w:color="FFFFFF" w:sz="0"/>
+              <w:bottom w:val="none" w:color="FFFFFF" w:sz="0"/>
+              <w:right w:val="none" w:color="FFFFFF" w:sz="0"/>
+            </w:tcBorders>
+            <w:vAlign w:val="center"/>
+          </w:tcPr>
+          <w:p>
+            <w:pPr>
+              <w:jc w:val="center"/>
+            </w:pPr>
+            <w:r>
+              <w:rPr>
+                <w:rFonts w:ascii="Calibri" w:cs="Calibri" w:eastAsia="Calibri" w:hAnsi="Calibri"/>
+                <w:color w:val="2E7D8C"/>
+                <w:sz w:val="22"/>
+                <w:szCs w:val="22"/>
+              </w:rPr>
+              <w:t xml:space="preserve">►</w:t>
+            </w:r>
+          </w:p>
+        </w:tc>
+        <w:tc>
+          <w:tcPr>
+            <w:tcW w:type="dxa" w:w="3330"/>
+            <w:tcBorders>
+              <w:top w:val="single" w:color="2E7D8C" w:sz="6"/>
+              <w:left w:val="single" w:color="2E7D8C" w:sz="6"/>
+              <w:bottom w:val="single" w:color="2E7D8C" w:sz="6"/>
+              <w:right w:val="single" w:color="2E7D8C" w:sz="6"/>
+            </w:tcBorders>
+            <w:shd w:fill="EAF2F5" w:color="auto" w:val="clear"/>
+            <w:tcMar>
+              <w:top w:type="dxa" w:w="100"/>
+              <w:left w:type="dxa" w:w="110"/>
+              <w:bottom w:type="dxa" w:w="100"/>
+              <w:right w:type="dxa" w:w="110"/>
+            </w:tcMar>
+          </w:tcPr>
+          <w:p>
+            <w:pPr>
+              <w:spacing w:after="60"/>
+            </w:pPr>
+            <w:r>
+              <w:rPr>
+                <w:rFonts w:ascii="Calibri" w:cs="Calibri" w:eastAsia="Calibri" w:hAnsi="Calibri"/>
+                <w:b/>
+                <w:bCs/>
+                <w:color w:val="1F3A5F"/>
+                <w:sz w:val="20"/>
+                <w:szCs w:val="20"/>
+              </w:rPr>
+              <w:t xml:space="preserve">7 · Aceptación</w:t>
+            </w:r>
+          </w:p>
+          <w:p>
+            <w:pPr>
+              <w:spacing w:after="0"/>
+            </w:pPr>
+            <w:r>
+              <w:rPr>
+                <w:rFonts w:ascii="Calibri" w:cs="Calibri" w:eastAsia="Calibri" w:hAnsi="Calibri"/>
+                <w:sz w:val="18"/>
+                <w:szCs w:val="18"/>
+              </w:rPr>
+              <w:t xml:space="preserve">Se aceptan los cheques aprobados por scoring o por Riesgos; se rechazan los no seleccionados</w:t>
+            </w:r>
+          </w:p>
+        </w:tc>
+        <w:tc>
+          <w:tcPr>
+            <w:tcW w:type="dxa" w:w="360"/>
+            <w:tcBorders>
+              <w:top w:val="none" w:color="FFFFFF" w:sz="0"/>
+              <w:left w:val="none" w:color="FFFFFF" w:sz="0"/>
+              <w:bottom w:val="none" w:color="FFFFFF" w:sz="0"/>
+              <w:right w:val="none" w:color="FFFFFF" w:sz="0"/>
+            </w:tcBorders>
+            <w:vAlign w:val="center"/>
+          </w:tcPr>
+          <w:p>
+            <w:pPr>
+              <w:jc w:val="center"/>
+            </w:pPr>
+            <w:r>
+              <w:rPr>
+                <w:rFonts w:ascii="Calibri" w:cs="Calibri" w:eastAsia="Calibri" w:hAnsi="Calibri"/>
+                <w:color w:val="2E7D8C"/>
+                <w:sz w:val="22"/>
+                <w:szCs w:val="22"/>
+              </w:rPr>
+              <w:t xml:space="preserve">►</w:t>
+            </w:r>
+          </w:p>
+        </w:tc>
+        <w:tc>
+          <w:tcPr>
+            <w:tcW w:type="dxa" w:w="3330"/>
+            <w:tcBorders>
+              <w:top w:val="single" w:color="2E7D8C" w:sz="6"/>
+              <w:left w:val="single" w:color="2E7D8C" w:sz="6"/>
+              <w:bottom w:val="single" w:color="2E7D8C" w:sz="6"/>
+              <w:right w:val="single" w:color="2E7D8C" w:sz="6"/>
+            </w:tcBorders>
+            <w:shd w:fill="EAF2F5" w:color="auto" w:val="clear"/>
+            <w:tcMar>
+              <w:top w:type="dxa" w:w="100"/>
+              <w:left w:type="dxa" w:w="110"/>
+              <w:bottom w:type="dxa" w:w="100"/>
+              <w:right w:type="dxa" w:w="110"/>
+            </w:tcMar>
+          </w:tcPr>
+          <w:p>
+            <w:pPr>
+              <w:spacing w:after="60"/>
+            </w:pPr>
+            <w:r>
+              <w:rPr>
+                <w:rFonts w:ascii="Calibri" w:cs="Calibri" w:eastAsia="Calibri" w:hAnsi="Calibri"/>
+                <w:b/>
+                <w:bCs/>
+                <w:color w:val="1F3A5F"/>
+                <w:sz w:val="20"/>
+                <w:szCs w:val="20"/>
+              </w:rPr>
+              <w:t xml:space="preserve">8 · Desembolso</w:t>
+            </w:r>
+          </w:p>
+          <w:p>
+            <w:pPr>
+              <w:spacing w:after="0"/>
+            </w:pPr>
+            <w:r>
+              <w:rPr>
+                <w:rFonts w:ascii="Calibri" w:cs="Calibri" w:eastAsia="Calibri" w:hAnsi="Calibri"/>
+                <w:sz w:val="18"/>
+                <w:szCs w:val="18"/>
+              </w:rPr>
+              <w:t xml:space="preserve">Activas aprueba el acuerdo marco y parametriza la cuenta (solo la primera vez); luego, desembolso directo</w:t>
+            </w:r>
+          </w:p>
+        </w:tc>
+      </w:tr>
+    </w:tbl>
     <w:p>
       <w:pPr>
-        <w:pStyle w:val="ListParagraph"/>
-        <w:numPr>
-          <w:ilvl w:val="0"/>
-          <w:numId w:val="2"/>
-        </w:numPr>
-        <w:spacing w:after="60"/>
+        <w:spacing w:after="100" w:before="160"/>
       </w:pPr>
+      <w:r>
+        <w:rPr>
+          <w:rFonts w:ascii="Calibri" w:cs="Calibri" w:eastAsia="Calibri" w:hAnsi="Calibri"/>
+          <w:b/>
+          <w:bCs/>
+          <w:sz w:val="22"/>
+          <w:szCs w:val="22"/>
+        </w:rPr>
+        <w:t xml:space="preserve">Cierre: </w:t>
+      </w:r>
       <w:r>
         <w:rPr>
           <w:rFonts w:ascii="Calibri" w:cs="Calibri" w:eastAsia="Calibri" w:hAnsi="Calibri"/>
           <w:sz w:val="22"/>
           <w:szCs w:val="22"/>
         </w:rPr>
-        <w:t xml:space="preserve">Solo se pueden descontar cheques de clientes con línea vigente; el circuito se inicia desde la pantalla de líneas.</w:t>
+        <w:t xml:space="preserve">si la operación se completa con éxito, el sistema muestra una pantalla de operación finalizada y Middle Office puede descargar los recibos.</w:t>
       </w:r>
     </w:p>
     <w:p>
       <w:pPr>
-        <w:pStyle w:val="ListParagraph"/>
-        <w:numPr>
-          <w:ilvl w:val="0"/>
-          <w:numId w:val="2"/>
-        </w:numPr>
-        <w:spacing w:after="60"/>
+        <w:spacing w:after="80" w:before="180"/>
       </w:pPr>
       <w:r>
         <w:rPr>
           <w:rFonts w:ascii="Calibri" w:cs="Calibri" w:eastAsia="Calibri" w:hAnsi="Calibri"/>
-          <w:sz w:val="22"/>
-          <w:szCs w:val="22"/>
+          <w:b/>
+          <w:bCs/>
+          <w:color w:val="1F3A5F"/>
+          <w:sz w:val="24"/>
+          <w:szCs w:val="24"/>
         </w:rPr>
-        <w:t xml:space="preserve">Los cheques con OK del proceso de verificación los liquida directamente Middle Office.</w:t>
+        <w:t xml:space="preserve">Qué cambia respecto del circuito relevado el 07/10</w:t>
       </w:r>
     </w:p>
+    <w:tbl>
+      <w:tblPr>
+        <w:tblW w:type="dxa" w:w="14400"/>
+        <w:tblBorders>
+          <w:top w:val="single" w:color="auto" w:sz="4"/>
+          <w:left w:val="single" w:color="auto" w:sz="4"/>
+          <w:bottom w:val="single" w:color="auto" w:sz="4"/>
+          <w:right w:val="single" w:color="auto" w:sz="4"/>
+          <w:insideH w:val="single" w:color="auto" w:sz="4"/>
+          <w:insideV w:val="single" w:color="auto" w:sz="4"/>
+        </w:tblBorders>
+      </w:tblPr>
+      <w:tblGrid>
+        <w:gridCol w:w="3200"/>
+        <w:gridCol w:w="5200"/>
+        <w:gridCol w:w="6000"/>
+      </w:tblGrid>
+      <w:tr>
+        <w:trPr>
+          <w:tblHeader/>
+        </w:trPr>
+        <w:tc>
+          <w:tcPr>
+            <w:tcW w:type="dxa" w:w="3200"/>
+            <w:shd w:fill="2E7D8C" w:color="auto" w:val="clear"/>
+            <w:tcMar>
+              <w:top w:type="dxa" w:w="80"/>
+              <w:left w:type="dxa" w:w="120"/>
+              <w:bottom w:type="dxa" w:w="80"/>
+              <w:right w:type="dxa" w:w="120"/>
+            </w:tcMar>
+          </w:tcPr>
+          <w:p>
+            <w:pPr>
+              <w:spacing w:after="40"/>
+            </w:pPr>
+            <w:r>
+              <w:rPr>
+                <w:rFonts w:ascii="Calibri" w:cs="Calibri" w:eastAsia="Calibri" w:hAnsi="Calibri"/>
+                <w:b/>
+                <w:bCs/>
+                <w:color w:val="FFFFFF"/>
+                <w:sz w:val="20"/>
+                <w:szCs w:val="20"/>
+              </w:rPr>
+              <w:t xml:space="preserve">Tema</w:t>
+            </w:r>
+          </w:p>
+        </w:tc>
+        <w:tc>
+          <w:tcPr>
+            <w:tcW w:type="dxa" w:w="5200"/>
+            <w:shd w:fill="2E7D8C" w:color="auto" w:val="clear"/>
+            <w:tcMar>
+              <w:top w:type="dxa" w:w="80"/>
+              <w:left w:type="dxa" w:w="120"/>
+              <w:bottom w:type="dxa" w:w="80"/>
+              <w:right w:type="dxa" w:w="120"/>
+            </w:tcMar>
+          </w:tcPr>
+          <w:p>
+            <w:pPr>
+              <w:spacing w:after="40"/>
+            </w:pPr>
+            <w:r>
+              <w:rPr>
+                <w:rFonts w:ascii="Calibri" w:cs="Calibri" w:eastAsia="Calibri" w:hAnsi="Calibri"/>
+                <w:b/>
+                <w:bCs/>
+                <w:color w:val="FFFFFF"/>
+                <w:sz w:val="20"/>
+                <w:szCs w:val="20"/>
+              </w:rPr>
+              <w:t xml:space="preserve">Circuito relevado</w:t>
+            </w:r>
+          </w:p>
+        </w:tc>
+        <w:tc>
+          <w:tcPr>
+            <w:tcW w:type="dxa" w:w="6000"/>
+            <w:shd w:fill="2E7D8C" w:color="auto" w:val="clear"/>
+            <w:tcMar>
+              <w:top w:type="dxa" w:w="80"/>
+              <w:left w:type="dxa" w:w="120"/>
+              <w:bottom w:type="dxa" w:w="80"/>
+              <w:right w:type="dxa" w:w="120"/>
+            </w:tcMar>
+          </w:tcPr>
+          <w:p>
+            <w:pPr>
+              <w:spacing w:after="40"/>
+            </w:pPr>
+            <w:r>
+              <w:rPr>
+                <w:rFonts w:ascii="Calibri" w:cs="Calibri" w:eastAsia="Calibri" w:hAnsi="Calibri"/>
+                <w:b/>
+                <w:bCs/>
+                <w:color w:val="FFFFFF"/>
+                <w:sz w:val="20"/>
+                <w:szCs w:val="20"/>
+              </w:rPr>
+              <w:t xml:space="preserve">Circuito propuesto</w:t>
+            </w:r>
+          </w:p>
+        </w:tc>
+      </w:tr>
+      <w:tr>
+        <w:tc>
+          <w:tcPr>
+            <w:tcW w:type="dxa" w:w="3200"/>
+            <w:tcMar>
+              <w:top w:type="dxa" w:w="80"/>
+              <w:left w:type="dxa" w:w="120"/>
+              <w:bottom w:type="dxa" w:w="80"/>
+              <w:right w:type="dxa" w:w="120"/>
+            </w:tcMar>
+          </w:tcPr>
+          <w:p>
+            <w:pPr>
+              <w:spacing w:after="40"/>
+            </w:pPr>
+            <w:r>
+              <w:rPr>
+                <w:rFonts w:ascii="Calibri" w:cs="Calibri" w:eastAsia="Calibri" w:hAnsi="Calibri"/>
+                <w:b/>
+                <w:bCs/>
+                <w:sz w:val="20"/>
+                <w:szCs w:val="20"/>
+              </w:rPr>
+              <w:t xml:space="preserve">Selección de cheques</w:t>
+            </w:r>
+          </w:p>
+        </w:tc>
+        <w:tc>
+          <w:tcPr>
+            <w:tcW w:type="dxa" w:w="5200"/>
+            <w:tcMar>
+              <w:top w:type="dxa" w:w="80"/>
+              <w:left w:type="dxa" w:w="120"/>
+              <w:bottom w:type="dxa" w:w="80"/>
+              <w:right w:type="dxa" w:w="120"/>
+            </w:tcMar>
+          </w:tcPr>
+          <w:p>
+            <w:pPr>
+              <w:spacing w:after="40"/>
+            </w:pPr>
+            <w:r>
+              <w:rPr>
+                <w:rFonts w:ascii="Calibri" w:cs="Calibri" w:eastAsia="Calibri" w:hAnsi="Calibri"/>
+                <w:b w:val="false"/>
+                <w:bCs w:val="false"/>
+                <w:sz w:val="20"/>
+                <w:szCs w:val="20"/>
+              </w:rPr>
+              <w:t xml:space="preserve">Proceso de verificación de aceptación (desarrollado por Martín)</w:t>
+            </w:r>
+          </w:p>
+        </w:tc>
+        <w:tc>
+          <w:tcPr>
+            <w:tcW w:type="dxa" w:w="6000"/>
+            <w:tcMar>
+              <w:top w:type="dxa" w:w="80"/>
+              <w:left w:type="dxa" w:w="120"/>
+              <w:bottom w:type="dxa" w:w="80"/>
+              <w:right w:type="dxa" w:w="120"/>
+            </w:tcMar>
+          </w:tcPr>
+          <w:p>
+            <w:pPr>
+              <w:spacing w:after="40"/>
+            </w:pPr>
+            <w:r>
+              <w:rPr>
+                <w:rFonts w:ascii="Calibri" w:cs="Calibri" w:eastAsia="Calibri" w:hAnsi="Calibri"/>
+                <w:b w:val="false"/>
+                <w:bCs w:val="false"/>
+                <w:sz w:val="20"/>
+                <w:szCs w:val="20"/>
+              </w:rPr>
+              <w:t xml:space="preserve">Validación de scoring integrada con el desarrollo de modernización</w:t>
+            </w:r>
+          </w:p>
+        </w:tc>
+      </w:tr>
+      <w:tr>
+        <w:tc>
+          <w:tcPr>
+            <w:tcW w:type="dxa" w:w="3200"/>
+            <w:shd w:fill="EAF2F5" w:color="auto" w:val="clear"/>
+            <w:tcMar>
+              <w:top w:type="dxa" w:w="80"/>
+              <w:left w:type="dxa" w:w="120"/>
+              <w:bottom w:type="dxa" w:w="80"/>
+              <w:right w:type="dxa" w:w="120"/>
+            </w:tcMar>
+          </w:tcPr>
+          <w:p>
+            <w:pPr>
+              <w:spacing w:after="40"/>
+            </w:pPr>
+            <w:r>
+              <w:rPr>
+                <w:rFonts w:ascii="Calibri" w:cs="Calibri" w:eastAsia="Calibri" w:hAnsi="Calibri"/>
+                <w:b/>
+                <w:bCs/>
+                <w:sz w:val="20"/>
+                <w:szCs w:val="20"/>
+              </w:rPr>
+              <w:t xml:space="preserve">Control de línea</w:t>
+            </w:r>
+          </w:p>
+        </w:tc>
+        <w:tc>
+          <w:tcPr>
+            <w:tcW w:type="dxa" w:w="5200"/>
+            <w:shd w:fill="EAF2F5" w:color="auto" w:val="clear"/>
+            <w:tcMar>
+              <w:top w:type="dxa" w:w="80"/>
+              <w:left w:type="dxa" w:w="120"/>
+              <w:bottom w:type="dxa" w:w="80"/>
+              <w:right w:type="dxa" w:w="120"/>
+            </w:tcMar>
+          </w:tcPr>
+          <w:p>
+            <w:pPr>
+              <w:spacing w:after="40"/>
+            </w:pPr>
+            <w:r>
+              <w:rPr>
+                <w:rFonts w:ascii="Calibri" w:cs="Calibri" w:eastAsia="Calibri" w:hAnsi="Calibri"/>
+                <w:b w:val="false"/>
+                <w:bCs w:val="false"/>
+                <w:sz w:val="20"/>
+                <w:szCs w:val="20"/>
+              </w:rPr>
+              <w:t xml:space="preserve">No se controla al seleccionar</w:t>
+            </w:r>
+          </w:p>
+        </w:tc>
+        <w:tc>
+          <w:tcPr>
+            <w:tcW w:type="dxa" w:w="6000"/>
+            <w:shd w:fill="EAF2F5" w:color="auto" w:val="clear"/>
+            <w:tcMar>
+              <w:top w:type="dxa" w:w="80"/>
+              <w:left w:type="dxa" w:w="120"/>
+              <w:bottom w:type="dxa" w:w="80"/>
+              <w:right w:type="dxa" w:w="120"/>
+            </w:tcMar>
+          </w:tcPr>
+          <w:p>
+            <w:pPr>
+              <w:spacing w:after="40"/>
+            </w:pPr>
+            <w:r>
+              <w:rPr>
+                <w:rFonts w:ascii="Calibri" w:cs="Calibri" w:eastAsia="Calibri" w:hAnsi="Calibri"/>
+                <w:b w:val="false"/>
+                <w:bCs w:val="false"/>
+                <w:sz w:val="20"/>
+                <w:szCs w:val="20"/>
+              </w:rPr>
+              <w:t xml:space="preserve">El sistema controla el disponible al seleccionar los cheques</w:t>
+            </w:r>
+          </w:p>
+        </w:tc>
+      </w:tr>
+      <w:tr>
+        <w:tc>
+          <w:tcPr>
+            <w:tcW w:type="dxa" w:w="3200"/>
+            <w:tcMar>
+              <w:top w:type="dxa" w:w="80"/>
+              <w:left w:type="dxa" w:w="120"/>
+              <w:bottom w:type="dxa" w:w="80"/>
+              <w:right w:type="dxa" w:w="120"/>
+            </w:tcMar>
+          </w:tcPr>
+          <w:p>
+            <w:pPr>
+              <w:spacing w:after="40"/>
+            </w:pPr>
+            <w:r>
+              <w:rPr>
+                <w:rFonts w:ascii="Calibri" w:cs="Calibri" w:eastAsia="Calibri" w:hAnsi="Calibri"/>
+                <w:b/>
+                <w:bCs/>
+                <w:sz w:val="20"/>
+                <w:szCs w:val="20"/>
+              </w:rPr>
+              <w:t xml:space="preserve">Propuesta al cliente</w:t>
+            </w:r>
+          </w:p>
+        </w:tc>
+        <w:tc>
+          <w:tcPr>
+            <w:tcW w:type="dxa" w:w="5200"/>
+            <w:tcMar>
+              <w:top w:type="dxa" w:w="80"/>
+              <w:left w:type="dxa" w:w="120"/>
+              <w:bottom w:type="dxa" w:w="80"/>
+              <w:right w:type="dxa" w:w="120"/>
+            </w:tcMar>
+          </w:tcPr>
+          <w:p>
+            <w:pPr>
+              <w:spacing w:after="40"/>
+            </w:pPr>
+            <w:r>
+              <w:rPr>
+                <w:rFonts w:ascii="Calibri" w:cs="Calibri" w:eastAsia="Calibri" w:hAnsi="Calibri"/>
+                <w:b w:val="false"/>
+                <w:bCs w:val="false"/>
+                <w:sz w:val="20"/>
+                <w:szCs w:val="20"/>
+              </w:rPr>
+              <w:t xml:space="preserve">Preliquidación que el cliente aprueba</w:t>
+            </w:r>
+          </w:p>
+        </w:tc>
+        <w:tc>
+          <w:tcPr>
+            <w:tcW w:type="dxa" w:w="6000"/>
+            <w:tcMar>
+              <w:top w:type="dxa" w:w="80"/>
+              <w:left w:type="dxa" w:w="120"/>
+              <w:bottom w:type="dxa" w:w="80"/>
+              <w:right w:type="dxa" w:w="120"/>
+            </w:tcMar>
+          </w:tcPr>
+          <w:p>
+            <w:pPr>
+              <w:spacing w:after="40"/>
+            </w:pPr>
+            <w:r>
+              <w:rPr>
+                <w:rFonts w:ascii="Calibri" w:cs="Calibri" w:eastAsia="Calibri" w:hAnsi="Calibri"/>
+                <w:b w:val="false"/>
+                <w:bCs w:val="false"/>
+                <w:sz w:val="20"/>
+                <w:szCs w:val="20"/>
+              </w:rPr>
+              <w:t xml:space="preserve">Simulación con la tasa de descuento precargada; error si no está cargada</w:t>
+            </w:r>
+          </w:p>
+        </w:tc>
+      </w:tr>
+      <w:tr>
+        <w:tc>
+          <w:tcPr>
+            <w:tcW w:type="dxa" w:w="3200"/>
+            <w:shd w:fill="EAF2F5" w:color="auto" w:val="clear"/>
+            <w:tcMar>
+              <w:top w:type="dxa" w:w="80"/>
+              <w:left w:type="dxa" w:w="120"/>
+              <w:bottom w:type="dxa" w:w="80"/>
+              <w:right w:type="dxa" w:w="120"/>
+            </w:tcMar>
+          </w:tcPr>
+          <w:p>
+            <w:pPr>
+              <w:spacing w:after="40"/>
+            </w:pPr>
+            <w:r>
+              <w:rPr>
+                <w:rFonts w:ascii="Calibri" w:cs="Calibri" w:eastAsia="Calibri" w:hAnsi="Calibri"/>
+                <w:b/>
+                <w:bCs/>
+                <w:sz w:val="20"/>
+                <w:szCs w:val="20"/>
+              </w:rPr>
+              <w:t xml:space="preserve">Intervención de Riesgos</w:t>
+            </w:r>
+          </w:p>
+        </w:tc>
+        <w:tc>
+          <w:tcPr>
+            <w:tcW w:type="dxa" w:w="5200"/>
+            <w:shd w:fill="EAF2F5" w:color="auto" w:val="clear"/>
+            <w:tcMar>
+              <w:top w:type="dxa" w:w="80"/>
+              <w:left w:type="dxa" w:w="120"/>
+              <w:bottom w:type="dxa" w:w="80"/>
+              <w:right w:type="dxa" w:w="120"/>
+            </w:tcMar>
+          </w:tcPr>
+          <w:p>
+            <w:pPr>
+              <w:spacing w:after="40"/>
+            </w:pPr>
+            <w:r>
+              <w:rPr>
+                <w:rFonts w:ascii="Calibri" w:cs="Calibri" w:eastAsia="Calibri" w:hAnsi="Calibri"/>
+                <w:b w:val="false"/>
+                <w:bCs w:val="false"/>
+                <w:sz w:val="20"/>
+                <w:szCs w:val="20"/>
+              </w:rPr>
+              <w:t xml:space="preserve">Revisa todos los cheques pendientes</w:t>
+            </w:r>
+          </w:p>
+        </w:tc>
+        <w:tc>
+          <w:tcPr>
+            <w:tcW w:type="dxa" w:w="6000"/>
+            <w:shd w:fill="EAF2F5" w:color="auto" w:val="clear"/>
+            <w:tcMar>
+              <w:top w:type="dxa" w:w="80"/>
+              <w:left w:type="dxa" w:w="120"/>
+              <w:bottom w:type="dxa" w:w="80"/>
+              <w:right w:type="dxa" w:w="120"/>
+            </w:tcMar>
+          </w:tcPr>
+          <w:p>
+            <w:pPr>
+              <w:spacing w:after="40"/>
+            </w:pPr>
+            <w:r>
+              <w:rPr>
+                <w:rFonts w:ascii="Calibri" w:cs="Calibri" w:eastAsia="Calibri" w:hAnsi="Calibri"/>
+                <w:b w:val="false"/>
+                <w:bCs w:val="false"/>
+                <w:sz w:val="20"/>
+                <w:szCs w:val="20"/>
+              </w:rPr>
+              <w:t xml:space="preserve">Solo los eCheqs que se quieren forzar fuera del scoring</w:t>
+            </w:r>
+          </w:p>
+        </w:tc>
+      </w:tr>
+      <w:tr>
+        <w:tc>
+          <w:tcPr>
+            <w:tcW w:type="dxa" w:w="3200"/>
+            <w:tcMar>
+              <w:top w:type="dxa" w:w="80"/>
+              <w:left w:type="dxa" w:w="120"/>
+              <w:bottom w:type="dxa" w:w="80"/>
+              <w:right w:type="dxa" w:w="120"/>
+            </w:tcMar>
+          </w:tcPr>
+          <w:p>
+            <w:pPr>
+              <w:spacing w:after="40"/>
+            </w:pPr>
+            <w:r>
+              <w:rPr>
+                <w:rFonts w:ascii="Calibri" w:cs="Calibri" w:eastAsia="Calibri" w:hAnsi="Calibri"/>
+                <w:b/>
+                <w:bCs/>
+                <w:sz w:val="20"/>
+                <w:szCs w:val="20"/>
+              </w:rPr>
+              <w:t xml:space="preserve">Desembolso</w:t>
+            </w:r>
+          </w:p>
+        </w:tc>
+        <w:tc>
+          <w:tcPr>
+            <w:tcW w:type="dxa" w:w="5200"/>
+            <w:tcMar>
+              <w:top w:type="dxa" w:w="80"/>
+              <w:left w:type="dxa" w:w="120"/>
+              <w:bottom w:type="dxa" w:w="80"/>
+              <w:right w:type="dxa" w:w="120"/>
+            </w:tcMar>
+          </w:tcPr>
+          <w:p>
+            <w:pPr>
+              <w:spacing w:after="40"/>
+            </w:pPr>
+            <w:r>
+              <w:rPr>
+                <w:rFonts w:ascii="Calibri" w:cs="Calibri" w:eastAsia="Calibri" w:hAnsi="Calibri"/>
+                <w:b w:val="false"/>
+                <w:bCs w:val="false"/>
+                <w:sz w:val="20"/>
+                <w:szCs w:val="20"/>
+              </w:rPr>
+              <w:t xml:space="preserve">Sin definir</w:t>
+            </w:r>
+          </w:p>
+        </w:tc>
+        <w:tc>
+          <w:tcPr>
+            <w:tcW w:type="dxa" w:w="6000"/>
+            <w:tcMar>
+              <w:top w:type="dxa" w:w="80"/>
+              <w:left w:type="dxa" w:w="120"/>
+              <w:bottom w:type="dxa" w:w="80"/>
+              <w:right w:type="dxa" w:w="120"/>
+            </w:tcMar>
+          </w:tcPr>
+          <w:p>
+            <w:pPr>
+              <w:spacing w:after="40"/>
+            </w:pPr>
+            <w:r>
+              <w:rPr>
+                <w:rFonts w:ascii="Calibri" w:cs="Calibri" w:eastAsia="Calibri" w:hAnsi="Calibri"/>
+                <w:b w:val="false"/>
+                <w:bCs w:val="false"/>
+                <w:sz w:val="20"/>
+                <w:szCs w:val="20"/>
+              </w:rPr>
+              <w:t xml:space="preserve">Acuerdo marco y cuenta parametrizada por Activas la primera vez; después, automático</w:t>
+            </w:r>
+          </w:p>
+        </w:tc>
+      </w:tr>
+      <w:tr>
+        <w:tc>
+          <w:tcPr>
+            <w:tcW w:type="dxa" w:w="3200"/>
+            <w:shd w:fill="EAF2F5" w:color="auto" w:val="clear"/>
+            <w:tcMar>
+              <w:top w:type="dxa" w:w="80"/>
+              <w:left w:type="dxa" w:w="120"/>
+              <w:bottom w:type="dxa" w:w="80"/>
+              <w:right w:type="dxa" w:w="120"/>
+            </w:tcMar>
+          </w:tcPr>
+          <w:p>
+            <w:pPr>
+              <w:spacing w:after="40"/>
+            </w:pPr>
+            <w:r>
+              <w:rPr>
+                <w:rFonts w:ascii="Calibri" w:cs="Calibri" w:eastAsia="Calibri" w:hAnsi="Calibri"/>
+                <w:b/>
+                <w:bCs/>
+                <w:sz w:val="20"/>
+                <w:szCs w:val="20"/>
+              </w:rPr>
+              <w:t xml:space="preserve">Recibos</w:t>
+            </w:r>
+          </w:p>
+        </w:tc>
+        <w:tc>
+          <w:tcPr>
+            <w:tcW w:type="dxa" w:w="5200"/>
+            <w:shd w:fill="EAF2F5" w:color="auto" w:val="clear"/>
+            <w:tcMar>
+              <w:top w:type="dxa" w:w="80"/>
+              <w:left w:type="dxa" w:w="120"/>
+              <w:bottom w:type="dxa" w:w="80"/>
+              <w:right w:type="dxa" w:w="120"/>
+            </w:tcMar>
+          </w:tcPr>
+          <w:p>
+            <w:pPr>
+              <w:spacing w:after="40"/>
+            </w:pPr>
+            <w:r>
+              <w:rPr>
+                <w:rFonts w:ascii="Calibri" w:cs="Calibri" w:eastAsia="Calibri" w:hAnsi="Calibri"/>
+                <w:b w:val="false"/>
+                <w:bCs w:val="false"/>
+                <w:sz w:val="20"/>
+                <w:szCs w:val="20"/>
+              </w:rPr>
+              <w:t xml:space="preserve">Sin definir</w:t>
+            </w:r>
+          </w:p>
+        </w:tc>
+        <w:tc>
+          <w:tcPr>
+            <w:tcW w:type="dxa" w:w="6000"/>
+            <w:shd w:fill="EAF2F5" w:color="auto" w:val="clear"/>
+            <w:tcMar>
+              <w:top w:type="dxa" w:w="80"/>
+              <w:left w:type="dxa" w:w="120"/>
+              <w:bottom w:type="dxa" w:w="80"/>
+              <w:right w:type="dxa" w:w="120"/>
+            </w:tcMar>
+          </w:tcPr>
+          <w:p>
+            <w:pPr>
+              <w:spacing w:after="40"/>
+            </w:pPr>
+            <w:r>
+              <w:rPr>
+                <w:rFonts w:ascii="Calibri" w:cs="Calibri" w:eastAsia="Calibri" w:hAnsi="Calibri"/>
+                <w:b w:val="false"/>
+                <w:bCs w:val="false"/>
+                <w:sz w:val="20"/>
+                <w:szCs w:val="20"/>
+              </w:rPr>
+              <w:t xml:space="preserve">Pantalla de operación finalizada con descarga de recibos</w:t>
+            </w:r>
+          </w:p>
+        </w:tc>
+      </w:tr>
+    </w:tbl>
     <w:p>
       <w:pPr>
-        <w:pStyle w:val="ListParagraph"/>
-        <w:numPr>
-          <w:ilvl w:val="0"/>
-          <w:numId w:val="2"/>
-        </w:numPr>
-        <w:spacing w:after="60"/>
+        <w:pStyle w:val="Heading1"/>
+        <w:pageBreakBefore/>
+        <w:shd w:fill="1F3A5F" w:color="auto" w:val="clear"/>
+        <w:spacing w:after="0"/>
       </w:pPr>
       <w:r>
         <w:rPr>
           <w:rFonts w:ascii="Calibri" w:cs="Calibri" w:eastAsia="Calibri" w:hAnsi="Calibri"/>
-          <w:sz w:val="22"/>
-          <w:szCs w:val="22"/>
+          <w:b/>
+          <w:bCs/>
+          <w:color w:val="9FD3DE"/>
+          <w:sz w:val="30"/>
+          <w:szCs w:val="30"/>
         </w:rPr>
-        <w:t xml:space="preserve">Los cheques pendientes van a Riesgos: si los aprueba, siguen el proceso; si no, se rechaza el endoso.</w:t>
+        <w:t xml:space="preserve">  14  </w:t>
       </w:r>
-    </w:p>
-    <w:p>
-      <w:pPr>
-        <w:pStyle w:val="ListParagraph"/>
-        <w:numPr>
-          <w:ilvl w:val="0"/>
-          <w:numId w:val="2"/>
-        </w:numPr>
-        <w:spacing w:after="60"/>
-      </w:pPr>
       <w:r>
         <w:rPr>
           <w:rFonts w:ascii="Calibri" w:cs="Calibri" w:eastAsia="Calibri" w:hAnsi="Calibri"/>
-          <w:sz w:val="22"/>
-          <w:szCs w:val="22"/>
+          <w:b/>
+          <w:bCs/>
+          <w:color w:val="FFFFFF"/>
+          <w:sz w:val="34"/>
+          <w:szCs w:val="34"/>
         </w:rPr>
-        <w:t xml:space="preserve">La operación toma el costo de fondeo según su plazo máximo y la tasa debe respetar la tasa mínima de Mesa (Módulo E).</w:t>
-      </w:r>
-    </w:p>
-    <w:p>
-      <w:pPr>
-        <w:pStyle w:val="ListParagraph"/>
-        <w:numPr>
-          <w:ilvl w:val="0"/>
-          <w:numId w:val="2"/>
-        </w:numPr>
-        <w:spacing w:after="60"/>
-      </w:pPr>
-      <w:r>
-        <w:rPr>
-          <w:rFonts w:ascii="Calibri" w:cs="Calibri" w:eastAsia="Calibri" w:hAnsi="Calibri"/>
-          <w:sz w:val="22"/>
-          <w:szCs w:val="22"/>
-        </w:rPr>
-        <w:t xml:space="preserve">El cliente confirma la preliquidación antes de la liquidación final.</w:t>
+        <w:t xml:space="preserve">Módulo H · Reglas del descuento de cheques</w:t>
       </w:r>
     </w:p>
     <w:p>
       <w:pPr>
         <w:pBdr>
-          <w:left w:val="single" w:color="2E7D8C" w:sz="24" w:space="8"/>
+          <w:bottom w:val="single" w:color="2E7D8C" w:sz="18" w:space="1"/>
         </w:pBdr>
-        <w:shd w:fill="EAF2F5" w:color="auto" w:val="clear"/>
+        <w:spacing w:after="220"/>
+      </w:pPr>
+      <w:r>
+        <w:rPr>
+          <w:rFonts w:ascii="Calibri" w:cs="Calibri" w:eastAsia="Calibri" w:hAnsi="Calibri"/>
+          <w:i/>
+          <w:iCs/>
+          <w:color w:val="5F6B76"/>
+          <w:sz w:val="22"/>
+          <w:szCs w:val="22"/>
+        </w:rPr>
+        <w:t xml:space="preserve">Qué hace el sistema en cada caso</w:t>
+      </w:r>
+    </w:p>
+    <w:tbl>
+      <w:tblPr>
+        <w:tblW w:type="dxa" w:w="14400"/>
+        <w:tblBorders>
+          <w:top w:val="single" w:color="auto" w:sz="4"/>
+          <w:left w:val="single" w:color="auto" w:sz="4"/>
+          <w:bottom w:val="single" w:color="auto" w:sz="4"/>
+          <w:right w:val="single" w:color="auto" w:sz="4"/>
+          <w:insideH w:val="single" w:color="auto" w:sz="4"/>
+          <w:insideV w:val="single" w:color="auto" w:sz="4"/>
+        </w:tblBorders>
+      </w:tblPr>
+      <w:tblGrid>
+        <w:gridCol w:w="4200"/>
+        <w:gridCol w:w="7200"/>
+        <w:gridCol w:w="3000"/>
+      </w:tblGrid>
+      <w:tr>
+        <w:trPr>
+          <w:tblHeader/>
+        </w:trPr>
+        <w:tc>
+          <w:tcPr>
+            <w:tcW w:type="dxa" w:w="4200"/>
+            <w:shd w:fill="2E7D8C" w:color="auto" w:val="clear"/>
+            <w:tcMar>
+              <w:top w:type="dxa" w:w="80"/>
+              <w:left w:type="dxa" w:w="120"/>
+              <w:bottom w:type="dxa" w:w="80"/>
+              <w:right w:type="dxa" w:w="120"/>
+            </w:tcMar>
+          </w:tcPr>
+          <w:p>
+            <w:pPr>
+              <w:spacing w:after="40"/>
+            </w:pPr>
+            <w:r>
+              <w:rPr>
+                <w:rFonts w:ascii="Calibri" w:cs="Calibri" w:eastAsia="Calibri" w:hAnsi="Calibri"/>
+                <w:b/>
+                <w:bCs/>
+                <w:color w:val="FFFFFF"/>
+                <w:sz w:val="20"/>
+                <w:szCs w:val="20"/>
+              </w:rPr>
+              <w:t xml:space="preserve">Situación</w:t>
+            </w:r>
+          </w:p>
+        </w:tc>
+        <w:tc>
+          <w:tcPr>
+            <w:tcW w:type="dxa" w:w="7200"/>
+            <w:shd w:fill="2E7D8C" w:color="auto" w:val="clear"/>
+            <w:tcMar>
+              <w:top w:type="dxa" w:w="80"/>
+              <w:left w:type="dxa" w:w="120"/>
+              <w:bottom w:type="dxa" w:w="80"/>
+              <w:right w:type="dxa" w:w="120"/>
+            </w:tcMar>
+          </w:tcPr>
+          <w:p>
+            <w:pPr>
+              <w:spacing w:after="40"/>
+            </w:pPr>
+            <w:r>
+              <w:rPr>
+                <w:rFonts w:ascii="Calibri" w:cs="Calibri" w:eastAsia="Calibri" w:hAnsi="Calibri"/>
+                <w:b/>
+                <w:bCs/>
+                <w:color w:val="FFFFFF"/>
+                <w:sz w:val="20"/>
+                <w:szCs w:val="20"/>
+              </w:rPr>
+              <w:t xml:space="preserve">Qué hace el sistema</w:t>
+            </w:r>
+          </w:p>
+        </w:tc>
+        <w:tc>
+          <w:tcPr>
+            <w:tcW w:type="dxa" w:w="3000"/>
+            <w:shd w:fill="2E7D8C" w:color="auto" w:val="clear"/>
+            <w:tcMar>
+              <w:top w:type="dxa" w:w="80"/>
+              <w:left w:type="dxa" w:w="120"/>
+              <w:bottom w:type="dxa" w:w="80"/>
+              <w:right w:type="dxa" w:w="120"/>
+            </w:tcMar>
+          </w:tcPr>
+          <w:p>
+            <w:pPr>
+              <w:spacing w:after="40"/>
+            </w:pPr>
+            <w:r>
+              <w:rPr>
+                <w:rFonts w:ascii="Calibri" w:cs="Calibri" w:eastAsia="Calibri" w:hAnsi="Calibri"/>
+                <w:b/>
+                <w:bCs/>
+                <w:color w:val="FFFFFF"/>
+                <w:sz w:val="20"/>
+                <w:szCs w:val="20"/>
+              </w:rPr>
+              <w:t xml:space="preserve">Quién interviene</w:t>
+            </w:r>
+          </w:p>
+        </w:tc>
+      </w:tr>
+      <w:tr>
+        <w:tc>
+          <w:tcPr>
+            <w:tcW w:type="dxa" w:w="4200"/>
+            <w:tcMar>
+              <w:top w:type="dxa" w:w="80"/>
+              <w:left w:type="dxa" w:w="120"/>
+              <w:bottom w:type="dxa" w:w="80"/>
+              <w:right w:type="dxa" w:w="120"/>
+            </w:tcMar>
+          </w:tcPr>
+          <w:p>
+            <w:pPr>
+              <w:spacing w:after="40"/>
+            </w:pPr>
+            <w:r>
+              <w:rPr>
+                <w:rFonts w:ascii="Calibri" w:cs="Calibri" w:eastAsia="Calibri" w:hAnsi="Calibri"/>
+                <w:b/>
+                <w:bCs/>
+                <w:sz w:val="20"/>
+                <w:szCs w:val="20"/>
+              </w:rPr>
+              <w:t xml:space="preserve">Cheques endosados</w:t>
+            </w:r>
+          </w:p>
+        </w:tc>
+        <w:tc>
+          <w:tcPr>
+            <w:tcW w:type="dxa" w:w="7200"/>
+            <w:tcMar>
+              <w:top w:type="dxa" w:w="80"/>
+              <w:left w:type="dxa" w:w="120"/>
+              <w:bottom w:type="dxa" w:w="80"/>
+              <w:right w:type="dxa" w:w="120"/>
+            </w:tcMar>
+          </w:tcPr>
+          <w:p>
+            <w:pPr>
+              <w:spacing w:after="40"/>
+            </w:pPr>
+            <w:r>
+              <w:rPr>
+                <w:rFonts w:ascii="Calibri" w:cs="Calibri" w:eastAsia="Calibri" w:hAnsi="Calibri"/>
+                <w:b w:val="false"/>
+                <w:bCs w:val="false"/>
+                <w:sz w:val="20"/>
+                <w:szCs w:val="20"/>
+              </w:rPr>
+              <w:t xml:space="preserve">Al cargar la operación, trae todos los cheques endosados por el cliente a favor de VALO</w:t>
+            </w:r>
+          </w:p>
+        </w:tc>
+        <w:tc>
+          <w:tcPr>
+            <w:tcW w:type="dxa" w:w="3000"/>
+            <w:tcMar>
+              <w:top w:type="dxa" w:w="80"/>
+              <w:left w:type="dxa" w:w="120"/>
+              <w:bottom w:type="dxa" w:w="80"/>
+              <w:right w:type="dxa" w:w="120"/>
+            </w:tcMar>
+          </w:tcPr>
+          <w:p>
+            <w:pPr>
+              <w:spacing w:after="40"/>
+            </w:pPr>
+            <w:r>
+              <w:rPr>
+                <w:rFonts w:ascii="Calibri" w:cs="Calibri" w:eastAsia="Calibri" w:hAnsi="Calibri"/>
+                <w:b w:val="false"/>
+                <w:bCs w:val="false"/>
+                <w:sz w:val="20"/>
+                <w:szCs w:val="20"/>
+              </w:rPr>
+              <w:t xml:space="preserve">Middle Office</w:t>
+            </w:r>
+          </w:p>
+        </w:tc>
+      </w:tr>
+      <w:tr>
+        <w:tc>
+          <w:tcPr>
+            <w:tcW w:type="dxa" w:w="4200"/>
+            <w:shd w:fill="EAF2F5" w:color="auto" w:val="clear"/>
+            <w:tcMar>
+              <w:top w:type="dxa" w:w="80"/>
+              <w:left w:type="dxa" w:w="120"/>
+              <w:bottom w:type="dxa" w:w="80"/>
+              <w:right w:type="dxa" w:w="120"/>
+            </w:tcMar>
+          </w:tcPr>
+          <w:p>
+            <w:pPr>
+              <w:spacing w:after="40"/>
+            </w:pPr>
+            <w:r>
+              <w:rPr>
+                <w:rFonts w:ascii="Calibri" w:cs="Calibri" w:eastAsia="Calibri" w:hAnsi="Calibri"/>
+                <w:b/>
+                <w:bCs/>
+                <w:sz w:val="20"/>
+                <w:szCs w:val="20"/>
+              </w:rPr>
+              <w:t xml:space="preserve">Cheque aprobado por scoring</w:t>
+            </w:r>
+          </w:p>
+        </w:tc>
+        <w:tc>
+          <w:tcPr>
+            <w:tcW w:type="dxa" w:w="7200"/>
+            <w:shd w:fill="EAF2F5" w:color="auto" w:val="clear"/>
+            <w:tcMar>
+              <w:top w:type="dxa" w:w="80"/>
+              <w:left w:type="dxa" w:w="120"/>
+              <w:bottom w:type="dxa" w:w="80"/>
+              <w:right w:type="dxa" w:w="120"/>
+            </w:tcMar>
+          </w:tcPr>
+          <w:p>
+            <w:pPr>
+              <w:spacing w:after="40"/>
+            </w:pPr>
+            <w:r>
+              <w:rPr>
+                <w:rFonts w:ascii="Calibri" w:cs="Calibri" w:eastAsia="Calibri" w:hAnsi="Calibri"/>
+                <w:b w:val="false"/>
+                <w:bCs w:val="false"/>
+                <w:sz w:val="20"/>
+                <w:szCs w:val="20"/>
+              </w:rPr>
+              <w:t xml:space="preserve">Queda seleccionable para la operación</w:t>
+            </w:r>
+          </w:p>
+        </w:tc>
+        <w:tc>
+          <w:tcPr>
+            <w:tcW w:type="dxa" w:w="3000"/>
+            <w:shd w:fill="EAF2F5" w:color="auto" w:val="clear"/>
+            <w:tcMar>
+              <w:top w:type="dxa" w:w="80"/>
+              <w:left w:type="dxa" w:w="120"/>
+              <w:bottom w:type="dxa" w:w="80"/>
+              <w:right w:type="dxa" w:w="120"/>
+            </w:tcMar>
+          </w:tcPr>
+          <w:p>
+            <w:pPr>
+              <w:spacing w:after="40"/>
+            </w:pPr>
+            <w:r>
+              <w:rPr>
+                <w:rFonts w:ascii="Calibri" w:cs="Calibri" w:eastAsia="Calibri" w:hAnsi="Calibri"/>
+                <w:b w:val="false"/>
+                <w:bCs w:val="false"/>
+                <w:sz w:val="20"/>
+                <w:szCs w:val="20"/>
+              </w:rPr>
+              <w:t xml:space="preserve">Sistema (scoring)</w:t>
+            </w:r>
+          </w:p>
+        </w:tc>
+      </w:tr>
+      <w:tr>
+        <w:tc>
+          <w:tcPr>
+            <w:tcW w:type="dxa" w:w="4200"/>
+            <w:tcMar>
+              <w:top w:type="dxa" w:w="80"/>
+              <w:left w:type="dxa" w:w="120"/>
+              <w:bottom w:type="dxa" w:w="80"/>
+              <w:right w:type="dxa" w:w="120"/>
+            </w:tcMar>
+          </w:tcPr>
+          <w:p>
+            <w:pPr>
+              <w:spacing w:after="40"/>
+            </w:pPr>
+            <w:r>
+              <w:rPr>
+                <w:rFonts w:ascii="Calibri" w:cs="Calibri" w:eastAsia="Calibri" w:hAnsi="Calibri"/>
+                <w:b/>
+                <w:bCs/>
+                <w:sz w:val="20"/>
+                <w:szCs w:val="20"/>
+              </w:rPr>
+              <w:t xml:space="preserve">Sin línea disponible</w:t>
+            </w:r>
+          </w:p>
+        </w:tc>
+        <w:tc>
+          <w:tcPr>
+            <w:tcW w:type="dxa" w:w="7200"/>
+            <w:tcMar>
+              <w:top w:type="dxa" w:w="80"/>
+              <w:left w:type="dxa" w:w="120"/>
+              <w:bottom w:type="dxa" w:w="80"/>
+              <w:right w:type="dxa" w:w="120"/>
+            </w:tcMar>
+          </w:tcPr>
+          <w:p>
+            <w:pPr>
+              <w:spacing w:after="40"/>
+            </w:pPr>
+            <w:r>
+              <w:rPr>
+                <w:rFonts w:ascii="Calibri" w:cs="Calibri" w:eastAsia="Calibri" w:hAnsi="Calibri"/>
+                <w:b w:val="false"/>
+                <w:bCs w:val="false"/>
+                <w:sz w:val="20"/>
+                <w:szCs w:val="20"/>
+              </w:rPr>
+              <w:t xml:space="preserve">Al seleccionar, controla el disponible de la línea y no permite avanzar con una compra que la exceda</w:t>
+            </w:r>
+          </w:p>
+        </w:tc>
+        <w:tc>
+          <w:tcPr>
+            <w:tcW w:type="dxa" w:w="3000"/>
+            <w:tcMar>
+              <w:top w:type="dxa" w:w="80"/>
+              <w:left w:type="dxa" w:w="120"/>
+              <w:bottom w:type="dxa" w:w="80"/>
+              <w:right w:type="dxa" w:w="120"/>
+            </w:tcMar>
+          </w:tcPr>
+          <w:p>
+            <w:pPr>
+              <w:spacing w:after="40"/>
+            </w:pPr>
+            <w:r>
+              <w:rPr>
+                <w:rFonts w:ascii="Calibri" w:cs="Calibri" w:eastAsia="Calibri" w:hAnsi="Calibri"/>
+                <w:b w:val="false"/>
+                <w:bCs w:val="false"/>
+                <w:sz w:val="20"/>
+                <w:szCs w:val="20"/>
+              </w:rPr>
+              <w:t xml:space="preserve">Sistema</w:t>
+            </w:r>
+          </w:p>
+        </w:tc>
+      </w:tr>
+      <w:tr>
+        <w:tc>
+          <w:tcPr>
+            <w:tcW w:type="dxa" w:w="4200"/>
+            <w:shd w:fill="EAF2F5" w:color="auto" w:val="clear"/>
+            <w:tcMar>
+              <w:top w:type="dxa" w:w="80"/>
+              <w:left w:type="dxa" w:w="120"/>
+              <w:bottom w:type="dxa" w:w="80"/>
+              <w:right w:type="dxa" w:w="120"/>
+            </w:tcMar>
+          </w:tcPr>
+          <w:p>
+            <w:pPr>
+              <w:spacing w:after="40"/>
+            </w:pPr>
+            <w:r>
+              <w:rPr>
+                <w:rFonts w:ascii="Calibri" w:cs="Calibri" w:eastAsia="Calibri" w:hAnsi="Calibri"/>
+                <w:b/>
+                <w:bCs/>
+                <w:sz w:val="20"/>
+                <w:szCs w:val="20"/>
+              </w:rPr>
+              <w:t xml:space="preserve">Tasa de descuento no cargada</w:t>
+            </w:r>
+          </w:p>
+        </w:tc>
+        <w:tc>
+          <w:tcPr>
+            <w:tcW w:type="dxa" w:w="7200"/>
+            <w:shd w:fill="EAF2F5" w:color="auto" w:val="clear"/>
+            <w:tcMar>
+              <w:top w:type="dxa" w:w="80"/>
+              <w:left w:type="dxa" w:w="120"/>
+              <w:bottom w:type="dxa" w:w="80"/>
+              <w:right w:type="dxa" w:w="120"/>
+            </w:tcMar>
+          </w:tcPr>
+          <w:p>
+            <w:pPr>
+              <w:spacing w:after="40"/>
+            </w:pPr>
+            <w:r>
+              <w:rPr>
+                <w:rFonts w:ascii="Calibri" w:cs="Calibri" w:eastAsia="Calibri" w:hAnsi="Calibri"/>
+                <w:b w:val="false"/>
+                <w:bCs w:val="false"/>
+                <w:sz w:val="20"/>
+                <w:szCs w:val="20"/>
+              </w:rPr>
+              <w:t xml:space="preserve">Muestra un mensaje de error y no permite simular</w:t>
+            </w:r>
+          </w:p>
+        </w:tc>
+        <w:tc>
+          <w:tcPr>
+            <w:tcW w:type="dxa" w:w="3000"/>
+            <w:shd w:fill="EAF2F5" w:color="auto" w:val="clear"/>
+            <w:tcMar>
+              <w:top w:type="dxa" w:w="80"/>
+              <w:left w:type="dxa" w:w="120"/>
+              <w:bottom w:type="dxa" w:w="80"/>
+              <w:right w:type="dxa" w:w="120"/>
+            </w:tcMar>
+          </w:tcPr>
+          <w:p>
+            <w:pPr>
+              <w:spacing w:after="40"/>
+            </w:pPr>
+            <w:r>
+              <w:rPr>
+                <w:rFonts w:ascii="Calibri" w:cs="Calibri" w:eastAsia="Calibri" w:hAnsi="Calibri"/>
+                <w:b w:val="false"/>
+                <w:bCs w:val="false"/>
+                <w:sz w:val="20"/>
+                <w:szCs w:val="20"/>
+              </w:rPr>
+              <w:t xml:space="preserve">Sistema</w:t>
+            </w:r>
+          </w:p>
+        </w:tc>
+      </w:tr>
+      <w:tr>
+        <w:tc>
+          <w:tcPr>
+            <w:tcW w:type="dxa" w:w="4200"/>
+            <w:tcMar>
+              <w:top w:type="dxa" w:w="80"/>
+              <w:left w:type="dxa" w:w="120"/>
+              <w:bottom w:type="dxa" w:w="80"/>
+              <w:right w:type="dxa" w:w="120"/>
+            </w:tcMar>
+          </w:tcPr>
+          <w:p>
+            <w:pPr>
+              <w:spacing w:after="40"/>
+            </w:pPr>
+            <w:r>
+              <w:rPr>
+                <w:rFonts w:ascii="Calibri" w:cs="Calibri" w:eastAsia="Calibri" w:hAnsi="Calibri"/>
+                <w:b/>
+                <w:bCs/>
+                <w:sz w:val="20"/>
+                <w:szCs w:val="20"/>
+              </w:rPr>
+              <w:t xml:space="preserve">Simulación</w:t>
+            </w:r>
+          </w:p>
+        </w:tc>
+        <w:tc>
+          <w:tcPr>
+            <w:tcW w:type="dxa" w:w="7200"/>
+            <w:tcMar>
+              <w:top w:type="dxa" w:w="80"/>
+              <w:left w:type="dxa" w:w="120"/>
+              <w:bottom w:type="dxa" w:w="80"/>
+              <w:right w:type="dxa" w:w="120"/>
+            </w:tcMar>
+          </w:tcPr>
+          <w:p>
+            <w:pPr>
+              <w:spacing w:after="40"/>
+            </w:pPr>
+            <w:r>
+              <w:rPr>
+                <w:rFonts w:ascii="Calibri" w:cs="Calibri" w:eastAsia="Calibri" w:hAnsi="Calibri"/>
+                <w:b w:val="false"/>
+                <w:bCs w:val="false"/>
+                <w:sz w:val="20"/>
+                <w:szCs w:val="20"/>
+              </w:rPr>
+              <w:t xml:space="preserve">Muestra cómo quedaría la operación cerrada con la tasa precargada, para trasladarla al cliente</w:t>
+            </w:r>
+          </w:p>
+        </w:tc>
+        <w:tc>
+          <w:tcPr>
+            <w:tcW w:type="dxa" w:w="3000"/>
+            <w:tcMar>
+              <w:top w:type="dxa" w:w="80"/>
+              <w:left w:type="dxa" w:w="120"/>
+              <w:bottom w:type="dxa" w:w="80"/>
+              <w:right w:type="dxa" w:w="120"/>
+            </w:tcMar>
+          </w:tcPr>
+          <w:p>
+            <w:pPr>
+              <w:spacing w:after="40"/>
+            </w:pPr>
+            <w:r>
+              <w:rPr>
+                <w:rFonts w:ascii="Calibri" w:cs="Calibri" w:eastAsia="Calibri" w:hAnsi="Calibri"/>
+                <w:b w:val="false"/>
+                <w:bCs w:val="false"/>
+                <w:sz w:val="20"/>
+                <w:szCs w:val="20"/>
+              </w:rPr>
+              <w:t xml:space="preserve">Middle Office</w:t>
+            </w:r>
+          </w:p>
+        </w:tc>
+      </w:tr>
+      <w:tr>
+        <w:tc>
+          <w:tcPr>
+            <w:tcW w:type="dxa" w:w="4200"/>
+            <w:shd w:fill="EAF2F5" w:color="auto" w:val="clear"/>
+            <w:tcMar>
+              <w:top w:type="dxa" w:w="80"/>
+              <w:left w:type="dxa" w:w="120"/>
+              <w:bottom w:type="dxa" w:w="80"/>
+              <w:right w:type="dxa" w:w="120"/>
+            </w:tcMar>
+          </w:tcPr>
+          <w:p>
+            <w:pPr>
+              <w:spacing w:after="40"/>
+            </w:pPr>
+            <w:r>
+              <w:rPr>
+                <w:rFonts w:ascii="Calibri" w:cs="Calibri" w:eastAsia="Calibri" w:hAnsi="Calibri"/>
+                <w:b/>
+                <w:bCs/>
+                <w:sz w:val="20"/>
+                <w:szCs w:val="20"/>
+              </w:rPr>
+              <w:t xml:space="preserve">Forzar un eCheq no seleccionado por scoring</w:t>
+            </w:r>
+          </w:p>
+        </w:tc>
+        <w:tc>
+          <w:tcPr>
+            <w:tcW w:type="dxa" w:w="7200"/>
+            <w:shd w:fill="EAF2F5" w:color="auto" w:val="clear"/>
+            <w:tcMar>
+              <w:top w:type="dxa" w:w="80"/>
+              <w:left w:type="dxa" w:w="120"/>
+              <w:bottom w:type="dxa" w:w="80"/>
+              <w:right w:type="dxa" w:w="120"/>
+            </w:tcMar>
+          </w:tcPr>
+          <w:p>
+            <w:pPr>
+              <w:spacing w:after="40"/>
+            </w:pPr>
+            <w:r>
+              <w:rPr>
+                <w:rFonts w:ascii="Calibri" w:cs="Calibri" w:eastAsia="Calibri" w:hAnsi="Calibri"/>
+                <w:b w:val="false"/>
+                <w:bCs w:val="false"/>
+                <w:sz w:val="20"/>
+                <w:szCs w:val="20"/>
+              </w:rPr>
+              <w:t xml:space="preserve">Lo envía a Riesgos, que analiza el o los cheques; con OK se acepta</w:t>
+            </w:r>
+          </w:p>
+        </w:tc>
+        <w:tc>
+          <w:tcPr>
+            <w:tcW w:type="dxa" w:w="3000"/>
+            <w:shd w:fill="EAF2F5" w:color="auto" w:val="clear"/>
+            <w:tcMar>
+              <w:top w:type="dxa" w:w="80"/>
+              <w:left w:type="dxa" w:w="120"/>
+              <w:bottom w:type="dxa" w:w="80"/>
+              <w:right w:type="dxa" w:w="120"/>
+            </w:tcMar>
+          </w:tcPr>
+          <w:p>
+            <w:pPr>
+              <w:spacing w:after="40"/>
+            </w:pPr>
+            <w:r>
+              <w:rPr>
+                <w:rFonts w:ascii="Calibri" w:cs="Calibri" w:eastAsia="Calibri" w:hAnsi="Calibri"/>
+                <w:b w:val="false"/>
+                <w:bCs w:val="false"/>
+                <w:sz w:val="20"/>
+                <w:szCs w:val="20"/>
+              </w:rPr>
+              <w:t xml:space="preserve">Middle Office / Riesgos</w:t>
+            </w:r>
+          </w:p>
+        </w:tc>
+      </w:tr>
+      <w:tr>
+        <w:tc>
+          <w:tcPr>
+            <w:tcW w:type="dxa" w:w="4200"/>
+            <w:tcMar>
+              <w:top w:type="dxa" w:w="80"/>
+              <w:left w:type="dxa" w:w="120"/>
+              <w:bottom w:type="dxa" w:w="80"/>
+              <w:right w:type="dxa" w:w="120"/>
+            </w:tcMar>
+          </w:tcPr>
+          <w:p>
+            <w:pPr>
+              <w:spacing w:after="40"/>
+            </w:pPr>
+            <w:r>
+              <w:rPr>
+                <w:rFonts w:ascii="Calibri" w:cs="Calibri" w:eastAsia="Calibri" w:hAnsi="Calibri"/>
+                <w:b/>
+                <w:bCs/>
+                <w:sz w:val="20"/>
+                <w:szCs w:val="20"/>
+              </w:rPr>
+              <w:t xml:space="preserve">Cheques no seleccionados</w:t>
+            </w:r>
+          </w:p>
+        </w:tc>
+        <w:tc>
+          <w:tcPr>
+            <w:tcW w:type="dxa" w:w="7200"/>
+            <w:tcMar>
+              <w:top w:type="dxa" w:w="80"/>
+              <w:left w:type="dxa" w:w="120"/>
+              <w:bottom w:type="dxa" w:w="80"/>
+              <w:right w:type="dxa" w:w="120"/>
+            </w:tcMar>
+          </w:tcPr>
+          <w:p>
+            <w:pPr>
+              <w:spacing w:after="40"/>
+            </w:pPr>
+            <w:r>
+              <w:rPr>
+                <w:rFonts w:ascii="Calibri" w:cs="Calibri" w:eastAsia="Calibri" w:hAnsi="Calibri"/>
+                <w:b w:val="false"/>
+                <w:bCs w:val="false"/>
+                <w:sz w:val="20"/>
+                <w:szCs w:val="20"/>
+              </w:rPr>
+              <w:t xml:space="preserve">Se rechazan</w:t>
+            </w:r>
+          </w:p>
+        </w:tc>
+        <w:tc>
+          <w:tcPr>
+            <w:tcW w:type="dxa" w:w="3000"/>
+            <w:tcMar>
+              <w:top w:type="dxa" w:w="80"/>
+              <w:left w:type="dxa" w:w="120"/>
+              <w:bottom w:type="dxa" w:w="80"/>
+              <w:right w:type="dxa" w:w="120"/>
+            </w:tcMar>
+          </w:tcPr>
+          <w:p>
+            <w:pPr>
+              <w:spacing w:after="40"/>
+            </w:pPr>
+            <w:r>
+              <w:rPr>
+                <w:rFonts w:ascii="Calibri" w:cs="Calibri" w:eastAsia="Calibri" w:hAnsi="Calibri"/>
+                <w:b w:val="false"/>
+                <w:bCs w:val="false"/>
+                <w:sz w:val="20"/>
+                <w:szCs w:val="20"/>
+              </w:rPr>
+              <w:t xml:space="preserve">Sistema</w:t>
+            </w:r>
+          </w:p>
+        </w:tc>
+      </w:tr>
+      <w:tr>
+        <w:tc>
+          <w:tcPr>
+            <w:tcW w:type="dxa" w:w="4200"/>
+            <w:shd w:fill="EAF2F5" w:color="auto" w:val="clear"/>
+            <w:tcMar>
+              <w:top w:type="dxa" w:w="80"/>
+              <w:left w:type="dxa" w:w="120"/>
+              <w:bottom w:type="dxa" w:w="80"/>
+              <w:right w:type="dxa" w:w="120"/>
+            </w:tcMar>
+          </w:tcPr>
+          <w:p>
+            <w:pPr>
+              <w:spacing w:after="40"/>
+            </w:pPr>
+            <w:r>
+              <w:rPr>
+                <w:rFonts w:ascii="Calibri" w:cs="Calibri" w:eastAsia="Calibri" w:hAnsi="Calibri"/>
+                <w:b/>
+                <w:bCs/>
+                <w:sz w:val="20"/>
+                <w:szCs w:val="20"/>
+              </w:rPr>
+              <w:t xml:space="preserve">Primer descuento del cliente</w:t>
+            </w:r>
+          </w:p>
+        </w:tc>
+        <w:tc>
+          <w:tcPr>
+            <w:tcW w:type="dxa" w:w="7200"/>
+            <w:shd w:fill="EAF2F5" w:color="auto" w:val="clear"/>
+            <w:tcMar>
+              <w:top w:type="dxa" w:w="80"/>
+              <w:left w:type="dxa" w:w="120"/>
+              <w:bottom w:type="dxa" w:w="80"/>
+              <w:right w:type="dxa" w:w="120"/>
+            </w:tcMar>
+          </w:tcPr>
+          <w:p>
+            <w:pPr>
+              <w:spacing w:after="40"/>
+            </w:pPr>
+            <w:r>
+              <w:rPr>
+                <w:rFonts w:ascii="Calibri" w:cs="Calibri" w:eastAsia="Calibri" w:hAnsi="Calibri"/>
+                <w:b w:val="false"/>
+                <w:bCs w:val="false"/>
+                <w:sz w:val="20"/>
+                <w:szCs w:val="20"/>
+              </w:rPr>
+              <w:t xml:space="preserve">Pasa a Activas para aprobar el acuerdo marco de cheques y parametrizar la cuenta de desembolso</w:t>
+            </w:r>
+          </w:p>
+        </w:tc>
+        <w:tc>
+          <w:tcPr>
+            <w:tcW w:type="dxa" w:w="3000"/>
+            <w:shd w:fill="EAF2F5" w:color="auto" w:val="clear"/>
+            <w:tcMar>
+              <w:top w:type="dxa" w:w="80"/>
+              <w:left w:type="dxa" w:w="120"/>
+              <w:bottom w:type="dxa" w:w="80"/>
+              <w:right w:type="dxa" w:w="120"/>
+            </w:tcMar>
+          </w:tcPr>
+          <w:p>
+            <w:pPr>
+              <w:spacing w:after="40"/>
+            </w:pPr>
+            <w:r>
+              <w:rPr>
+                <w:rFonts w:ascii="Calibri" w:cs="Calibri" w:eastAsia="Calibri" w:hAnsi="Calibri"/>
+                <w:b w:val="false"/>
+                <w:bCs w:val="false"/>
+                <w:sz w:val="20"/>
+                <w:szCs w:val="20"/>
+              </w:rPr>
+              <w:t xml:space="preserve">Activas</w:t>
+            </w:r>
+          </w:p>
+        </w:tc>
+      </w:tr>
+      <w:tr>
+        <w:tc>
+          <w:tcPr>
+            <w:tcW w:type="dxa" w:w="4200"/>
+            <w:tcMar>
+              <w:top w:type="dxa" w:w="80"/>
+              <w:left w:type="dxa" w:w="120"/>
+              <w:bottom w:type="dxa" w:w="80"/>
+              <w:right w:type="dxa" w:w="120"/>
+            </w:tcMar>
+          </w:tcPr>
+          <w:p>
+            <w:pPr>
+              <w:spacing w:after="40"/>
+            </w:pPr>
+            <w:r>
+              <w:rPr>
+                <w:rFonts w:ascii="Calibri" w:cs="Calibri" w:eastAsia="Calibri" w:hAnsi="Calibri"/>
+                <w:b/>
+                <w:bCs/>
+                <w:sz w:val="20"/>
+                <w:szCs w:val="20"/>
+              </w:rPr>
+              <w:t xml:space="preserve">Cliente con acuerdo marco aprobado</w:t>
+            </w:r>
+          </w:p>
+        </w:tc>
+        <w:tc>
+          <w:tcPr>
+            <w:tcW w:type="dxa" w:w="7200"/>
+            <w:tcMar>
+              <w:top w:type="dxa" w:w="80"/>
+              <w:left w:type="dxa" w:w="120"/>
+              <w:bottom w:type="dxa" w:w="80"/>
+              <w:right w:type="dxa" w:w="120"/>
+            </w:tcMar>
+          </w:tcPr>
+          <w:p>
+            <w:pPr>
+              <w:spacing w:after="40"/>
+            </w:pPr>
+            <w:r>
+              <w:rPr>
+                <w:rFonts w:ascii="Calibri" w:cs="Calibri" w:eastAsia="Calibri" w:hAnsi="Calibri"/>
+                <w:b w:val="false"/>
+                <w:bCs w:val="false"/>
+                <w:sz w:val="20"/>
+                <w:szCs w:val="20"/>
+              </w:rPr>
+              <w:t xml:space="preserve">Desembolso automático a la cuenta parametrizada, sin intervención de Activas</w:t>
+            </w:r>
+          </w:p>
+        </w:tc>
+        <w:tc>
+          <w:tcPr>
+            <w:tcW w:type="dxa" w:w="3000"/>
+            <w:tcMar>
+              <w:top w:type="dxa" w:w="80"/>
+              <w:left w:type="dxa" w:w="120"/>
+              <w:bottom w:type="dxa" w:w="80"/>
+              <w:right w:type="dxa" w:w="120"/>
+            </w:tcMar>
+          </w:tcPr>
+          <w:p>
+            <w:pPr>
+              <w:spacing w:after="40"/>
+            </w:pPr>
+            <w:r>
+              <w:rPr>
+                <w:rFonts w:ascii="Calibri" w:cs="Calibri" w:eastAsia="Calibri" w:hAnsi="Calibri"/>
+                <w:b w:val="false"/>
+                <w:bCs w:val="false"/>
+                <w:sz w:val="20"/>
+                <w:szCs w:val="20"/>
+              </w:rPr>
+              <w:t xml:space="preserve">Sistema</w:t>
+            </w:r>
+          </w:p>
+        </w:tc>
+      </w:tr>
+      <w:tr>
+        <w:tc>
+          <w:tcPr>
+            <w:tcW w:type="dxa" w:w="4200"/>
+            <w:shd w:fill="EAF2F5" w:color="auto" w:val="clear"/>
+            <w:tcMar>
+              <w:top w:type="dxa" w:w="80"/>
+              <w:left w:type="dxa" w:w="120"/>
+              <w:bottom w:type="dxa" w:w="80"/>
+              <w:right w:type="dxa" w:w="120"/>
+            </w:tcMar>
+          </w:tcPr>
+          <w:p>
+            <w:pPr>
+              <w:spacing w:after="40"/>
+            </w:pPr>
+            <w:r>
+              <w:rPr>
+                <w:rFonts w:ascii="Calibri" w:cs="Calibri" w:eastAsia="Calibri" w:hAnsi="Calibri"/>
+                <w:b/>
+                <w:bCs/>
+                <w:sz w:val="20"/>
+                <w:szCs w:val="20"/>
+              </w:rPr>
+              <w:t xml:space="preserve">Operación completada</w:t>
+            </w:r>
+          </w:p>
+        </w:tc>
+        <w:tc>
+          <w:tcPr>
+            <w:tcW w:type="dxa" w:w="7200"/>
+            <w:shd w:fill="EAF2F5" w:color="auto" w:val="clear"/>
+            <w:tcMar>
+              <w:top w:type="dxa" w:w="80"/>
+              <w:left w:type="dxa" w:w="120"/>
+              <w:bottom w:type="dxa" w:w="80"/>
+              <w:right w:type="dxa" w:w="120"/>
+            </w:tcMar>
+          </w:tcPr>
+          <w:p>
+            <w:pPr>
+              <w:spacing w:after="40"/>
+            </w:pPr>
+            <w:r>
+              <w:rPr>
+                <w:rFonts w:ascii="Calibri" w:cs="Calibri" w:eastAsia="Calibri" w:hAnsi="Calibri"/>
+                <w:b w:val="false"/>
+                <w:bCs w:val="false"/>
+                <w:sz w:val="20"/>
+                <w:szCs w:val="20"/>
+              </w:rPr>
+              <w:t xml:space="preserve">Pantalla de operación finalizada con descarga de recibos</w:t>
+            </w:r>
+          </w:p>
+        </w:tc>
+        <w:tc>
+          <w:tcPr>
+            <w:tcW w:type="dxa" w:w="3000"/>
+            <w:shd w:fill="EAF2F5" w:color="auto" w:val="clear"/>
+            <w:tcMar>
+              <w:top w:type="dxa" w:w="80"/>
+              <w:left w:type="dxa" w:w="120"/>
+              <w:bottom w:type="dxa" w:w="80"/>
+              <w:right w:type="dxa" w:w="120"/>
+            </w:tcMar>
+          </w:tcPr>
+          <w:p>
+            <w:pPr>
+              <w:spacing w:after="40"/>
+            </w:pPr>
+            <w:r>
+              <w:rPr>
+                <w:rFonts w:ascii="Calibri" w:cs="Calibri" w:eastAsia="Calibri" w:hAnsi="Calibri"/>
+                <w:b w:val="false"/>
+                <w:bCs w:val="false"/>
+                <w:sz w:val="20"/>
+                <w:szCs w:val="20"/>
+              </w:rPr>
+              <w:t xml:space="preserve">Middle Office</w:t>
+            </w:r>
+          </w:p>
+        </w:tc>
+      </w:tr>
+    </w:tbl>
+    <w:p>
+      <w:pPr>
+        <w:spacing w:after="100" w:before="80"/>
+      </w:pPr>
+      <w:r>
+        <w:rPr>
+          <w:rFonts w:ascii="Calibri" w:cs="Calibri" w:eastAsia="Calibri" w:hAnsi="Calibri"/>
+          <w:i/>
+          <w:iCs/>
+          <w:color w:val="5F6B76"/>
+          <w:sz w:val="19"/>
+          <w:szCs w:val="19"/>
+        </w:rPr>
+        <w:t xml:space="preserve">La operación también toma el costo de fondeo según su plazo máximo (Módulo E).</w:t>
+      </w:r>
+    </w:p>
+    <w:p>
+      <w:pPr>
+        <w:pBdr>
+          <w:left w:val="single" w:color="C98A00" w:sz="24" w:space="8"/>
+        </w:pBdr>
+        <w:shd w:fill="FFF4DC" w:color="auto" w:val="clear"/>
         <w:spacing w:after="120" w:before="160"/>
         <w:ind w:left="120"/>
       </w:pPr>
@@ -15136,7 +16825,7 @@
           <w:sz w:val="20"/>
           <w:szCs w:val="20"/>
         </w:rPr>
-        <w:t xml:space="preserve">A confirmar: </w:t>
+        <w:t xml:space="preserve">Dependencia: </w:t>
       </w:r>
       <w:r>
         <w:rPr>
@@ -15144,7 +16833,7 @@
           <w:sz w:val="20"/>
           <w:szCs w:val="20"/>
         </w:rPr>
-        <w:t xml:space="preserve">si el consumo de los cheques descontados se imputa a la misma línea y entra en el control del 15% de la RPC.</w:t>
+        <w:t xml:space="preserve">la validación de scoring se apoya en el desarrollo de modernización; hay que definir con ese equipo cómo se integra.</w:t>
       </w:r>
     </w:p>
     <w:p>
@@ -15866,7 +17555,7 @@
                 <w:sz w:val="20"/>
                 <w:szCs w:val="20"/>
               </w:rPr>
-              <w:t xml:space="preserve">Comprobante</w:t>
+              <w:t xml:space="preserve">Recibos de operaciones cobradas</w:t>
             </w:r>
           </w:p>
         </w:tc>
@@ -15893,7 +17582,7 @@
                 <w:sz w:val="20"/>
                 <w:szCs w:val="20"/>
               </w:rPr>
-              <w:t xml:space="preserve">Imprimir el comprobante desde la pantalla</w:t>
+              <w:t xml:space="preserve">Descarga de los recibos de las operaciones cobradas; se habilita solo cuando la operación (por ejemplo, el préstamo) fue efectivamente cobrada</w:t>
             </w:r>
           </w:p>
         </w:tc>
@@ -21339,7 +23028,7 @@
                 <w:sz w:val="20"/>
                 <w:szCs w:val="20"/>
               </w:rPr>
-              <w:t xml:space="preserve">Liquidar cheques</w:t>
+              <w:t xml:space="preserve">Cargar descuento de cheques y simular</w:t>
             </w:r>
           </w:p>
         </w:tc>
@@ -21556,7 +23245,7 @@
                 <w:sz w:val="20"/>
                 <w:szCs w:val="20"/>
               </w:rPr>
-              <w:t xml:space="preserve">Revisar cheques pendientes</w:t>
+              <w:t xml:space="preserve">Aprobar cheques forzados fuera del scoring</w:t>
             </w:r>
           </w:p>
         </w:tc>
@@ -21767,7 +23456,7 @@
                 <w:sz w:val="20"/>
                 <w:szCs w:val="20"/>
               </w:rPr>
-              <w:t xml:space="preserve">Cargar costo de fondeo y tasas mínimas</w:t>
+              <w:t xml:space="preserve">Aprobar acuerdo marco de cheques</w:t>
             </w:r>
           </w:p>
         </w:tc>
@@ -21929,34 +23618,34 @@
                 <w:sz w:val="20"/>
                 <w:szCs w:val="20"/>
               </w:rPr>
+              <w:t xml:space="preserve">●</w:t>
+            </w:r>
+          </w:p>
+        </w:tc>
+        <w:tc>
+          <w:tcPr>
+            <w:tcW w:type="dxa" w:w="1400"/>
+            <w:shd w:fill="EAF2F5" w:color="auto" w:val="clear"/>
+            <w:tcMar>
+              <w:top w:type="dxa" w:w="80"/>
+              <w:left w:type="dxa" w:w="120"/>
+              <w:bottom w:type="dxa" w:w="80"/>
+              <w:right w:type="dxa" w:w="120"/>
+            </w:tcMar>
+          </w:tcPr>
+          <w:p>
+            <w:pPr>
+              <w:spacing w:after="40"/>
+            </w:pPr>
+            <w:r>
+              <w:rPr>
+                <w:rFonts w:ascii="Calibri" w:cs="Calibri" w:eastAsia="Calibri" w:hAnsi="Calibri"/>
+                <w:b w:val="false"/>
+                <w:bCs w:val="false"/>
+                <w:sz w:val="20"/>
+                <w:szCs w:val="20"/>
+              </w:rPr>
               <w:t xml:space="preserve"/>
-            </w:r>
-          </w:p>
-        </w:tc>
-        <w:tc>
-          <w:tcPr>
-            <w:tcW w:type="dxa" w:w="1400"/>
-            <w:shd w:fill="EAF2F5" w:color="auto" w:val="clear"/>
-            <w:tcMar>
-              <w:top w:type="dxa" w:w="80"/>
-              <w:left w:type="dxa" w:w="120"/>
-              <w:bottom w:type="dxa" w:w="80"/>
-              <w:right w:type="dxa" w:w="120"/>
-            </w:tcMar>
-          </w:tcPr>
-          <w:p>
-            <w:pPr>
-              <w:spacing w:after="40"/>
-            </w:pPr>
-            <w:r>
-              <w:rPr>
-                <w:rFonts w:ascii="Calibri" w:cs="Calibri" w:eastAsia="Calibri" w:hAnsi="Calibri"/>
-                <w:b w:val="false"/>
-                <w:bCs w:val="false"/>
-                <w:sz w:val="20"/>
-                <w:szCs w:val="20"/>
-              </w:rPr>
-              <w:t xml:space="preserve">●</w:t>
             </w:r>
           </w:p>
         </w:tc>
@@ -21984,7 +23673,7 @@
                 <w:sz w:val="20"/>
                 <w:szCs w:val="20"/>
               </w:rPr>
-              <w:t xml:space="preserve">Consultar vencimientos y renovar descubiertos</w:t>
+              <w:t xml:space="preserve">Cargar costo de fondeo y tasas mínimas</w:t>
             </w:r>
           </w:p>
         </w:tc>
@@ -22010,163 +23699,163 @@
                 <w:sz w:val="20"/>
                 <w:szCs w:val="20"/>
               </w:rPr>
+              <w:t xml:space="preserve"/>
+            </w:r>
+          </w:p>
+        </w:tc>
+        <w:tc>
+          <w:tcPr>
+            <w:tcW w:type="dxa" w:w="1600"/>
+            <w:tcMar>
+              <w:top w:type="dxa" w:w="80"/>
+              <w:left w:type="dxa" w:w="120"/>
+              <w:bottom w:type="dxa" w:w="80"/>
+              <w:right w:type="dxa" w:w="120"/>
+            </w:tcMar>
+          </w:tcPr>
+          <w:p>
+            <w:pPr>
+              <w:spacing w:after="40"/>
+            </w:pPr>
+            <w:r>
+              <w:rPr>
+                <w:rFonts w:ascii="Calibri" w:cs="Calibri" w:eastAsia="Calibri" w:hAnsi="Calibri"/>
+                <w:b w:val="false"/>
+                <w:bCs w:val="false"/>
+                <w:sz w:val="20"/>
+                <w:szCs w:val="20"/>
+              </w:rPr>
+              <w:t xml:space="preserve"/>
+            </w:r>
+          </w:p>
+        </w:tc>
+        <w:tc>
+          <w:tcPr>
+            <w:tcW w:type="dxa" w:w="1400"/>
+            <w:tcMar>
+              <w:top w:type="dxa" w:w="80"/>
+              <w:left w:type="dxa" w:w="120"/>
+              <w:bottom w:type="dxa" w:w="80"/>
+              <w:right w:type="dxa" w:w="120"/>
+            </w:tcMar>
+          </w:tcPr>
+          <w:p>
+            <w:pPr>
+              <w:spacing w:after="40"/>
+            </w:pPr>
+            <w:r>
+              <w:rPr>
+                <w:rFonts w:ascii="Calibri" w:cs="Calibri" w:eastAsia="Calibri" w:hAnsi="Calibri"/>
+                <w:b w:val="false"/>
+                <w:bCs w:val="false"/>
+                <w:sz w:val="20"/>
+                <w:szCs w:val="20"/>
+              </w:rPr>
+              <w:t xml:space="preserve"/>
+            </w:r>
+          </w:p>
+        </w:tc>
+        <w:tc>
+          <w:tcPr>
+            <w:tcW w:type="dxa" w:w="1100"/>
+            <w:tcMar>
+              <w:top w:type="dxa" w:w="80"/>
+              <w:left w:type="dxa" w:w="120"/>
+              <w:bottom w:type="dxa" w:w="80"/>
+              <w:right w:type="dxa" w:w="120"/>
+            </w:tcMar>
+          </w:tcPr>
+          <w:p>
+            <w:pPr>
+              <w:spacing w:after="40"/>
+            </w:pPr>
+            <w:r>
+              <w:rPr>
+                <w:rFonts w:ascii="Calibri" w:cs="Calibri" w:eastAsia="Calibri" w:hAnsi="Calibri"/>
+                <w:b w:val="false"/>
+                <w:bCs w:val="false"/>
+                <w:sz w:val="20"/>
+                <w:szCs w:val="20"/>
+              </w:rPr>
+              <w:t xml:space="preserve"/>
+            </w:r>
+          </w:p>
+        </w:tc>
+        <w:tc>
+          <w:tcPr>
+            <w:tcW w:type="dxa" w:w="2000"/>
+            <w:tcMar>
+              <w:top w:type="dxa" w:w="80"/>
+              <w:left w:type="dxa" w:w="120"/>
+              <w:bottom w:type="dxa" w:w="80"/>
+              <w:right w:type="dxa" w:w="120"/>
+            </w:tcMar>
+          </w:tcPr>
+          <w:p>
+            <w:pPr>
+              <w:spacing w:after="40"/>
+            </w:pPr>
+            <w:r>
+              <w:rPr>
+                <w:rFonts w:ascii="Calibri" w:cs="Calibri" w:eastAsia="Calibri" w:hAnsi="Calibri"/>
+                <w:b w:val="false"/>
+                <w:bCs w:val="false"/>
+                <w:sz w:val="20"/>
+                <w:szCs w:val="20"/>
+              </w:rPr>
+              <w:t xml:space="preserve"/>
+            </w:r>
+          </w:p>
+        </w:tc>
+        <w:tc>
+          <w:tcPr>
+            <w:tcW w:type="dxa" w:w="1400"/>
+            <w:tcMar>
+              <w:top w:type="dxa" w:w="80"/>
+              <w:left w:type="dxa" w:w="120"/>
+              <w:bottom w:type="dxa" w:w="80"/>
+              <w:right w:type="dxa" w:w="120"/>
+            </w:tcMar>
+          </w:tcPr>
+          <w:p>
+            <w:pPr>
+              <w:spacing w:after="40"/>
+            </w:pPr>
+            <w:r>
+              <w:rPr>
+                <w:rFonts w:ascii="Calibri" w:cs="Calibri" w:eastAsia="Calibri" w:hAnsi="Calibri"/>
+                <w:b w:val="false"/>
+                <w:bCs w:val="false"/>
+                <w:sz w:val="20"/>
+                <w:szCs w:val="20"/>
+              </w:rPr>
+              <w:t xml:space="preserve"/>
+            </w:r>
+          </w:p>
+        </w:tc>
+        <w:tc>
+          <w:tcPr>
+            <w:tcW w:type="dxa" w:w="1400"/>
+            <w:tcMar>
+              <w:top w:type="dxa" w:w="80"/>
+              <w:left w:type="dxa" w:w="120"/>
+              <w:bottom w:type="dxa" w:w="80"/>
+              <w:right w:type="dxa" w:w="120"/>
+            </w:tcMar>
+          </w:tcPr>
+          <w:p>
+            <w:pPr>
+              <w:spacing w:after="40"/>
+            </w:pPr>
+            <w:r>
+              <w:rPr>
+                <w:rFonts w:ascii="Calibri" w:cs="Calibri" w:eastAsia="Calibri" w:hAnsi="Calibri"/>
+                <w:b w:val="false"/>
+                <w:bCs w:val="false"/>
+                <w:sz w:val="20"/>
+                <w:szCs w:val="20"/>
+              </w:rPr>
               <w:t xml:space="preserve">●</w:t>
-            </w:r>
-          </w:p>
-        </w:tc>
-        <w:tc>
-          <w:tcPr>
-            <w:tcW w:type="dxa" w:w="1600"/>
-            <w:tcMar>
-              <w:top w:type="dxa" w:w="80"/>
-              <w:left w:type="dxa" w:w="120"/>
-              <w:bottom w:type="dxa" w:w="80"/>
-              <w:right w:type="dxa" w:w="120"/>
-            </w:tcMar>
-          </w:tcPr>
-          <w:p>
-            <w:pPr>
-              <w:spacing w:after="40"/>
-            </w:pPr>
-            <w:r>
-              <w:rPr>
-                <w:rFonts w:ascii="Calibri" w:cs="Calibri" w:eastAsia="Calibri" w:hAnsi="Calibri"/>
-                <w:b w:val="false"/>
-                <w:bCs w:val="false"/>
-                <w:sz w:val="20"/>
-                <w:szCs w:val="20"/>
-              </w:rPr>
-              <w:t xml:space="preserve"/>
-            </w:r>
-          </w:p>
-        </w:tc>
-        <w:tc>
-          <w:tcPr>
-            <w:tcW w:type="dxa" w:w="1400"/>
-            <w:tcMar>
-              <w:top w:type="dxa" w:w="80"/>
-              <w:left w:type="dxa" w:w="120"/>
-              <w:bottom w:type="dxa" w:w="80"/>
-              <w:right w:type="dxa" w:w="120"/>
-            </w:tcMar>
-          </w:tcPr>
-          <w:p>
-            <w:pPr>
-              <w:spacing w:after="40"/>
-            </w:pPr>
-            <w:r>
-              <w:rPr>
-                <w:rFonts w:ascii="Calibri" w:cs="Calibri" w:eastAsia="Calibri" w:hAnsi="Calibri"/>
-                <w:b w:val="false"/>
-                <w:bCs w:val="false"/>
-                <w:sz w:val="20"/>
-                <w:szCs w:val="20"/>
-              </w:rPr>
-              <w:t xml:space="preserve"/>
-            </w:r>
-          </w:p>
-        </w:tc>
-        <w:tc>
-          <w:tcPr>
-            <w:tcW w:type="dxa" w:w="1100"/>
-            <w:tcMar>
-              <w:top w:type="dxa" w:w="80"/>
-              <w:left w:type="dxa" w:w="120"/>
-              <w:bottom w:type="dxa" w:w="80"/>
-              <w:right w:type="dxa" w:w="120"/>
-            </w:tcMar>
-          </w:tcPr>
-          <w:p>
-            <w:pPr>
-              <w:spacing w:after="40"/>
-            </w:pPr>
-            <w:r>
-              <w:rPr>
-                <w:rFonts w:ascii="Calibri" w:cs="Calibri" w:eastAsia="Calibri" w:hAnsi="Calibri"/>
-                <w:b w:val="false"/>
-                <w:bCs w:val="false"/>
-                <w:sz w:val="20"/>
-                <w:szCs w:val="20"/>
-              </w:rPr>
-              <w:t xml:space="preserve"/>
-            </w:r>
-          </w:p>
-        </w:tc>
-        <w:tc>
-          <w:tcPr>
-            <w:tcW w:type="dxa" w:w="2000"/>
-            <w:tcMar>
-              <w:top w:type="dxa" w:w="80"/>
-              <w:left w:type="dxa" w:w="120"/>
-              <w:bottom w:type="dxa" w:w="80"/>
-              <w:right w:type="dxa" w:w="120"/>
-            </w:tcMar>
-          </w:tcPr>
-          <w:p>
-            <w:pPr>
-              <w:spacing w:after="40"/>
-            </w:pPr>
-            <w:r>
-              <w:rPr>
-                <w:rFonts w:ascii="Calibri" w:cs="Calibri" w:eastAsia="Calibri" w:hAnsi="Calibri"/>
-                <w:b w:val="false"/>
-                <w:bCs w:val="false"/>
-                <w:sz w:val="20"/>
-                <w:szCs w:val="20"/>
-              </w:rPr>
-              <w:t xml:space="preserve"/>
-            </w:r>
-          </w:p>
-        </w:tc>
-        <w:tc>
-          <w:tcPr>
-            <w:tcW w:type="dxa" w:w="1400"/>
-            <w:tcMar>
-              <w:top w:type="dxa" w:w="80"/>
-              <w:left w:type="dxa" w:w="120"/>
-              <w:bottom w:type="dxa" w:w="80"/>
-              <w:right w:type="dxa" w:w="120"/>
-            </w:tcMar>
-          </w:tcPr>
-          <w:p>
-            <w:pPr>
-              <w:spacing w:after="40"/>
-            </w:pPr>
-            <w:r>
-              <w:rPr>
-                <w:rFonts w:ascii="Calibri" w:cs="Calibri" w:eastAsia="Calibri" w:hAnsi="Calibri"/>
-                <w:b w:val="false"/>
-                <w:bCs w:val="false"/>
-                <w:sz w:val="20"/>
-                <w:szCs w:val="20"/>
-              </w:rPr>
-              <w:t xml:space="preserve"/>
-            </w:r>
-          </w:p>
-        </w:tc>
-        <w:tc>
-          <w:tcPr>
-            <w:tcW w:type="dxa" w:w="1400"/>
-            <w:tcMar>
-              <w:top w:type="dxa" w:w="80"/>
-              <w:left w:type="dxa" w:w="120"/>
-              <w:bottom w:type="dxa" w:w="80"/>
-              <w:right w:type="dxa" w:w="120"/>
-            </w:tcMar>
-          </w:tcPr>
-          <w:p>
-            <w:pPr>
-              <w:spacing w:after="40"/>
-            </w:pPr>
-            <w:r>
-              <w:rPr>
-                <w:rFonts w:ascii="Calibri" w:cs="Calibri" w:eastAsia="Calibri" w:hAnsi="Calibri"/>
-                <w:b w:val="false"/>
-                <w:bCs w:val="false"/>
-                <w:sz w:val="20"/>
-                <w:szCs w:val="20"/>
-              </w:rPr>
-              <w:t xml:space="preserve"/>
             </w:r>
           </w:p>
         </w:tc>
@@ -22195,7 +23884,7 @@
                 <w:sz w:val="20"/>
                 <w:szCs w:val="20"/>
               </w:rPr>
-              <w:t xml:space="preserve">Consultar pantalla de líneas</w:t>
+              <w:t xml:space="preserve">Renovar descubiertos</w:t>
             </w:r>
           </w:p>
         </w:tc>
@@ -22249,7 +23938,7 @@
                 <w:sz w:val="20"/>
                 <w:szCs w:val="20"/>
               </w:rPr>
-              <w:t xml:space="preserve">●</w:t>
+              <w:t xml:space="preserve"/>
             </w:r>
           </w:p>
         </w:tc>
@@ -22276,7 +23965,7 @@
                 <w:sz w:val="20"/>
                 <w:szCs w:val="20"/>
               </w:rPr>
-              <w:t xml:space="preserve">●</w:t>
+              <w:t xml:space="preserve"/>
             </w:r>
           </w:p>
         </w:tc>
@@ -22303,7 +23992,7 @@
                 <w:sz w:val="20"/>
                 <w:szCs w:val="20"/>
               </w:rPr>
-              <w:t xml:space="preserve">●</w:t>
+              <w:t xml:space="preserve"/>
             </w:r>
           </w:p>
         </w:tc>
@@ -22330,7 +24019,7 @@
                 <w:sz w:val="20"/>
                 <w:szCs w:val="20"/>
               </w:rPr>
-              <w:t xml:space="preserve">●</w:t>
+              <w:t xml:space="preserve"/>
             </w:r>
           </w:p>
         </w:tc>
@@ -22357,7 +24046,7 @@
                 <w:sz w:val="20"/>
                 <w:szCs w:val="20"/>
               </w:rPr>
-              <w:t xml:space="preserve">○</w:t>
+              <w:t xml:space="preserve"/>
             </w:r>
           </w:p>
         </w:tc>
@@ -22384,7 +24073,7 @@
                 <w:sz w:val="20"/>
                 <w:szCs w:val="20"/>
               </w:rPr>
-              <w:t xml:space="preserve">○</w:t>
+              <w:t xml:space="preserve"/>
             </w:r>
           </w:p>
         </w:tc>
@@ -22412,7 +24101,7 @@
                 <w:sz w:val="20"/>
                 <w:szCs w:val="20"/>
               </w:rPr>
-              <w:t xml:space="preserve">Consultar seguimiento y reportes</w:t>
+              <w:t xml:space="preserve">Consultar pantallas, seguimiento y reportes</w:t>
             </w:r>
           </w:p>
         </w:tc>
@@ -23759,7 +25448,7 @@
                 <w:sz w:val="20"/>
                 <w:szCs w:val="20"/>
               </w:rPr>
-              <w:t xml:space="preserve">Carga de préstamos con tablas de amortización, circuito de cheques, línea USD ajustable</w:t>
+              <w:t xml:space="preserve">Carga de préstamos con tablas de amortización, descuento de cheques con scoring, línea USD ajustable</w:t>
             </w:r>
           </w:p>
         </w:tc>
@@ -23785,7 +25474,7 @@
                 <w:sz w:val="20"/>
                 <w:szCs w:val="20"/>
               </w:rPr>
-              <w:t xml:space="preserve">Requieren relevamiento adicional o definiciones externas (Accusys)</w:t>
+              <w:t xml:space="preserve">Requieren relevamiento adicional o definiciones externas (Accusys, desarrollo de modernización)</w:t>
             </w:r>
           </w:p>
         </w:tc>
@@ -24241,7 +25930,7 @@
                 <w:sz w:val="20"/>
                 <w:szCs w:val="20"/>
               </w:rPr>
-              <w:t xml:space="preserve">Tiempo de respuesta de Activas</w:t>
+              <w:t xml:space="preserve">Integración con el scoring del desarrollo de modernización</w:t>
             </w:r>
           </w:p>
         </w:tc>
@@ -24268,7 +25957,7 @@
                 <w:sz w:val="20"/>
                 <w:szCs w:val="20"/>
               </w:rPr>
-              <w:t xml:space="preserve">Subproductos pendientes de garantía</w:t>
+              <w:t xml:space="preserve">Bloquea la selección automática de cheques</w:t>
             </w:r>
           </w:p>
         </w:tc>
@@ -24295,7 +25984,7 @@
                 <w:sz w:val="20"/>
                 <w:szCs w:val="20"/>
               </w:rPr>
-              <w:t xml:space="preserve">Forzado con regularización y alerta de pendientes</w:t>
+              <w:t xml:space="preserve">Definir la integración con ese equipo antes de estimar el Módulo H</w:t>
             </w:r>
           </w:p>
         </w:tc>
@@ -24323,6 +26012,87 @@
                 <w:sz w:val="20"/>
                 <w:szCs w:val="20"/>
               </w:rPr>
+              <w:t xml:space="preserve">Tiempo de respuesta de Activas</w:t>
+            </w:r>
+          </w:p>
+        </w:tc>
+        <w:tc>
+          <w:tcPr>
+            <w:tcW w:type="dxa" w:w="4400"/>
+            <w:tcMar>
+              <w:top w:type="dxa" w:w="80"/>
+              <w:left w:type="dxa" w:w="120"/>
+              <w:bottom w:type="dxa" w:w="80"/>
+              <w:right w:type="dxa" w:w="120"/>
+            </w:tcMar>
+          </w:tcPr>
+          <w:p>
+            <w:pPr>
+              <w:spacing w:after="40"/>
+            </w:pPr>
+            <w:r>
+              <w:rPr>
+                <w:rFonts w:ascii="Calibri" w:cs="Calibri" w:eastAsia="Calibri" w:hAnsi="Calibri"/>
+                <w:b w:val="false"/>
+                <w:bCs w:val="false"/>
+                <w:sz w:val="20"/>
+                <w:szCs w:val="20"/>
+              </w:rPr>
+              <w:t xml:space="preserve">Subproductos pendientes de garantía</w:t>
+            </w:r>
+          </w:p>
+        </w:tc>
+        <w:tc>
+          <w:tcPr>
+            <w:tcW w:type="dxa" w:w="5600"/>
+            <w:tcMar>
+              <w:top w:type="dxa" w:w="80"/>
+              <w:left w:type="dxa" w:w="120"/>
+              <w:bottom w:type="dxa" w:w="80"/>
+              <w:right w:type="dxa" w:w="120"/>
+            </w:tcMar>
+          </w:tcPr>
+          <w:p>
+            <w:pPr>
+              <w:spacing w:after="40"/>
+            </w:pPr>
+            <w:r>
+              <w:rPr>
+                <w:rFonts w:ascii="Calibri" w:cs="Calibri" w:eastAsia="Calibri" w:hAnsi="Calibri"/>
+                <w:b w:val="false"/>
+                <w:bCs w:val="false"/>
+                <w:sz w:val="20"/>
+                <w:szCs w:val="20"/>
+              </w:rPr>
+              <w:t xml:space="preserve">Forzado con regularización y alerta de pendientes</w:t>
+            </w:r>
+          </w:p>
+        </w:tc>
+      </w:tr>
+      <w:tr>
+        <w:tc>
+          <w:tcPr>
+            <w:tcW w:type="dxa" w:w="4400"/>
+            <w:shd w:fill="EAF2F5" w:color="auto" w:val="clear"/>
+            <w:tcMar>
+              <w:top w:type="dxa" w:w="80"/>
+              <w:left w:type="dxa" w:w="120"/>
+              <w:bottom w:type="dxa" w:w="80"/>
+              <w:right w:type="dxa" w:w="120"/>
+            </w:tcMar>
+          </w:tcPr>
+          <w:p>
+            <w:pPr>
+              <w:spacing w:after="40"/>
+            </w:pPr>
+            <w:r>
+              <w:rPr>
+                <w:rFonts w:ascii="Calibri" w:cs="Calibri" w:eastAsia="Calibri" w:hAnsi="Calibri"/>
+                <w:b/>
+                <w:bCs/>
+                <w:sz w:val="20"/>
+                <w:szCs w:val="20"/>
+              </w:rPr>
               <w:t xml:space="preserve">Cambio de hábito en comités</w:t>
             </w:r>
           </w:p>
@@ -24330,6 +26100,7 @@
         <w:tc>
           <w:tcPr>
             <w:tcW w:type="dxa" w:w="4400"/>
+            <w:shd w:fill="EAF2F5" w:color="auto" w:val="clear"/>
             <w:tcMar>
               <w:top w:type="dxa" w:w="80"/>
               <w:left w:type="dxa" w:w="120"/>
@@ -24356,6 +26127,7 @@
         <w:tc>
           <w:tcPr>
             <w:tcW w:type="dxa" w:w="5600"/>
+            <w:shd w:fill="EAF2F5" w:color="auto" w:val="clear"/>
             <w:tcMar>
               <w:top w:type="dxa" w:w="80"/>
               <w:left w:type="dxa" w:w="120"/>
@@ -24485,6 +26257,24 @@
           <w:szCs w:val="22"/>
         </w:rPr>
         <w:t xml:space="preserve">Si las tablas de amortización se generan desde las condiciones o se importan desde archivo.</w:t>
+      </w:r>
+    </w:p>
+    <w:p>
+      <w:pPr>
+        <w:pStyle w:val="ListParagraph"/>
+        <w:numPr>
+          <w:ilvl w:val="0"/>
+          <w:numId w:val="2"/>
+        </w:numPr>
+        <w:spacing w:after="60"/>
+      </w:pPr>
+      <w:r>
+        <w:rPr>
+          <w:rFonts w:ascii="Calibri" w:cs="Calibri" w:eastAsia="Calibri" w:hAnsi="Calibri"/>
+          <w:sz w:val="22"/>
+          <w:szCs w:val="22"/>
+        </w:rPr>
+        <w:t xml:space="preserve">Quién carga y mantiene la tasa de descuento precargada de cheques (¿Mesa, en el Módulo E?).</w:t>
       </w:r>
     </w:p>
     <w:p>

</xml_diff>